<commit_message>
Update paper, supplement and scripts
Co-Authored-By: Claude Opus 5 <noreply@anthropic.com>
</commit_message>
<xml_diff>
--- a/docs/edit/paper_EDIT.docx
+++ b/docs/edit/paper_EDIT.docx
@@ -311,13 +311,13 @@
           <w:bCs/>
           <w:b/>
         </w:rPr>
-        <w:t xml:space="preserve">Two positive readings</w:t>
-      </w:r>
-      <w:r>
-        <w:t xml:space="preserve"> </w:t>
-      </w:r>
-      <w:r>
-        <w:t xml:space="preserve">that survive every test we can apply.</w:t>
+        <w:t xml:space="preserve">One positive reading</w:t>
+      </w:r>
+      <w:r>
+        <w:t xml:space="preserve"> </w:t>
+      </w:r>
+      <w:r>
+        <w:t xml:space="preserve">that survives every test we can apply:</w:t>
       </w:r>
       <w:r>
         <w:t xml:space="preserve"> </w:t>
@@ -342,7 +342,7 @@
         <w:t xml:space="preserve"> </w:t>
       </w:r>
       <w:r>
-        <w:t xml:space="preserve">"the faithful ones": the</w:t>
+        <w:t xml:space="preserve">"the faithful ones", since the</w:t>
       </w:r>
       <w:r>
         <w:t xml:space="preserve"> </w:t>
@@ -439,10 +439,45 @@
         <w:t xml:space="preserve"> </w:t>
       </w:r>
       <w:r>
+        <w:rPr>
+          <w:bCs/>
+          <w:b/>
+        </w:rPr>
+        <w:t xml:space="preserve">And a result about the most consequential name in the record</w:t>
+      </w:r>
+      <w:r>
+        <w:t xml:space="preserve">: the</w:t>
+      </w:r>
+      <w:r>
+        <w:t xml:space="preserve"> </w:t>
+      </w:r>
+      <w:r>
+        <w:t xml:space="preserve">century-old disagreement over</w:t>
+      </w:r>
+      <w:r>
+        <w:t xml:space="preserve"> </w:t>
+      </w:r>
+      <w:r>
         <w:t xml:space="preserve">冒頓</w:t>
       </w:r>
       <w:r>
-        <w:t xml:space="preserve">, the founder of the confederation, reads as</w:t>
+        <w:t xml:space="preserve">, between the standard</w:t>
+      </w:r>
+      <w:r>
+        <w:t xml:space="preserve"> </w:t>
+      </w:r>
+      <w:r>
+        <w:rPr>
+          <w:iCs/>
+          <w:i/>
+        </w:rPr>
+        <w:t xml:space="preserve">Baγatur</w:t>
+      </w:r>
+      <w:r>
+        <w:t xml:space="preserve"> </w:t>
+      </w:r>
+      <w:r>
+        <w:t xml:space="preserve">and our</w:t>
       </w:r>
       <w:r>
         <w:t xml:space="preserve"> </w:t>
@@ -458,13 +493,19 @@
         <w:t xml:space="preserve"> </w:t>
       </w:r>
       <w:r>
-        <w:t xml:space="preserve">"sage spirit" on the tightest frame in the record, against a standard etymology</w:t>
-      </w:r>
-      <w:r>
-        <w:t xml:space="preserve"> </w:t>
-      </w:r>
-      <w:r>
-        <w:t xml:space="preserve">that fails the one test the corpus decides cleanly. And</w:t>
+        <w:t xml:space="preserve">"sage spirit", turns on which of two Later Han</w:t>
+      </w:r>
+      <w:r>
+        <w:t xml:space="preserve"> </w:t>
+      </w:r>
+      <w:r>
+        <w:t xml:space="preserve">readings of a single character is taken, a choice no published reading of the name states and</w:t>
+      </w:r>
+      <w:r>
+        <w:t xml:space="preserve"> </w:t>
+      </w:r>
+      <w:r>
+        <w:t xml:space="preserve">one the transcription evidence cannot make. And</w:t>
       </w:r>
       <w:r>
         <w:t xml:space="preserve"> </w:t>
@@ -725,19 +766,49 @@
         <w:pStyle w:val="BodyText"/>
       </w:pPr>
       <w:r>
-        <w:t xml:space="preserve">The interest of the Xiongnu case is that the answer is unknown and contested: proposals put</w:t>
-      </w:r>
-      <w:r>
-        <w:t xml:space="preserve"> </w:t>
-      </w:r>
-      <w:r>
-        <w:t xml:space="preserve">the ruling house's language in the Turkic, Mongolic, Yeniseian and Iranian families, each</w:t>
-      </w:r>
-      <w:r>
-        <w:t xml:space="preserve"> </w:t>
-      </w:r>
-      <w:r>
-        <w:t xml:space="preserve">resting on a handful of transcribed names. The interest of this</w:t>
+        <w:t xml:space="preserve">The interest of the Xiongnu case is that the answer is unknown and contested: proposals put the ruling house's language in the Turkic, Mongolic, Yeniseian and Iranian</w:t>
+      </w:r>
+      <w:r>
+        <w:t xml:space="preserve"> </w:t>
+      </w:r>
+      <w:r>
+        <w:t xml:space="preserve">families, each resting on a handful of transcribed names; the most recent argues for Yeniseian, specifically an early form of Arin,</w:t>
+      </w:r>
+      <w:hyperlink w:anchor="r3">
+        <w:r>
+          <w:rPr>
+            <w:rStyle w:val="Hyperlink"/>
+            <w:vertAlign w:val="superscript"/>
+          </w:rPr>
+          <w:t xml:space="preserve">3</w:t>
+        </w:r>
+      </w:hyperlink>
+      <w:r>
+        <w:t xml:space="preserve"> </w:t>
+      </w:r>
+      <w:r>
+        <w:t xml:space="preserve">and Doerfer argued half a century ago that none of the proposals could be</w:t>
+      </w:r>
+      <w:r>
+        <w:t xml:space="preserve"> </w:t>
+      </w:r>
+      <w:r>
+        <w:t xml:space="preserve">sustained on the evidence then available.</w:t>
+      </w:r>
+      <w:hyperlink w:anchor="r6">
+        <w:r>
+          <w:rPr>
+            <w:rStyle w:val="Hyperlink"/>
+            <w:vertAlign w:val="superscript"/>
+          </w:rPr>
+          <w:t xml:space="preserve">6</w:t>
+        </w:r>
+      </w:hyperlink>
+      <w:r>
+        <w:t xml:space="preserve"> </w:t>
+      </w:r>
+      <w:r>
+        <w:t xml:space="preserve">The interest of this</w:t>
       </w:r>
       <w:r>
         <w:t xml:space="preserve"> </w:t>
@@ -1161,20 +1232,22 @@
         <w:pStyle w:val="FirstParagraph"/>
       </w:pPr>
       <w:r>
-        <w:t xml:space="preserve">Ligeti published a Ming-dynasty Chinese–Uyghur glossary in two instalments in</w:t>
-      </w:r>
-      <w:r>
-        <w:t xml:space="preserve"> </w:t>
-      </w:r>
-      <w:r>
-        <w:rPr>
-          <w:iCs/>
-          <w:i/>
-        </w:rPr>
-        <w:t xml:space="preserve">Acta Orientalia</w:t>
-      </w:r>
-      <w:r>
-        <w:t xml:space="preserve">.</w:t>
+        <w:t xml:space="preserve">Ligeti</w:t>
+      </w:r>
+      <w:hyperlink w:anchor="r10">
+        <w:r>
+          <w:rPr>
+            <w:rStyle w:val="Hyperlink"/>
+            <w:vertAlign w:val="superscript"/>
+          </w:rPr>
+          <w:t xml:space="preserve">10</w:t>
+        </w:r>
+      </w:hyperlink>
+      <w:r>
+        <w:rPr>
+          <w:vertAlign w:val="superscript"/>
+        </w:rPr>
+        <w:t xml:space="preserve">,</w:t>
       </w:r>
       <w:hyperlink w:anchor="r17">
         <w:r>
@@ -1186,6 +1259,34 @@
         </w:r>
       </w:hyperlink>
       <w:r>
+        <w:t xml:space="preserve"> </w:t>
+      </w:r>
+      <w:r>
+        <w:t xml:space="preserve">published a Ming-dynasty Chinese–Uyghur glossary in two instalments in</w:t>
+      </w:r>
+      <w:r>
+        <w:t xml:space="preserve"> </w:t>
+      </w:r>
+      <w:r>
+        <w:rPr>
+          <w:iCs/>
+          <w:i/>
+        </w:rPr>
+        <w:t xml:space="preserve">Acta Orientalia</w:t>
+      </w:r>
+      <w:r>
+        <w:t xml:space="preserve">.</w:t>
+      </w:r>
+      <w:hyperlink w:anchor="r17">
+        <w:r>
+          <w:rPr>
+            <w:rStyle w:val="Hyperlink"/>
+            <w:vertAlign w:val="superscript"/>
+          </w:rPr>
+          <w:t xml:space="preserve">17</w:t>
+        </w:r>
+      </w:hyperlink>
+      <w:r>
         <w:rPr>
           <w:vertAlign w:val="superscript"/>
         </w:rPr>
@@ -1329,13 +1430,22 @@
         <w:t xml:space="preserve"> </w:t>
       </w:r>
       <w:r>
-        <w:t xml:space="preserve">first is transcription. A 27,110-entry terminology dictionary mixes them without marking which</w:t>
-      </w:r>
-      <w:r>
-        <w:t xml:space="preserve"> </w:t>
-      </w:r>
-      <w:r>
-        <w:t xml:space="preserve">is which, and the two are not separable by inspection.</w:t>
+        <w:t xml:space="preserve">first is transcription. A 27,110-entry terminology dictionary</w:t>
+      </w:r>
+      <w:hyperlink w:anchor="r1">
+        <w:r>
+          <w:rPr>
+            <w:rStyle w:val="Hyperlink"/>
+            <w:vertAlign w:val="superscript"/>
+          </w:rPr>
+          <w:t xml:space="preserve">1</w:t>
+        </w:r>
+      </w:hyperlink>
+      <w:r>
+        <w:t xml:space="preserve"> </w:t>
+      </w:r>
+      <w:r>
+        <w:t xml:space="preserve">mixes them without marking which is which, and the two are not separable by inspection.</w:t>
       </w:r>
     </w:p>
     <w:p>
@@ -2461,25 +2571,99 @@
         <w:t xml:space="preserve"> </w:t>
       </w:r>
       <w:r>
-        <w:t xml:space="preserve">why: the phonotactic priors available for these families are close enough to each other that the</w:t>
-      </w:r>
-      <w:r>
-        <w:t xml:space="preserve"> </w:t>
-      </w:r>
-      <w:r>
-        <w:t xml:space="preserve">comparison is measuring the reference data rather than the names. A procedure that</w:t>
-      </w:r>
-      <w:r>
-        <w:t xml:space="preserve"> </w:t>
-      </w:r>
-      <w:r>
-        <w:t xml:space="preserve">cannot reliably identify a language it has been given cannot be trusted to identify one nobody</w:t>
-      </w:r>
-      <w:r>
-        <w:t xml:space="preserve"> </w:t>
-      </w:r>
-      <w:r>
-        <w:t xml:space="preserve">has.</w:t>
+        <w:t xml:space="preserve">why: the phonotactic priors available for these families, taken from ASJP,</w:t>
+      </w:r>
+      <w:hyperlink w:anchor="r29">
+        <w:r>
+          <w:rPr>
+            <w:rStyle w:val="Hyperlink"/>
+            <w:vertAlign w:val="superscript"/>
+          </w:rPr>
+          <w:t xml:space="preserve">29</w:t>
+        </w:r>
+      </w:hyperlink>
+      <w:r>
+        <w:t xml:space="preserve"> </w:t>
+      </w:r>
+      <w:r>
+        <w:t xml:space="preserve">are close enough to each other that the</w:t>
+      </w:r>
+      <w:r>
+        <w:t xml:space="preserve"> </w:t>
+      </w:r>
+      <w:r>
+        <w:t xml:space="preserve">comparison is measuring the reference data rather than the names. A procedure that cannot reliably identify a language it has been given cannot be trusted to</w:t>
+      </w:r>
+      <w:r>
+        <w:t xml:space="preserve"> </w:t>
+      </w:r>
+      <w:r>
+        <w:t xml:space="preserve">identify one nobody has.</w:t>
+      </w:r>
+    </w:p>
+    <w:p>
+      <w:pPr>
+        <w:pStyle w:val="BodyText"/>
+      </w:pPr>
+      <w:r>
+        <w:t xml:space="preserve">The strongest advocate of the rival hypothesis reaches the same conclusion on methodological</w:t>
+      </w:r>
+      <w:r>
+        <w:t xml:space="preserve"> </w:t>
+      </w:r>
+      <w:r>
+        <w:t xml:space="preserve">grounds rather than measured ones. Vovin, arguing for a Yeniseian Xiongnu, sets the titles and</w:t>
+      </w:r>
+      <w:r>
+        <w:t xml:space="preserve"> </w:t>
+      </w:r>
+      <w:r>
+        <w:t xml:space="preserve">personal names aside as evidence altogether: most of the glosses the Chinese sources preserve are</w:t>
+      </w:r>
+      <w:r>
+        <w:t xml:space="preserve"> </w:t>
+      </w:r>
+      <w:r>
+        <w:t xml:space="preserve">of that kind, he calls them "practically useless" for determining genetic affiliation, and he</w:t>
+      </w:r>
+      <w:r>
+        <w:t xml:space="preserve"> </w:t>
+      </w:r>
+      <w:r>
+        <w:t xml:space="preserve">declines to evaluate the ones Pulleyblank had used, on the ground that such evidence is not</w:t>
+      </w:r>
+      <w:r>
+        <w:t xml:space="preserve"> </w:t>
+      </w:r>
+      <w:r>
+        <w:t xml:space="preserve">admissible.</w:t>
+      </w:r>
+      <w:hyperlink w:anchor="r27">
+        <w:r>
+          <w:rPr>
+            <w:rStyle w:val="Hyperlink"/>
+            <w:vertAlign w:val="superscript"/>
+          </w:rPr>
+          <w:t xml:space="preserve">27</w:t>
+        </w:r>
+      </w:hyperlink>
+      <w:r>
+        <w:t xml:space="preserve"> </w:t>
+      </w:r>
+      <w:r>
+        <w:t xml:space="preserve">The record this paper works from is almost</w:t>
+      </w:r>
+      <w:r>
+        <w:t xml:space="preserve"> </w:t>
+      </w:r>
+      <w:r>
+        <w:t xml:space="preserve">entirely titles and personal names. Our result agrees with his judgement and replaces it with a</w:t>
+      </w:r>
+      <w:r>
+        <w:t xml:space="preserve"> </w:t>
+      </w:r>
+      <w:r>
+        <w:t xml:space="preserve">number.</w:t>
       </w:r>
     </w:p>
     <w:bookmarkEnd w:id="33"/>
@@ -3637,6 +3821,9 @@
             <w:r>
               <w:t xml:space="preserve">ḍaŋ lei</w:t>
             </w:r>
+            <w:r>
+              <w:t xml:space="preserve">†</w:t>
+            </w:r>
           </w:p>
         </w:tc>
         <w:tc>
@@ -3891,6 +4078,9 @@
             </w:pPr>
             <w:r>
               <w:t xml:space="preserve">do mɑnᶜ</w:t>
+            </w:r>
+            <w:r>
+              <w:t xml:space="preserve">†</w:t>
             </w:r>
           </w:p>
         </w:tc>
@@ -5180,6 +5370,15 @@
       <w:r>
         <w:t xml:space="preserve">because Old Mandarin merged -p, -t and -k into nothing and the merger is not recoverable.</w:t>
       </w:r>
+      <w:hyperlink w:anchor="r24">
+        <w:r>
+          <w:rPr>
+            <w:rStyle w:val="Hyperlink"/>
+            <w:vertAlign w:val="superscript"/>
+          </w:rPr>
+          <w:t xml:space="preserve">24</w:t>
+        </w:r>
+      </w:hyperlink>
     </w:p>
     <w:p>
       <w:pPr>
@@ -5924,7 +6123,7 @@
         <w:t xml:space="preserve">Bögü-Çor</w:t>
       </w:r>
       <w:r>
-        <w:t xml:space="preserve">; the Uyghur ruler</w:t>
+        <w:t xml:space="preserve">; and the Uyghur ruler</w:t>
       </w:r>
       <w:r>
         <w:t xml:space="preserve"> </w:t>
@@ -5952,7 +6151,13 @@
         <w:t xml:space="preserve"> </w:t>
       </w:r>
       <w:r>
-        <w:t xml:space="preserve">"wise" behind a different</w:t>
+        <w:t xml:space="preserve">"wise" behind a</w:t>
+      </w:r>
+      <w:r>
+        <w:t xml:space="preserve"> </w:t>
+      </w:r>
+      <w:r>
+        <w:t xml:space="preserve">different</w:t>
       </w:r>
       <w:r>
         <w:t xml:space="preserve"> </w:t>
@@ -5964,32 +6169,7 @@
         <w:t xml:space="preserve"> </w:t>
       </w:r>
       <w:r>
-        <w:t xml:space="preserve">character; and</w:t>
-      </w:r>
-      <w:r>
-        <w:t xml:space="preserve"> </w:t>
-      </w:r>
-      <w:r>
-        <w:t xml:space="preserve">木桿</w:t>
-      </w:r>
-      <w:r>
-        <w:t xml:space="preserve"> </w:t>
-      </w:r>
-      <w:r>
-        <w:t xml:space="preserve">stands for</w:t>
-      </w:r>
-      <w:r>
-        <w:t xml:space="preserve"> </w:t>
-      </w:r>
-      <w:r>
-        <w:rPr>
-          <w:iCs/>
-          <w:i/>
-        </w:rPr>
-        <w:t xml:space="preserve">Muqan</w:t>
-      </w:r>
-      <w:r>
-        <w:t xml:space="preserve">. Two different Chinese</w:t>
+        <w:t xml:space="preserve">character. Two different Chinese</w:t>
       </w:r>
       <w:r>
         <w:t xml:space="preserve"> </w:t>
@@ -6013,7 +6193,81 @@
         <w:t xml:space="preserve"> </w:t>
       </w:r>
       <w:r>
-        <w:t xml:space="preserve">word is a pattern, not an accident. These are Tang rather than Han,</w:t>
+        <w:t xml:space="preserve">word is a</w:t>
+      </w:r>
+      <w:r>
+        <w:t xml:space="preserve"> </w:t>
+      </w:r>
+      <w:r>
+        <w:t xml:space="preserve">pattern, not an accident. A third Türk name often cited alongside these two,</w:t>
+      </w:r>
+      <w:r>
+        <w:t xml:space="preserve"> </w:t>
+      </w:r>
+      <w:r>
+        <w:t xml:space="preserve">木杆</w:t>
+      </w:r>
+      <w:r>
+        <w:t xml:space="preserve"> </w:t>
+      </w:r>
+      <w:r>
+        <w:t xml:space="preserve">for Muqan Qaghan, is a control rather than a third instance: the</w:t>
+      </w:r>
+      <w:r>
+        <w:t xml:space="preserve"> </w:t>
+      </w:r>
+      <w:r>
+        <w:t xml:space="preserve">Sogdian Bugut inscription writes that name</w:t>
+      </w:r>
+      <w:r>
+        <w:t xml:space="preserve"> </w:t>
+      </w:r>
+      <w:r>
+        <w:rPr>
+          <w:iCs/>
+          <w:i/>
+        </w:rPr>
+        <w:t xml:space="preserve">mwγʾn</w:t>
+      </w:r>
+      <w:r>
+        <w:t xml:space="preserve">, also with</w:t>
+      </w:r>
+      <w:r>
+        <w:t xml:space="preserve"> </w:t>
+      </w:r>
+      <w:r>
+        <w:t xml:space="preserve">m-</w:t>
+      </w:r>
+      <w:r>
+        <w:t xml:space="preserve">, in a script that has a letter for</w:t>
+      </w:r>
+      <w:r>
+        <w:t xml:space="preserve"> </w:t>
+      </w:r>
+      <w:r>
+        <w:rPr>
+          <w:iCs/>
+          <w:i/>
+        </w:rPr>
+        <w:t xml:space="preserve">b</w:t>
+      </w:r>
+      <w:r>
+        <w:t xml:space="preserve">, so the name's own</w:t>
+      </w:r>
+      <w:r>
+        <w:t xml:space="preserve"> </w:t>
+      </w:r>
+      <w:r>
+        <w:t xml:space="preserve">initial is disputed and cannot be assumed to be</w:t>
+      </w:r>
+      <w:r>
+        <w:t xml:space="preserve"> </w:t>
+      </w:r>
+      <w:r>
+        <w:t xml:space="preserve">b-</w:t>
+      </w:r>
+      <w:r>
+        <w:t xml:space="preserve">. These are Tang rather than Han,</w:t>
       </w:r>
       <w:r>
         <w:t xml:space="preserve"> </w:t>
@@ -8577,13 +8831,28 @@
         <w:t xml:space="preserve">Bögü Tın</w:t>
       </w:r>
       <w:r>
-        <w:t xml:space="preserve">, does meet this</w:t>
-      </w:r>
-      <w:r>
-        <w:t xml:space="preserve"> </w:t>
-      </w:r>
-      <w:r>
-        <w:t xml:space="preserve">standard, and §9.2 sets it out. We produced 31 others in the course of this work. None of</w:t>
+        <w:t xml:space="preserve">, meets this</w:t>
+      </w:r>
+      <w:r>
+        <w:t xml:space="preserve"> </w:t>
+      </w:r>
+      <w:r>
+        <w:t xml:space="preserve">standard on one of the two Later Han readings of</w:t>
+      </w:r>
+      <w:r>
+        <w:t xml:space="preserve"> </w:t>
+      </w:r>
+      <w:r>
+        <w:t xml:space="preserve">頓</w:t>
+      </w:r>
+      <w:r>
+        <w:t xml:space="preserve">, and §9.2 sets out</w:t>
+      </w:r>
+      <w:r>
+        <w:t xml:space="preserve"> </w:t>
+      </w:r>
+      <w:r>
+        <w:t xml:space="preserve">what that turns on. We produced 31 others in the course of this work. None of</w:t>
       </w:r>
       <w:r>
         <w:t xml:space="preserve"> </w:t>
@@ -8843,13 +9112,7 @@
         <w:t xml:space="preserve">徑路刀</w:t>
       </w:r>
       <w:r>
-        <w:t xml:space="preserve">, a Xiongnu blade used in oath-taking. Friedrich Hirth compared</w:t>
-      </w:r>
-      <w:r>
-        <w:t xml:space="preserve"> </w:t>
-      </w:r>
-      <w:r>
-        <w:t xml:space="preserve">it with Turkic</w:t>
+        <w:t xml:space="preserve">, a Xiongnu blade used in oath-taking. Friedrich Hirth compared it with Turkic</w:t>
       </w:r>
       <w:r>
         <w:t xml:space="preserve"> </w:t>
@@ -8865,13 +9128,103 @@
         <w:t xml:space="preserve"> </w:t>
       </w:r>
       <w:r>
-        <w:t xml:space="preserve">in 1908, calling the word the oldest Turkish on</w:t>
-      </w:r>
-      <w:r>
-        <w:t xml:space="preserve"> </w:t>
-      </w:r>
-      <w:r>
-        <w:t xml:space="preserve">record.</w:t>
+        <w:t xml:space="preserve">in 1908, working from the</w:t>
+      </w:r>
+      <w:r>
+        <w:t xml:space="preserve"> </w:t>
+      </w:r>
+      <w:r>
+        <w:rPr>
+          <w:iCs/>
+          <w:i/>
+        </w:rPr>
+        <w:t xml:space="preserve">Hanshu</w:t>
+      </w:r>
+      <w:r>
+        <w:t xml:space="preserve"> </w:t>
+      </w:r>
+      <w:r>
+        <w:t xml:space="preserve">account of the treaty of 47 BCE, where the scholiast glosses the word as the</w:t>
+      </w:r>
+      <w:r>
+        <w:t xml:space="preserve"> </w:t>
+      </w:r>
+      <w:r>
+        <w:t xml:space="preserve">precious sword of the Xiongnu. He drew the Turkic side from living Turki dialects rather than</w:t>
+      </w:r>
+      <w:r>
+        <w:t xml:space="preserve"> </w:t>
+      </w:r>
+      <w:r>
+        <w:t xml:space="preserve">from Kāşgarî, and extended the identification to</w:t>
+      </w:r>
+      <w:r>
+        <w:t xml:space="preserve"> </w:t>
+      </w:r>
+      <w:r>
+        <w:t xml:space="preserve">輕呂</w:t>
+      </w:r>
+      <w:r>
+        <w:t xml:space="preserve">, the word the</w:t>
+      </w:r>
+      <w:r>
+        <w:t xml:space="preserve"> </w:t>
+      </w:r>
+      <w:r>
+        <w:rPr>
+          <w:iCs/>
+          <w:i/>
+        </w:rPr>
+        <w:t xml:space="preserve">Zhoushu</w:t>
+      </w:r>
+      <w:r>
+        <w:t xml:space="preserve"> </w:t>
+      </w:r>
+      <w:r>
+        <w:t xml:space="preserve">uses for King Wu's dagger, which is why he called it the oldest Turkic word on</w:t>
+      </w:r>
+      <w:r>
+        <w:t xml:space="preserve"> </w:t>
+      </w:r>
+      <w:r>
+        <w:t xml:space="preserve">record. That further claim is his and is not tested here.</w:t>
+      </w:r>
+      <w:hyperlink w:anchor="r11">
+        <w:r>
+          <w:rPr>
+            <w:rStyle w:val="Hyperlink"/>
+            <w:vertAlign w:val="superscript"/>
+          </w:rPr>
+          <w:t xml:space="preserve">11</w:t>
+        </w:r>
+      </w:hyperlink>
+      <w:r>
+        <w:t xml:space="preserve"> </w:t>
+      </w:r>
+      <w:r>
+        <w:t xml:space="preserve">Kāşgarî glosses</w:t>
+      </w:r>
+      <w:r>
+        <w:t xml:space="preserve"> </w:t>
+      </w:r>
+      <w:r>
+        <w:rPr>
+          <w:iCs/>
+          <w:i/>
+        </w:rPr>
+        <w:t xml:space="preserve">kıñrak</w:t>
+      </w:r>
+      <w:r>
+        <w:t xml:space="preserve"> </w:t>
+      </w:r>
+      <w:r>
+        <w:t xml:space="preserve">as a large knife resembling a cleaver, for cutting meat and</w:t>
+      </w:r>
+      <w:r>
+        <w:t xml:space="preserve"> </w:t>
+      </w:r>
+      <w:r>
+        <w:t xml:space="preserve">dough.</w:t>
       </w:r>
       <w:hyperlink w:anchor="r12">
         <w:r>
@@ -8886,29 +9239,7 @@
         <w:t xml:space="preserve"> </w:t>
       </w:r>
       <w:r>
-        <w:t xml:space="preserve">Kāşgarî glosses</w:t>
-      </w:r>
-      <w:r>
-        <w:t xml:space="preserve"> </w:t>
-      </w:r>
-      <w:r>
-        <w:rPr>
-          <w:iCs/>
-          <w:i/>
-        </w:rPr>
-        <w:t xml:space="preserve">kıñrak</w:t>
-      </w:r>
-      <w:r>
-        <w:t xml:space="preserve"> </w:t>
-      </w:r>
-      <w:r>
-        <w:t xml:space="preserve">as a large knife</w:t>
-      </w:r>
-      <w:r>
-        <w:t xml:space="preserve"> </w:t>
-      </w:r>
-      <w:r>
-        <w:t xml:space="preserve">resembling a cleaver, for cutting meat and dough. The Chinese side independently says the referent is a blade, two sources with no contact agreeing about what the object is, which is a stronger</w:t>
+        <w:t xml:space="preserve">The Chinese side independently says the referent is a blade, two sources with no contact agreeing about what the object is, which is a stronger</w:t>
       </w:r>
       <w:r>
         <w:t xml:space="preserve"> </w:t>
@@ -9013,13 +9344,7 @@
         <w:t xml:space="preserve"> </w:t>
       </w:r>
       <w:r>
-        <w:t xml:space="preserve">\ Clauson</w:t>
-      </w:r>
-      <w:r>
-        <w:t xml:space="preserve"> </w:t>
-      </w:r>
-      <w:r>
-        <w:t xml:space="preserve">derives</w:t>
+        <w:t xml:space="preserve">Clauson derives</w:t>
       </w:r>
       <w:r>
         <w:t xml:space="preserve"> </w:t>
@@ -9048,7 +9373,10 @@
         <w:t xml:space="preserve">*kıŋra:-</w:t>
       </w:r>
       <w:r>
-        <w:t xml:space="preserve">, itself</w:t>
+        <w:t xml:space="preserve"> </w:t>
+      </w:r>
+      <w:r>
+        <w:t xml:space="preserve">(the colon is Clauson's mark for a long vowel), itself</w:t>
       </w:r>
       <w:r>
         <w:t xml:space="preserve"> </w:t>
@@ -9280,7 +9608,23 @@
         <w:pStyle w:val="BodyText"/>
       </w:pPr>
       <w:r>
-        <w:t xml:space="preserve">Kāşgarî's text at III 382 reads</w:t>
+        <w:t xml:space="preserve">Kāşgarî's text at volume III, page 382 of the</w:t>
+      </w:r>
+      <w:r>
+        <w:t xml:space="preserve"> </w:t>
+      </w:r>
+      <w:r>
+        <w:rPr>
+          <w:iCs/>
+          <w:i/>
+        </w:rPr>
+        <w:t xml:space="preserve">Dīwān</w:t>
+      </w:r>
+      <w:r>
+        <w:t xml:space="preserve"> </w:t>
+      </w:r>
+      <w:r>
+        <w:t xml:space="preserve">reads</w:t>
       </w:r>
       <w:r>
         <w:t xml:space="preserve"> </w:t>
@@ -9315,7 +9659,19 @@
         <w:t xml:space="preserve"> </w:t>
       </w:r>
       <w:r>
-        <w:t xml:space="preserve">written.</w:t>
+        <w:t xml:space="preserve">written. The emendation is not the only support for it: Hirth took the word from living Turki</w:t>
+      </w:r>
+      <w:r>
+        <w:t xml:space="preserve"> </w:t>
+      </w:r>
+      <w:r>
+        <w:t xml:space="preserve">dialects in 1908, and the Teleut and Kirghiz survivals cited above are independent of the</w:t>
+      </w:r>
+      <w:r>
+        <w:t xml:space="preserve"> </w:t>
+      </w:r>
+      <w:r>
+        <w:t xml:space="preserve">Dīwān's manuscript altogether.</w:t>
       </w:r>
       <w:r>
         <w:t xml:space="preserve"> </w:t>
@@ -9500,7 +9856,13 @@
         <w:pStyle w:val="BodyText"/>
       </w:pPr>
       <w:r>
-        <w:t xml:space="preserve">Our channel establishes what a transcription</w:t>
+        <w:t xml:space="preserve">We have not seen the exact Iranian etymon its proponents advance, so the test applies</w:t>
+      </w:r>
+      <w:r>
+        <w:t xml:space="preserve"> </w:t>
+      </w:r>
+      <w:r>
+        <w:t xml:space="preserve">only to the form named. Our channel establishes what a transcription</w:t>
       </w:r>
       <w:r>
         <w:t xml:space="preserve"> </w:t>
@@ -9600,7 +9962,61 @@
         <w:t xml:space="preserve">*toγrï</w:t>
       </w:r>
       <w:r>
-        <w:t xml:space="preserve">. The</w:t>
+        <w:t xml:space="preserve">.</w:t>
+      </w:r>
+      <w:r>
+        <w:t xml:space="preserve"> </w:t>
+      </w:r>
+      <w:r>
+        <w:t xml:space="preserve">耆</w:t>
+      </w:r>
+      <w:r>
+        <w:t xml:space="preserve"> </w:t>
+      </w:r>
+      <w:r>
+        <w:t xml:space="preserve">is one of the daggered</w:t>
+      </w:r>
+      <w:r>
+        <w:t xml:space="preserve"> </w:t>
+      </w:r>
+      <w:r>
+        <w:t xml:space="preserve">characters: the table gives</w:t>
+      </w:r>
+      <w:r>
+        <w:t xml:space="preserve"> </w:t>
+      </w:r>
+      <w:r>
+        <w:t xml:space="preserve">gɨ</w:t>
+      </w:r>
+      <w:r>
+        <w:t xml:space="preserve">,</w:t>
+      </w:r>
+      <w:r>
+        <w:t xml:space="preserve"> </w:t>
+      </w:r>
+      <w:r>
+        <w:t xml:space="preserve">kiᴮ</w:t>
+      </w:r>
+      <w:r>
+        <w:t xml:space="preserve"> </w:t>
+      </w:r>
+      <w:r>
+        <w:t xml:space="preserve">and</w:t>
+      </w:r>
+      <w:r>
+        <w:t xml:space="preserve"> </w:t>
+      </w:r>
+      <w:r>
+        <w:t xml:space="preserve">tśiᴮ</w:t>
+      </w:r>
+      <w:r>
+        <w:t xml:space="preserve">, and the comparison below uses the first. The second would serve</w:t>
+      </w:r>
+      <w:r>
+        <w:t xml:space="preserve"> </w:t>
+      </w:r>
+      <w:r>
+        <w:t xml:space="preserve">it equally well; the third would not. The</w:t>
       </w:r>
       <w:r>
         <w:t xml:space="preserve"> </w:t>
@@ -9709,7 +10125,7 @@
         <w:t xml:space="preserve"> </w:t>
       </w:r>
       <w:r>
-        <w:t xml:space="preserve">metaphorically "straight, honest, upright, true", and that moral sense is old rather than modern. Aafourteenth-century glossary renders it with Arabic</w:t>
+        <w:t xml:space="preserve">metaphorically "straight, honest, upright, true", and that moral sense is old rather than modern. A fourteenth-century glossary renders it with Arabic</w:t>
       </w:r>
       <w:r>
         <w:t xml:space="preserve"> </w:t>
@@ -9928,13 +10344,13 @@
       </w:r>
     </w:p>
     <w:bookmarkEnd w:id="42"/>
-    <w:bookmarkStart w:id="43" w:name="a-reading-the-measurements-do-support-冒頓"/>
+    <w:bookmarkStart w:id="43" w:name="X0c4ba52fd95c78c09fdcd9031fd6d8d2ec1da17"/>
     <w:p>
       <w:pPr>
         <w:pStyle w:val="Heading3"/>
       </w:pPr>
       <w:r>
-        <w:t xml:space="preserve">9.2  A reading the measurements do support:</w:t>
+        <w:t xml:space="preserve">9.2  Where a century-old disagreement actually lies:</w:t>
       </w:r>
       <w:r>
         <w:t xml:space="preserve"> </w:t>
@@ -9960,13 +10376,7 @@
         <w:t xml:space="preserve"> </w:t>
       </w:r>
       <w:r>
-        <w:t xml:space="preserve">from both ends and taken</w:t>
-      </w:r>
-      <w:r>
-        <w:t xml:space="preserve"> </w:t>
-      </w:r>
-      <w:r>
-        <w:t xml:space="preserve">together they point somewhere.</w:t>
+        <w:t xml:space="preserve">from both ends.</w:t>
       </w:r>
       <w:r>
         <w:t xml:space="preserve"> </w:t>
@@ -9978,19 +10388,13 @@
         <w:t xml:space="preserve"> </w:t>
       </w:r>
       <w:r>
-        <w:t xml:space="preserve">mək tuənᶜ</w:t>
-      </w:r>
-      <w:r>
-        <w:t xml:space="preserve"> </w:t>
-      </w:r>
-      <w:r>
-        <w:t xml:space="preserve">is the most consequential name in</w:t>
-      </w:r>
-      <w:r>
-        <w:t xml:space="preserve"> </w:t>
-      </w:r>
-      <w:r>
-        <w:t xml:space="preserve">the record, and the frame it fixes is unusually tight, because</w:t>
+        <w:t xml:space="preserve">is the most consequential name in the record, and the frame it fixes</w:t>
+      </w:r>
+      <w:r>
+        <w:t xml:space="preserve"> </w:t>
+      </w:r>
+      <w:r>
+        <w:t xml:space="preserve">looks unusually tight, because</w:t>
       </w:r>
       <w:r>
         <w:t xml:space="preserve"> </w:t>
@@ -10000,36 +10404,702 @@
           <w:bCs/>
           <w:b/>
         </w:rPr>
-        <w:t xml:space="preserve">both codas are</w:t>
-      </w:r>
+        <w:t xml:space="preserve">both codas are written</w:t>
+      </w:r>
+      <w:r>
+        <w:t xml:space="preserve">. The second of them,</w:t>
+      </w:r>
+      <w:r>
+        <w:t xml:space="preserve"> </w:t>
+      </w:r>
+      <w:r>
+        <w:t xml:space="preserve">however, is not a single value. Schuessler's table gives</w:t>
+      </w:r>
+      <w:r>
+        <w:t xml:space="preserve"> </w:t>
+      </w:r>
+      <w:r>
+        <w:t xml:space="preserve">頓</w:t>
+      </w:r>
+      <w:r>
+        <w:t xml:space="preserve"> </w:t>
+      </w:r>
+      <w:r>
+        <w:t xml:space="preserve">two Later Han</w:t>
+      </w:r>
+      <w:r>
+        <w:t xml:space="preserve"> </w:t>
+      </w:r>
+      <w:r>
+        <w:t xml:space="preserve">readings,</w:t>
+      </w:r>
+      <w:r>
+        <w:t xml:space="preserve"> </w:t>
+      </w:r>
+      <w:r>
+        <w:t xml:space="preserve">tuənᶜ</w:t>
+      </w:r>
+      <w:r>
+        <w:t xml:space="preserve"> </w:t>
+      </w:r>
+      <w:r>
+        <w:t xml:space="preserve">and</w:t>
+      </w:r>
+      <w:r>
+        <w:t xml:space="preserve"> </w:t>
+      </w:r>
+      <w:r>
+        <w:t xml:space="preserve">tuət</w:t>
+      </w:r>
+      <w:r>
+        <w:t xml:space="preserve">, one ending in a nasal</w:t>
+      </w:r>
+      <w:r>
+        <w:t xml:space="preserve"> </w:t>
+      </w:r>
+      <w:r>
+        <w:t xml:space="preserve">and one in a stop, and the reconstruction column of Appendix A prints the first. That choice,</w:t>
+      </w:r>
+      <w:r>
+        <w:t xml:space="preserve"> </w:t>
+      </w:r>
+      <w:r>
+        <w:t xml:space="preserve">which no published reading of this name states, is what separates our proposal from the</w:t>
+      </w:r>
+      <w:r>
+        <w:t xml:space="preserve"> </w:t>
+      </w:r>
+      <w:r>
+        <w:t xml:space="preserve">field's.</w:t>
+      </w:r>
+    </w:p>
+    <w:p>
+      <w:pPr>
+        <w:pStyle w:val="BodyText"/>
+      </w:pPr>
       <w:r>
         <w:rPr>
           <w:bCs/>
           <w:b/>
         </w:rPr>
-        <w:t xml:space="preserve"> </w:t>
-      </w:r>
+        <w:t xml:space="preserve">The first character has a documented Turkic value.</w:t>
+      </w:r>
+      <w:r>
+        <w:t xml:space="preserve"> </w:t>
+      </w:r>
+      <w:r>
+        <w:t xml:space="preserve">This is not an inference</w:t>
+      </w:r>
+      <w:r>
+        <w:t xml:space="preserve"> </w:t>
+      </w:r>
+      <w:r>
+        <w:t xml:space="preserve">from a rate, and it holds whichever reading of</w:t>
+      </w:r>
+      <w:r>
+        <w:t xml:space="preserve"> </w:t>
+      </w:r>
+      <w:r>
+        <w:t xml:space="preserve">頓</w:t>
+      </w:r>
+      <w:r>
+        <w:t xml:space="preserve"> </w:t>
+      </w:r>
+      <w:r>
+        <w:t xml:space="preserve">is taken. In the Later</w:t>
+      </w:r>
+      <w:r>
+        <w:t xml:space="preserve"> </w:t>
+      </w:r>
+      <w:r>
+        <w:t xml:space="preserve">Han table</w:t>
+      </w:r>
+      <w:r>
+        <w:t xml:space="preserve"> </w:t>
+      </w:r>
+      <w:r>
+        <w:t xml:space="preserve">冒</w:t>
+      </w:r>
+      <w:r>
+        <w:t xml:space="preserve"> </w:t>
+      </w:r>
+      <w:r>
+        <w:t xml:space="preserve">and</w:t>
+      </w:r>
+      <w:r>
+        <w:t xml:space="preserve"> </w:t>
+      </w:r>
+      <w:r>
+        <w:t xml:space="preserve">默</w:t>
+      </w:r>
+      <w:r>
+        <w:t xml:space="preserve"> </w:t>
+      </w:r>
+      <w:r>
+        <w:t xml:space="preserve">have the</w:t>
+      </w:r>
+      <w:r>
+        <w:t xml:space="preserve"> </w:t>
+      </w:r>
+      <w:r>
+        <w:rPr>
+          <w:iCs/>
+          <w:i/>
+        </w:rPr>
+        <w:t xml:space="preserve">same</w:t>
+      </w:r>
+      <w:r>
+        <w:t xml:space="preserve"> </w:t>
+      </w:r>
+      <w:r>
+        <w:t xml:space="preserve">reading,</w:t>
+      </w:r>
+      <w:r>
+        <w:t xml:space="preserve"> </w:t>
+      </w:r>
+      <w:r>
+        <w:t xml:space="preserve">mək</w:t>
+      </w:r>
+      <w:r>
+        <w:t xml:space="preserve">. And</w:t>
+      </w:r>
+      <w:r>
+        <w:t xml:space="preserve"> </w:t>
+      </w:r>
+      <w:r>
+        <w:t xml:space="preserve">默</w:t>
+      </w:r>
+      <w:r>
+        <w:t xml:space="preserve">啜</w:t>
+      </w:r>
+      <w:r>
+        <w:t xml:space="preserve">,</w:t>
+      </w:r>
+      <w:r>
+        <w:t xml:space="preserve"> </w:t>
+      </w:r>
+      <w:r>
+        <w:t xml:space="preserve">the personal name of the Türk ruler known in the inscriptions as Qapaghan Qaghan, is read</w:t>
+      </w:r>
+      <w:r>
+        <w:t xml:space="preserve"> </w:t>
+      </w:r>
+      <w:r>
+        <w:rPr>
+          <w:iCs/>
+          <w:i/>
+        </w:rPr>
+        <w:t xml:space="preserve">Bögü-Çor</w:t>
+      </w:r>
+      <w:r>
+        <w:t xml:space="preserve">. So that exact Later Han syllable is on record writing</w:t>
+      </w:r>
+      <w:r>
+        <w:t xml:space="preserve"> </w:t>
+      </w:r>
+      <w:r>
+        <w:rPr>
+          <w:iCs/>
+          <w:i/>
+        </w:rPr>
+        <w:t xml:space="preserve">bögü</w:t>
+      </w:r>
+      <w:r>
+        <w:t xml:space="preserve"> </w:t>
+      </w:r>
+      <w:r>
+        <w:t xml:space="preserve">in a Turkic</w:t>
+      </w:r>
+      <w:r>
+        <w:t xml:space="preserve"> </w:t>
+      </w:r>
+      <w:r>
+        <w:t xml:space="preserve">ruler's name: the</w:t>
+      </w:r>
+      <w:r>
+        <w:t xml:space="preserve"> </w:t>
+      </w:r>
+      <w:r>
+        <w:t xml:space="preserve">m-</w:t>
+      </w:r>
+      <w:r>
+        <w:t xml:space="preserve"> </w:t>
+      </w:r>
+      <w:r>
+        <w:t xml:space="preserve">standing for the source</w:t>
+      </w:r>
+      <w:r>
+        <w:t xml:space="preserve"> </w:t>
+      </w:r>
+      <w:r>
+        <w:t xml:space="preserve">b-</w:t>
+      </w:r>
+      <w:r>
+        <w:t xml:space="preserve">,</w:t>
+      </w:r>
+      <w:r>
+        <w:t xml:space="preserve"> </w:t>
+      </w:r>
+      <w:r>
+        <w:t xml:space="preserve">the written</w:t>
+      </w:r>
+      <w:r>
+        <w:t xml:space="preserve"> </w:t>
+      </w:r>
+      <w:r>
+        <w:t xml:space="preserve">-k</w:t>
+      </w:r>
+      <w:r>
+        <w:t xml:space="preserve"> </w:t>
+      </w:r>
+      <w:r>
+        <w:t xml:space="preserve">standing for the source</w:t>
+      </w:r>
+      <w:r>
+        <w:t xml:space="preserve"> </w:t>
+      </w:r>
+      <w:r>
+        <w:t xml:space="preserve">g</w:t>
+      </w:r>
+      <w:r>
+        <w:t xml:space="preserve">, and</w:t>
+      </w:r>
+      <w:r>
+        <w:t xml:space="preserve"> </w:t>
+      </w:r>
+      <w:r>
+        <w:t xml:space="preserve">the final vowel of</w:t>
+      </w:r>
+      <w:r>
+        <w:t xml:space="preserve"> </w:t>
+      </w:r>
+      <w:r>
+        <w:rPr>
+          <w:iCs/>
+          <w:i/>
+        </w:rPr>
+        <w:t xml:space="preserve">bögü</w:t>
+      </w:r>
+      <w:r>
+        <w:t xml:space="preserve"> </w:t>
+      </w:r>
+      <w:r>
+        <w:t xml:space="preserve">not written at all. The same substitution is on record more than once in Turkic onomastics, and the characters used</w:t>
+      </w:r>
+      <w:r>
+        <w:t xml:space="preserve"> </w:t>
+      </w:r>
+      <w:r>
+        <w:t xml:space="preserve">are worth setting out:</w:t>
+      </w:r>
+      <w:r>
+        <w:t xml:space="preserve"> </w:t>
+      </w:r>
+      <w:r>
+        <w:t xml:space="preserve">默</w:t>
+      </w:r>
+      <w:r>
+        <w:t xml:space="preserve"> </w:t>
+      </w:r>
+      <w:r>
+        <w:t xml:space="preserve">mək</w:t>
+      </w:r>
+      <w:r>
+        <w:t xml:space="preserve"> </w:t>
+      </w:r>
+      <w:r>
+        <w:t xml:space="preserve">in</w:t>
+      </w:r>
+      <w:r>
+        <w:t xml:space="preserve"> </w:t>
+      </w:r>
+      <w:r>
+        <w:t xml:space="preserve">默啜</w:t>
+      </w:r>
+      <w:r>
+        <w:t xml:space="preserve"> </w:t>
+      </w:r>
+      <w:r>
+        <w:t xml:space="preserve">for</w:t>
+      </w:r>
+      <w:r>
+        <w:t xml:space="preserve"> </w:t>
+      </w:r>
+      <w:r>
+        <w:rPr>
+          <w:iCs/>
+          <w:i/>
+        </w:rPr>
+        <w:t xml:space="preserve">Bögü-Çor</w:t>
+      </w:r>
+      <w:r>
+        <w:t xml:space="preserve">, and</w:t>
+      </w:r>
+      <w:r>
+        <w:t xml:space="preserve"> </w:t>
+      </w:r>
+      <w:r>
+        <w:t xml:space="preserve">牟</w:t>
+      </w:r>
+      <w:r>
+        <w:t xml:space="preserve"> </w:t>
+      </w:r>
+      <w:r>
+        <w:t xml:space="preserve">mu</w:t>
+      </w:r>
+      <w:r>
+        <w:t xml:space="preserve"> </w:t>
+      </w:r>
+      <w:r>
+        <w:t xml:space="preserve">in</w:t>
+      </w:r>
+      <w:r>
+        <w:t xml:space="preserve"> </w:t>
+      </w:r>
+      <w:r>
+        <w:t xml:space="preserve">牟羽</w:t>
+      </w:r>
+      <w:r>
+        <w:t xml:space="preserve"> </w:t>
+      </w:r>
+      <w:r>
+        <w:t xml:space="preserve">for the Uyghur Bögü Qaghan. Both</w:t>
+      </w:r>
+      <w:r>
+        <w:t xml:space="preserve"> </w:t>
+      </w:r>
+      <w:r>
+        <w:t xml:space="preserve">write</w:t>
+      </w:r>
+      <w:r>
+        <w:t xml:space="preserve"> </w:t>
+      </w:r>
+      <w:r>
+        <w:rPr>
+          <w:iCs/>
+          <w:i/>
+        </w:rPr>
+        <w:t xml:space="preserve">bögü</w:t>
+      </w:r>
+      <w:r>
+        <w:t xml:space="preserve"> </w:t>
+      </w:r>
+      <w:r>
+        <w:t xml:space="preserve">with a Chinese</w:t>
+      </w:r>
+      <w:r>
+        <w:t xml:space="preserve"> </w:t>
+      </w:r>
+      <w:r>
+        <w:t xml:space="preserve">m-</w:t>
+      </w:r>
+      <w:r>
+        <w:t xml:space="preserve"> </w:t>
+      </w:r>
+      <w:r>
+        <w:t xml:space="preserve">character.</w:t>
+      </w:r>
+      <w:r>
+        <w:t xml:space="preserve"> </w:t>
+      </w:r>
+      <w:r>
+        <w:t xml:space="preserve">冒</w:t>
+      </w:r>
+      <w:r>
+        <w:t xml:space="preserve"> </w:t>
+      </w:r>
+      <w:r>
+        <w:t xml:space="preserve">is itself listed with a second reading,</w:t>
+      </w:r>
+      <w:r>
+        <w:t xml:space="preserve"> </w:t>
+      </w:r>
+      <w:r>
+        <w:t xml:space="preserve">mouᶜ</w:t>
+      </w:r>
+      <w:r>
+        <w:t xml:space="preserve">, and the two attested spellings of</w:t>
+      </w:r>
+      <w:r>
+        <w:t xml:space="preserve"> </w:t>
+      </w:r>
+      <w:r>
+        <w:rPr>
+          <w:iCs/>
+          <w:i/>
+        </w:rPr>
+        <w:t xml:space="preserve">bögü</w:t>
+      </w:r>
+      <w:r>
+        <w:t xml:space="preserve"> </w:t>
+      </w:r>
+      <w:r>
+        <w:t xml:space="preserve">fall either side</w:t>
+      </w:r>
+      <w:r>
+        <w:t xml:space="preserve"> </w:t>
+      </w:r>
+      <w:r>
+        <w:t xml:space="preserve">of that split:</w:t>
+      </w:r>
+      <w:r>
+        <w:t xml:space="preserve"> </w:t>
+      </w:r>
+      <w:r>
+        <w:t xml:space="preserve">默</w:t>
+      </w:r>
+      <w:r>
+        <w:t xml:space="preserve"> </w:t>
+      </w:r>
+      <w:r>
+        <w:t xml:space="preserve">matches</w:t>
+      </w:r>
+      <w:r>
+        <w:t xml:space="preserve"> </w:t>
+      </w:r>
+      <w:r>
+        <w:t xml:space="preserve">冒</w:t>
+      </w:r>
+      <w:r>
+        <w:t xml:space="preserve">'s first reading</w:t>
+      </w:r>
+      <w:r>
+        <w:t xml:space="preserve"> </w:t>
+      </w:r>
+      <w:r>
+        <w:t xml:space="preserve">exactly, and</w:t>
+      </w:r>
+      <w:r>
+        <w:t xml:space="preserve"> </w:t>
+      </w:r>
+      <w:r>
+        <w:t xml:space="preserve">牟</w:t>
+      </w:r>
+      <w:r>
+        <w:t xml:space="preserve"> </w:t>
+      </w:r>
+      <w:r>
+        <w:t xml:space="preserve">mu</w:t>
+      </w:r>
+      <w:r>
+        <w:t xml:space="preserve"> </w:t>
+      </w:r>
+      <w:r>
+        <w:t xml:space="preserve">is the nearer of the two to</w:t>
+      </w:r>
+      <w:r>
+        <w:t xml:space="preserve"> </w:t>
+      </w:r>
+      <w:r>
+        <w:t xml:space="preserve">its second. Whichever row of</w:t>
+      </w:r>
+      <w:r>
+        <w:t xml:space="preserve"> </w:t>
+      </w:r>
+      <w:r>
+        <w:t xml:space="preserve">冒</w:t>
+      </w:r>
+      <w:r>
+        <w:t xml:space="preserve"> </w:t>
+      </w:r>
+      <w:r>
+        <w:t xml:space="preserve">is taken, there is a Turkic precedent</w:t>
+      </w:r>
+      <w:r>
+        <w:t xml:space="preserve"> </w:t>
+      </w:r>
+      <w:r>
+        <w:t xml:space="preserve">for that character writing</w:t>
+      </w:r>
+      <w:r>
+        <w:t xml:space="preserve"> </w:t>
+      </w:r>
+      <w:r>
+        <w:rPr>
+          <w:iCs/>
+          <w:i/>
+        </w:rPr>
+        <w:t xml:space="preserve">bögü</w:t>
+      </w:r>
+      <w:r>
+        <w:t xml:space="preserve">.</w:t>
+      </w:r>
+    </w:p>
+    <w:p>
+      <w:pPr>
+        <w:pStyle w:val="BodyText"/>
+      </w:pPr>
       <w:r>
         <w:rPr>
           <w:bCs/>
           <w:b/>
         </w:rPr>
-        <w:t xml:space="preserve">written</w:t>
-      </w:r>
-      <w:r>
-        <w:t xml:space="preserve">: the</w:t>
-      </w:r>
-      <w:r>
-        <w:t xml:space="preserve"> </w:t>
-      </w:r>
-      <w:r>
-        <w:t xml:space="preserve">-k</w:t>
-      </w:r>
-      <w:r>
-        <w:t xml:space="preserve"> </w:t>
-      </w:r>
-      <w:r>
-        <w:t xml:space="preserve">of</w:t>
+        <w:t xml:space="preserve">Each step of that is separately licensed by the corpora.</w:t>
+      </w:r>
+      <w:r>
+        <w:t xml:space="preserve"> </w:t>
+      </w:r>
+      <w:r>
+        <w:t xml:space="preserve">The</w:t>
+      </w:r>
+      <w:r>
+        <w:t xml:space="preserve"> </w:t>
+      </w:r>
+      <w:r>
+        <w:t xml:space="preserve">m-</w:t>
+      </w:r>
+      <w:r>
+        <w:t xml:space="preserve"> </w:t>
+      </w:r>
+      <w:r>
+        <w:t xml:space="preserve">for a source</w:t>
+      </w:r>
+      <w:r>
+        <w:t xml:space="preserve"> </w:t>
+      </w:r>
+      <w:r>
+        <w:t xml:space="preserve">b-</w:t>
+      </w:r>
+      <w:r>
+        <w:t xml:space="preserve"> </w:t>
+      </w:r>
+      <w:r>
+        <w:t xml:space="preserve">is 3 of 22 in the Later Han</w:t>
+      </w:r>
+      <w:r>
+        <w:t xml:space="preserve"> </w:t>
+      </w:r>
+      <w:r>
+        <w:t xml:space="preserve">layer, 13.6% (§8.1). One character covering two source syllables, with a written stop coda doing</w:t>
+      </w:r>
+      <w:r>
+        <w:t xml:space="preserve"> </w:t>
+      </w:r>
+      <w:r>
+        <w:t xml:space="preserve">the compressing, occurs only in 47 of the 1,017 verified pairs:</w:t>
+      </w:r>
+      <w:r>
+        <w:t xml:space="preserve"> </w:t>
+      </w:r>
+      <w:r>
+        <w:t xml:space="preserve">竭</w:t>
+      </w:r>
+      <w:r>
+        <w:t xml:space="preserve"> </w:t>
+      </w:r>
+      <w:r>
+        <w:t xml:space="preserve">for</w:t>
+      </w:r>
+      <w:r>
+        <w:t xml:space="preserve"> </w:t>
+      </w:r>
+      <w:r>
+        <w:rPr>
+          <w:iCs/>
+          <w:i/>
+        </w:rPr>
+        <w:t xml:space="preserve">-gata</w:t>
+      </w:r>
+      <w:r>
+        <w:t xml:space="preserve"> </w:t>
+      </w:r>
+      <w:r>
+        <w:t xml:space="preserve">in</w:t>
+      </w:r>
+      <w:r>
+        <w:t xml:space="preserve"> </w:t>
+      </w:r>
+      <w:r>
+        <w:rPr>
+          <w:iCs/>
+          <w:i/>
+        </w:rPr>
+        <w:t xml:space="preserve">tathāgata</w:t>
+      </w:r>
+      <w:r>
+        <w:t xml:space="preserve">,</w:t>
+      </w:r>
+      <w:r>
+        <w:t xml:space="preserve"> </w:t>
+      </w:r>
+      <w:r>
+        <w:t xml:space="preserve">薩</w:t>
+      </w:r>
+      <w:r>
+        <w:t xml:space="preserve"> </w:t>
+      </w:r>
+      <w:r>
+        <w:t xml:space="preserve">for</w:t>
+      </w:r>
+      <w:r>
+        <w:t xml:space="preserve"> </w:t>
+      </w:r>
+      <w:r>
+        <w:rPr>
+          <w:iCs/>
+          <w:i/>
+        </w:rPr>
+        <w:t xml:space="preserve">-sattva</w:t>
+      </w:r>
+      <w:r>
+        <w:t xml:space="preserve"> </w:t>
+      </w:r>
+      <w:r>
+        <w:t xml:space="preserve">in</w:t>
+      </w:r>
+      <w:r>
+        <w:t xml:space="preserve"> </w:t>
+      </w:r>
+      <w:r>
+        <w:rPr>
+          <w:iCs/>
+          <w:i/>
+        </w:rPr>
+        <w:t xml:space="preserve">mahāsattva</w:t>
+      </w:r>
+      <w:r>
+        <w:t xml:space="preserve">,</w:t>
+      </w:r>
+      <w:r>
+        <w:t xml:space="preserve"> </w:t>
+      </w:r>
+      <w:r>
+        <w:t xml:space="preserve">弗</w:t>
+      </w:r>
+      <w:r>
+        <w:t xml:space="preserve"> </w:t>
+      </w:r>
+      <w:r>
+        <w:t xml:space="preserve">for</w:t>
+      </w:r>
+      <w:r>
+        <w:t xml:space="preserve"> </w:t>
+      </w:r>
+      <w:r>
+        <w:rPr>
+          <w:iCs/>
+          <w:i/>
+        </w:rPr>
+        <w:t xml:space="preserve">-putra</w:t>
+      </w:r>
+      <w:r>
+        <w:t xml:space="preserve"> </w:t>
+      </w:r>
+      <w:r>
+        <w:t xml:space="preserve">in</w:t>
+      </w:r>
+      <w:r>
+        <w:t xml:space="preserve"> </w:t>
+      </w:r>
+      <w:r>
+        <w:rPr>
+          <w:iCs/>
+          <w:i/>
+        </w:rPr>
+        <w:t xml:space="preserve">śāriputra</w:t>
+      </w:r>
+      <w:r>
+        <w:t xml:space="preserve">.</w:t>
       </w:r>
       <w:r>
         <w:t xml:space="preserve"> </w:t>
@@ -10041,52 +11111,23 @@
         <w:t xml:space="preserve"> </w:t>
       </w:r>
       <w:r>
-        <w:t xml:space="preserve">and the</w:t>
-      </w:r>
-      <w:r>
-        <w:t xml:space="preserve"> </w:t>
-      </w:r>
-      <w:r>
-        <w:t xml:space="preserve">-n</w:t>
-      </w:r>
-      <w:r>
-        <w:t xml:space="preserve"> </w:t>
-      </w:r>
-      <w:r>
-        <w:t xml:space="preserve">of</w:t>
-      </w:r>
-      <w:r>
-        <w:t xml:space="preserve"> </w:t>
-      </w:r>
-      <w:r>
-        <w:t xml:space="preserve">頓</w:t>
-      </w:r>
-      <w:r>
-        <w:t xml:space="preserve"> </w:t>
-      </w:r>
-      <w:r>
-        <w:t xml:space="preserve">are on the page and must correspond</w:t>
-      </w:r>
-      <w:r>
-        <w:t xml:space="preserve"> </w:t>
-      </w:r>
-      <w:r>
-        <w:t xml:space="preserve">to something. The frame is therefore</w:t>
-      </w:r>
-      <w:r>
-        <w:t xml:space="preserve"> </w:t>
-      </w:r>
-      <w:r>
-        <w:t xml:space="preserve">b/m, k/g, t/d, n</w:t>
-      </w:r>
-      <w:r>
-        <w:t xml:space="preserve">: four consonants,</w:t>
-      </w:r>
-      <w:r>
-        <w:t xml:space="preserve"> </w:t>
-      </w:r>
-      <w:r>
-        <w:t xml:space="preserve">ending in a nasal.</w:t>
+        <w:t xml:space="preserve">for</w:t>
+      </w:r>
+      <w:r>
+        <w:t xml:space="preserve"> </w:t>
+      </w:r>
+      <w:r>
+        <w:rPr>
+          <w:iCs/>
+          <w:i/>
+        </w:rPr>
+        <w:t xml:space="preserve">bögü</w:t>
+      </w:r>
+      <w:r>
+        <w:t xml:space="preserve"> </w:t>
+      </w:r>
+      <w:r>
+        <w:t xml:space="preserve">is that same shape.</w:t>
       </w:r>
     </w:p>
     <w:p>
@@ -10098,185 +11139,208 @@
           <w:bCs/>
           <w:b/>
         </w:rPr>
-        <w:t xml:space="preserve">The first character has a documented Turkic value.</w:t>
-      </w:r>
-      <w:r>
-        <w:t xml:space="preserve"> </w:t>
-      </w:r>
-      <w:r>
-        <w:t xml:space="preserve">This is not an inference</w:t>
-      </w:r>
-      <w:r>
-        <w:t xml:space="preserve"> </w:t>
-      </w:r>
-      <w:r>
-        <w:t xml:space="preserve">from a rate. In the Later Han table</w:t>
-      </w:r>
-      <w:r>
-        <w:t xml:space="preserve"> </w:t>
-      </w:r>
-      <w:r>
-        <w:t xml:space="preserve">冒</w:t>
-      </w:r>
-      <w:r>
-        <w:t xml:space="preserve"> </w:t>
-      </w:r>
-      <w:r>
-        <w:t xml:space="preserve">and</w:t>
-      </w:r>
-      <w:r>
-        <w:t xml:space="preserve"> </w:t>
-      </w:r>
-      <w:r>
-        <w:t xml:space="preserve">默</w:t>
-      </w:r>
-      <w:r>
-        <w:t xml:space="preserve"> </w:t>
-      </w:r>
-      <w:r>
-        <w:t xml:space="preserve">have the</w:t>
-      </w:r>
-      <w:r>
-        <w:t xml:space="preserve"> </w:t>
-      </w:r>
-      <w:r>
-        <w:rPr>
-          <w:iCs/>
-          <w:i/>
-        </w:rPr>
-        <w:t xml:space="preserve">same</w:t>
-      </w:r>
-      <w:r>
-        <w:t xml:space="preserve"> </w:t>
-      </w:r>
-      <w:r>
-        <w:t xml:space="preserve">reading,</w:t>
-      </w:r>
-      <w:r>
-        <w:t xml:space="preserve"> </w:t>
-      </w:r>
-      <w:r>
-        <w:t xml:space="preserve">mək</w:t>
-      </w:r>
-      <w:r>
-        <w:t xml:space="preserve">. And</w:t>
-      </w:r>
-      <w:r>
-        <w:t xml:space="preserve"> </w:t>
-      </w:r>
-      <w:r>
-        <w:t xml:space="preserve">默</w:t>
-      </w:r>
-      <w:r>
-        <w:t xml:space="preserve">啜</w:t>
-      </w:r>
-      <w:r>
-        <w:t xml:space="preserve">, the personal name of the Türk ruler known</w:t>
-      </w:r>
-      <w:r>
-        <w:t xml:space="preserve"> </w:t>
-      </w:r>
-      <w:r>
-        <w:t xml:space="preserve">in the inscriptions as Qapaghan Qaghan, is read</w:t>
-      </w:r>
-      <w:r>
-        <w:t xml:space="preserve"> </w:t>
-      </w:r>
-      <w:r>
-        <w:rPr>
-          <w:iCs/>
-          <w:i/>
-        </w:rPr>
-        <w:t xml:space="preserve">Bögü-Çor</w:t>
-      </w:r>
-      <w:r>
-        <w:t xml:space="preserve">. So that exact Later Han syllable</w:t>
-      </w:r>
-      <w:r>
-        <w:t xml:space="preserve"> </w:t>
-      </w:r>
-      <w:r>
-        <w:t xml:space="preserve">is on record writing</w:t>
-      </w:r>
-      <w:r>
-        <w:t xml:space="preserve"> </w:t>
-      </w:r>
-      <w:r>
-        <w:rPr>
-          <w:iCs/>
-          <w:i/>
-        </w:rPr>
-        <w:t xml:space="preserve">bögü</w:t>
-      </w:r>
-      <w:r>
-        <w:t xml:space="preserve"> </w:t>
-      </w:r>
-      <w:r>
-        <w:t xml:space="preserve">in a Turkic ruler's name: the</w:t>
-      </w:r>
-      <w:r>
-        <w:t xml:space="preserve"> </w:t>
-      </w:r>
-      <w:r>
-        <w:t xml:space="preserve">m-</w:t>
-      </w:r>
-      <w:r>
-        <w:t xml:space="preserve"> </w:t>
-      </w:r>
-      <w:r>
-        <w:t xml:space="preserve">standing for the source</w:t>
-      </w:r>
-      <w:r>
-        <w:t xml:space="preserve"> </w:t>
-      </w:r>
-      <w:r>
-        <w:t xml:space="preserve">b-</w:t>
-      </w:r>
-      <w:r>
-        <w:t xml:space="preserve">, the written</w:t>
-      </w:r>
-      <w:r>
-        <w:t xml:space="preserve"> </w:t>
-      </w:r>
-      <w:r>
-        <w:t xml:space="preserve">-k</w:t>
-      </w:r>
-      <w:r>
-        <w:t xml:space="preserve"> </w:t>
-      </w:r>
-      <w:r>
-        <w:t xml:space="preserve">standing for the source</w:t>
-      </w:r>
-      <w:r>
-        <w:t xml:space="preserve"> </w:t>
-      </w:r>
-      <w:r>
-        <w:t xml:space="preserve">g</w:t>
-      </w:r>
-      <w:r>
-        <w:t xml:space="preserve">, and the final vowel of</w:t>
-      </w:r>
-      <w:r>
-        <w:t xml:space="preserve"> </w:t>
-      </w:r>
-      <w:r>
-        <w:rPr>
-          <w:iCs/>
-          <w:i/>
-        </w:rPr>
-        <w:t xml:space="preserve">bögü</w:t>
-      </w:r>
-      <w:r>
-        <w:t xml:space="preserve"> </w:t>
-      </w:r>
-      <w:r>
-        <w:t xml:space="preserve">not</w:t>
-      </w:r>
-      <w:r>
-        <w:t xml:space="preserve"> </w:t>
-      </w:r>
-      <w:r>
-        <w:t xml:space="preserve">written at all.</w:t>
+        <w:t xml:space="preserve">The second character decides the name, and it has two readings.</w:t>
+      </w:r>
+      <w:r>
+        <w:t xml:space="preserve"> </w:t>
+      </w:r>
+      <w:r>
+        <w:t xml:space="preserve">On</w:t>
+      </w:r>
+      <w:r>
+        <w:t xml:space="preserve"> </w:t>
+      </w:r>
+      <w:r>
+        <w:t xml:space="preserve">tuənᶜ</w:t>
+      </w:r>
+      <w:r>
+        <w:t xml:space="preserve"> </w:t>
+      </w:r>
+      <w:r>
+        <w:t xml:space="preserve">the frame ends in a nasal. The two lexicons then supply</w:t>
+      </w:r>
+      <w:r>
+        <w:t xml:space="preserve"> </w:t>
+      </w:r>
+      <w:r>
+        <w:rPr>
+          <w:iCs/>
+          <w:i/>
+        </w:rPr>
+        <w:t xml:space="preserve">tın</w:t>
+      </w:r>
+      <w:r>
+        <w:t xml:space="preserve"> </w:t>
+      </w:r>
+      <w:r>
+        <w:t xml:space="preserve">"spirit, breath" (Codex</w:t>
+      </w:r>
+      <w:r>
+        <w:t xml:space="preserve"> </w:t>
+      </w:r>
+      <w:r>
+        <w:rPr>
+          <w:iCs/>
+          <w:i/>
+        </w:rPr>
+        <w:t xml:space="preserve">Tin</w:t>
+      </w:r>
+      <w:r>
+        <w:t xml:space="preserve">,</w:t>
+      </w:r>
+      <w:r>
+        <w:t xml:space="preserve"> </w:t>
+      </w:r>
+      <w:r>
+        <w:rPr>
+          <w:iCs/>
+          <w:i/>
+        </w:rPr>
+        <w:t xml:space="preserve">anima</w:t>
+      </w:r>
+      <w:r>
+        <w:t xml:space="preserve">),</w:t>
+      </w:r>
+      <w:r>
+        <w:t xml:space="preserve"> </w:t>
+      </w:r>
+      <w:r>
+        <w:rPr>
+          <w:iCs/>
+          <w:i/>
+        </w:rPr>
+        <w:t xml:space="preserve">tün</w:t>
+      </w:r>
+      <w:r>
+        <w:t xml:space="preserve"> </w:t>
+      </w:r>
+      <w:r>
+        <w:t xml:space="preserve">"night" (Codex</w:t>
+      </w:r>
+      <w:r>
+        <w:t xml:space="preserve"> </w:t>
+      </w:r>
+      <w:r>
+        <w:rPr>
+          <w:iCs/>
+          <w:i/>
+        </w:rPr>
+        <w:t xml:space="preserve">Tun</w:t>
+      </w:r>
+      <w:r>
+        <w:t xml:space="preserve">,</w:t>
+      </w:r>
+      <w:r>
+        <w:t xml:space="preserve"> </w:t>
+      </w:r>
+      <w:r>
+        <w:rPr>
+          <w:iCs/>
+          <w:i/>
+        </w:rPr>
+        <w:t xml:space="preserve">nox</w:t>
+      </w:r>
+      <w:r>
+        <w:t xml:space="preserve">),</w:t>
+      </w:r>
+      <w:r>
+        <w:t xml:space="preserve"> </w:t>
+      </w:r>
+      <w:r>
+        <w:rPr>
+          <w:iCs/>
+          <w:i/>
+        </w:rPr>
+        <w:t xml:space="preserve">tan</w:t>
+      </w:r>
+      <w:r>
+        <w:t xml:space="preserve"> </w:t>
+      </w:r>
+      <w:r>
+        <w:t xml:space="preserve">"dawn" and</w:t>
+      </w:r>
+      <w:r>
+        <w:t xml:space="preserve"> </w:t>
+      </w:r>
+      <w:r>
+        <w:rPr>
+          <w:iCs/>
+          <w:i/>
+        </w:rPr>
+        <w:t xml:space="preserve">tun</w:t>
+      </w:r>
+      <w:r>
+        <w:t xml:space="preserve"> </w:t>
+      </w:r>
+      <w:r>
+        <w:t xml:space="preserve">"rest", every one of them</w:t>
+      </w:r>
+      <w:r>
+        <w:t xml:space="preserve"> </w:t>
+      </w:r>
+      <w:r>
+        <w:t xml:space="preserve">matching with nothing inserted and nothing discarded, and the name reads</w:t>
+      </w:r>
+      <w:r>
+        <w:t xml:space="preserve"> </w:t>
+      </w:r>
+      <w:r>
+        <w:rPr>
+          <w:iCs/>
+          <w:i/>
+          <w:bCs/>
+          <w:b/>
+        </w:rPr>
+        <w:t xml:space="preserve">Bögü Tın</w:t>
+      </w:r>
+      <w:r>
+        <w:t xml:space="preserve">, "sage spirit". On that branch</w:t>
+      </w:r>
+      <w:r>
+        <w:t xml:space="preserve"> </w:t>
+      </w:r>
+      <w:r>
+        <w:rPr>
+          <w:iCs/>
+          <w:i/>
+        </w:rPr>
+        <w:t xml:space="preserve">Baγatur</w:t>
+      </w:r>
+      <w:r>
+        <w:t xml:space="preserve">, the field's</w:t>
+      </w:r>
+      <w:r>
+        <w:t xml:space="preserve"> </w:t>
+      </w:r>
+      <w:r>
+        <w:t xml:space="preserve">answer for a century, fails on the one point such a frame decides cleanly: it ends in</w:t>
+      </w:r>
+      <w:r>
+        <w:t xml:space="preserve"> </w:t>
+      </w:r>
+      <w:r>
+        <w:t xml:space="preserve">-r</w:t>
+      </w:r>
+      <w:r>
+        <w:t xml:space="preserve"> </w:t>
+      </w:r>
+      <w:r>
+        <w:t xml:space="preserve">against a written</w:t>
+      </w:r>
+      <w:r>
+        <w:t xml:space="preserve"> </w:t>
+      </w:r>
+      <w:r>
+        <w:t xml:space="preserve">-n</w:t>
+      </w:r>
+      <w:r>
+        <w:t xml:space="preserve">, a spelling that occurs</w:t>
+      </w:r>
+      <w:r>
+        <w:t xml:space="preserve"> </w:t>
+      </w:r>
+      <w:r>
+        <w:t xml:space="preserve">once in 37 opportunities.</w:t>
       </w:r>
     </w:p>
     <w:p>
@@ -10284,204 +11348,166 @@
         <w:pStyle w:val="BodyText"/>
       </w:pPr>
       <w:r>
+        <w:t xml:space="preserve">On</w:t>
+      </w:r>
+      <w:r>
+        <w:t xml:space="preserve"> </w:t>
+      </w:r>
+      <w:r>
+        <w:t xml:space="preserve">tuət</w:t>
+      </w:r>
+      <w:r>
+        <w:t xml:space="preserve"> </w:t>
+      </w:r>
+      <w:r>
+        <w:t xml:space="preserve">the frame ends in a stop, and both verdicts reverse. A source</w:t>
+      </w:r>
+      <w:r>
+        <w:t xml:space="preserve"> </w:t>
+      </w:r>
+      <w:r>
+        <w:t xml:space="preserve">syllable in</w:t>
+      </w:r>
+      <w:r>
+        <w:t xml:space="preserve"> </w:t>
+      </w:r>
+      <w:r>
+        <w:t xml:space="preserve">-r</w:t>
+      </w:r>
+      <w:r>
+        <w:t xml:space="preserve"> </w:t>
+      </w:r>
+      <w:r>
+        <w:t xml:space="preserve">is written with a</w:t>
+      </w:r>
+      <w:r>
+        <w:t xml:space="preserve"> </w:t>
+      </w:r>
+      <w:r>
+        <w:t xml:space="preserve">-t</w:t>
+      </w:r>
+      <w:r>
+        <w:t xml:space="preserve"> </w:t>
+      </w:r>
+      <w:r>
+        <w:t xml:space="preserve">coda in 14</w:t>
+      </w:r>
+      <w:r>
+        <w:t xml:space="preserve"> </w:t>
+      </w:r>
+      <w:r>
+        <w:t xml:space="preserve">of those same 37 opportunities, 38%, so</w:t>
+      </w:r>
+      <w:r>
+        <w:t xml:space="preserve"> </w:t>
+      </w:r>
+      <w:r>
+        <w:rPr>
+          <w:iCs/>
+          <w:i/>
+        </w:rPr>
+        <w:t xml:space="preserve">Baγatur</w:t>
+      </w:r>
+      <w:r>
+        <w:t xml:space="preserve"> </w:t>
+      </w:r>
+      <w:r>
+        <w:t xml:space="preserve">is not merely permitted but ordinary. And</w:t>
+      </w:r>
+      <w:r>
+        <w:t xml:space="preserve"> </w:t>
+      </w:r>
+      <w:r>
+        <w:t xml:space="preserve">our own second element becomes</w:t>
+      </w:r>
+      <w:r>
+        <w:t xml:space="preserve"> </w:t>
+      </w:r>
+      <w:r>
+        <w:rPr>
+          <w:iCs/>
+          <w:i/>
+        </w:rPr>
+        <w:t xml:space="preserve">tut</w:t>
+      </w:r>
+      <w:r>
+        <w:t xml:space="preserve"> </w:t>
+      </w:r>
+      <w:r>
+        <w:t xml:space="preserve">rather than</w:t>
+      </w:r>
+      <w:r>
+        <w:t xml:space="preserve"> </w:t>
+      </w:r>
+      <w:r>
+        <w:rPr>
+          <w:iCs/>
+          <w:i/>
+        </w:rPr>
+        <w:t xml:space="preserve">tın</w:t>
+      </w:r>
+      <w:r>
+        <w:t xml:space="preserve">, which the lexicons do not</w:t>
+      </w:r>
+      <w:r>
+        <w:t xml:space="preserve"> </w:t>
+      </w:r>
+      <w:r>
+        <w:t xml:space="preserve">support in the same way.</w:t>
+      </w:r>
+    </w:p>
+    <w:p>
+      <w:pPr>
+        <w:pStyle w:val="BodyText"/>
+      </w:pPr>
+      <w:r>
         <w:rPr>
           <w:bCs/>
           <w:b/>
         </w:rPr>
-        <w:t xml:space="preserve">Each step of that is separately licensed by the corpora.</w:t>
-      </w:r>
-      <w:r>
-        <w:t xml:space="preserve"> </w:t>
-      </w:r>
-      <w:r>
-        <w:t xml:space="preserve">The</w:t>
-      </w:r>
-      <w:r>
-        <w:t xml:space="preserve"> </w:t>
-      </w:r>
-      <w:r>
-        <w:t xml:space="preserve">m-</w:t>
-      </w:r>
-      <w:r>
-        <w:t xml:space="preserve"> </w:t>
-      </w:r>
-      <w:r>
-        <w:t xml:space="preserve">for a source</w:t>
-      </w:r>
-      <w:r>
-        <w:t xml:space="preserve"> </w:t>
-      </w:r>
-      <w:r>
-        <w:t xml:space="preserve">b-</w:t>
-      </w:r>
-      <w:r>
-        <w:t xml:space="preserve"> </w:t>
-      </w:r>
-      <w:r>
-        <w:t xml:space="preserve">is 3 of 22 in the Later Han</w:t>
-      </w:r>
-      <w:r>
-        <w:t xml:space="preserve"> </w:t>
-      </w:r>
-      <w:r>
-        <w:t xml:space="preserve">layer, 13.6% (§8.1). One character covering two source syllables, with a written stop coda doing</w:t>
-      </w:r>
-      <w:r>
-        <w:t xml:space="preserve"> </w:t>
-      </w:r>
-      <w:r>
-        <w:t xml:space="preserve">the compressing, occurs only in 47 of the 1,017 verified pairs:</w:t>
-      </w:r>
-      <w:r>
-        <w:t xml:space="preserve"> </w:t>
-      </w:r>
-      <w:r>
-        <w:t xml:space="preserve">竭</w:t>
-      </w:r>
-      <w:r>
-        <w:t xml:space="preserve"> </w:t>
-      </w:r>
-      <w:r>
-        <w:t xml:space="preserve">for</w:t>
-      </w:r>
-      <w:r>
-        <w:t xml:space="preserve"> </w:t>
-      </w:r>
-      <w:r>
-        <w:rPr>
-          <w:iCs/>
-          <w:i/>
-        </w:rPr>
-        <w:t xml:space="preserve">-gata</w:t>
-      </w:r>
-      <w:r>
-        <w:t xml:space="preserve"> </w:t>
-      </w:r>
-      <w:r>
-        <w:t xml:space="preserve">in</w:t>
-      </w:r>
-      <w:r>
-        <w:t xml:space="preserve"> </w:t>
-      </w:r>
-      <w:r>
-        <w:rPr>
-          <w:iCs/>
-          <w:i/>
-        </w:rPr>
-        <w:t xml:space="preserve">tathāgata</w:t>
-      </w:r>
-      <w:r>
-        <w:t xml:space="preserve">,</w:t>
-      </w:r>
-      <w:r>
-        <w:t xml:space="preserve"> </w:t>
-      </w:r>
-      <w:r>
-        <w:t xml:space="preserve">薩</w:t>
-      </w:r>
-      <w:r>
-        <w:t xml:space="preserve"> </w:t>
-      </w:r>
-      <w:r>
-        <w:t xml:space="preserve">for</w:t>
-      </w:r>
-      <w:r>
-        <w:t xml:space="preserve"> </w:t>
-      </w:r>
-      <w:r>
-        <w:rPr>
-          <w:iCs/>
-          <w:i/>
-        </w:rPr>
-        <w:t xml:space="preserve">-sattva</w:t>
-      </w:r>
-      <w:r>
-        <w:t xml:space="preserve"> </w:t>
-      </w:r>
-      <w:r>
-        <w:t xml:space="preserve">in</w:t>
-      </w:r>
-      <w:r>
-        <w:t xml:space="preserve"> </w:t>
-      </w:r>
-      <w:r>
-        <w:rPr>
-          <w:iCs/>
-          <w:i/>
-        </w:rPr>
-        <w:t xml:space="preserve">mahāsattva</w:t>
-      </w:r>
-      <w:r>
-        <w:t xml:space="preserve">,</w:t>
-      </w:r>
-      <w:r>
-        <w:t xml:space="preserve"> </w:t>
-      </w:r>
-      <w:r>
-        <w:t xml:space="preserve">弗</w:t>
-      </w:r>
-      <w:r>
-        <w:t xml:space="preserve"> </w:t>
-      </w:r>
-      <w:r>
-        <w:t xml:space="preserve">for</w:t>
-      </w:r>
-      <w:r>
-        <w:t xml:space="preserve"> </w:t>
-      </w:r>
-      <w:r>
-        <w:rPr>
-          <w:iCs/>
-          <w:i/>
-        </w:rPr>
-        <w:t xml:space="preserve">-putra</w:t>
-      </w:r>
-      <w:r>
-        <w:t xml:space="preserve"> </w:t>
-      </w:r>
-      <w:r>
-        <w:t xml:space="preserve">in</w:t>
-      </w:r>
-      <w:r>
-        <w:t xml:space="preserve"> </w:t>
-      </w:r>
-      <w:r>
-        <w:rPr>
-          <w:iCs/>
-          <w:i/>
-        </w:rPr>
-        <w:t xml:space="preserve">śāriputra</w:t>
-      </w:r>
-      <w:r>
-        <w:t xml:space="preserve">.</w:t>
-      </w:r>
-      <w:r>
-        <w:t xml:space="preserve"> </w:t>
-      </w:r>
-      <w:r>
-        <w:t xml:space="preserve">冒</w:t>
-      </w:r>
-      <w:r>
-        <w:t xml:space="preserve"> </w:t>
-      </w:r>
-      <w:r>
-        <w:t xml:space="preserve">for</w:t>
-      </w:r>
-      <w:r>
-        <w:t xml:space="preserve"> </w:t>
-      </w:r>
-      <w:r>
-        <w:rPr>
-          <w:iCs/>
-          <w:i/>
-        </w:rPr>
-        <w:t xml:space="preserve">bögü</w:t>
-      </w:r>
-      <w:r>
-        <w:t xml:space="preserve"> </w:t>
-      </w:r>
-      <w:r>
-        <w:t xml:space="preserve">is that same shape.</w:t>
+        <w:t xml:space="preserve">The disagreement is smaller than it looks, and it is not phonological.</w:t>
+      </w:r>
+      <w:r>
+        <w:t xml:space="preserve"> </w:t>
+      </w:r>
+      <w:r>
+        <w:t xml:space="preserve">Two</w:t>
+      </w:r>
+      <w:r>
+        <w:t xml:space="preserve"> </w:t>
+      </w:r>
+      <w:r>
+        <w:t xml:space="preserve">readings of the founder's name have stood against each other for a century. They do not rest on</w:t>
+      </w:r>
+      <w:r>
+        <w:t xml:space="preserve"> </w:t>
+      </w:r>
+      <w:r>
+        <w:t xml:space="preserve">different views of Later Han phonology, of what a Chinese scribe would do, or of Turkic word</w:t>
+      </w:r>
+      <w:r>
+        <w:t xml:space="preserve"> </w:t>
+      </w:r>
+      <w:r>
+        <w:t xml:space="preserve">formation. They rest on which of two rows of Schuessler's table is taken for one character, and</w:t>
+      </w:r>
+      <w:r>
+        <w:t xml:space="preserve"> </w:t>
+      </w:r>
+      <w:r>
+        <w:t xml:space="preserve">the transcription evidence cannot choose between them, because both rows describe the same</w:t>
+      </w:r>
+      <w:r>
+        <w:t xml:space="preserve"> </w:t>
+      </w:r>
+      <w:r>
+        <w:t xml:space="preserve">character on the same page. What the channel contributes here is not a reading but the location</w:t>
+      </w:r>
+      <w:r>
+        <w:t xml:space="preserve"> </w:t>
+      </w:r>
+      <w:r>
+        <w:t xml:space="preserve">of the disagreement.</w:t>
       </w:r>
     </w:p>
     <w:p>
@@ -10489,11 +11515,241 @@
         <w:pStyle w:val="BodyText"/>
       </w:pPr>
       <w:r>
+        <w:t xml:space="preserve">The conventional pronunciation of the compound,</w:t>
+      </w:r>
+      <w:r>
+        <w:t xml:space="preserve"> </w:t>
+      </w:r>
+      <w:r>
+        <w:rPr>
+          <w:iCs/>
+          <w:i/>
+        </w:rPr>
+        <w:t xml:space="preserve">Mòdú</w:t>
+      </w:r>
+      <w:r>
+        <w:t xml:space="preserve">, points to the stop rather than</w:t>
+      </w:r>
+      <w:r>
+        <w:t xml:space="preserve"> </w:t>
+      </w:r>
+      <w:r>
+        <w:t xml:space="preserve">the nasal, which favours</w:t>
+      </w:r>
+      <w:r>
+        <w:t xml:space="preserve"> </w:t>
+      </w:r>
+      <w:r>
+        <w:rPr>
+          <w:iCs/>
+          <w:i/>
+        </w:rPr>
+        <w:t xml:space="preserve">Baγatur</w:t>
+      </w:r>
+      <w:r>
+        <w:t xml:space="preserve">, and we record that rather than passing over it. It is</w:t>
+      </w:r>
+      <w:r>
+        <w:t xml:space="preserve"> </w:t>
+      </w:r>
+      <w:r>
+        <w:t xml:space="preserve">a reading tradition rather than a measurement, and it is not ours to adjudicate.</w:t>
+      </w:r>
+    </w:p>
+    <w:p>
+      <w:pPr>
+        <w:pStyle w:val="BodyText"/>
+      </w:pPr>
+      <w:r>
         <w:rPr>
           <w:bCs/>
           <w:b/>
         </w:rPr>
-        <w:t xml:space="preserve">The second character has attested candidates and needs no license at all.</w:t>
+        <w:t xml:space="preserve">Measured against the standard of §9,</w:t>
+      </w:r>
+      <w:r>
+        <w:t xml:space="preserve"> </w:t>
+      </w:r>
+      <w:r>
+        <w:t xml:space="preserve">and on the</w:t>
+      </w:r>
+      <w:r>
+        <w:t xml:space="preserve"> </w:t>
+      </w:r>
+      <w:r>
+        <w:t xml:space="preserve">tuənᶜ</w:t>
+      </w:r>
+      <w:r>
+        <w:t xml:space="preserve"> </w:t>
+      </w:r>
+      <w:r>
+        <w:t xml:space="preserve">branch only: the sense of both elements of</w:t>
+      </w:r>
+      <w:r>
+        <w:t xml:space="preserve"> </w:t>
+      </w:r>
+      <w:r>
+        <w:rPr>
+          <w:iCs/>
+          <w:i/>
+        </w:rPr>
+        <w:t xml:space="preserve">Bögü Tın</w:t>
+      </w:r>
+      <w:r>
+        <w:t xml:space="preserve"> </w:t>
+      </w:r>
+      <w:r>
+        <w:t xml:space="preserve">is</w:t>
+      </w:r>
+      <w:r>
+        <w:t xml:space="preserve"> </w:t>
+      </w:r>
+      <w:r>
+        <w:t xml:space="preserve">attested independently of any Chinese source; the morphology is the commonest Turkic name shape,</w:t>
+      </w:r>
+      <w:r>
+        <w:t xml:space="preserve"> </w:t>
+      </w:r>
+      <w:r>
+        <w:t xml:space="preserve">two nouns in apposition, as in Alp Arslan or</w:t>
+      </w:r>
+      <w:r>
+        <w:t xml:space="preserve"> </w:t>
+      </w:r>
+      <w:r>
+        <w:rPr>
+          <w:iCs/>
+          <w:i/>
+        </w:rPr>
+        <w:t xml:space="preserve">Bögü-Çor</w:t>
+      </w:r>
+      <w:r>
+        <w:t xml:space="preserve"> </w:t>
+      </w:r>
+      <w:r>
+        <w:t xml:space="preserve">itself; and the objection that</w:t>
+      </w:r>
+      <w:r>
+        <w:t xml:space="preserve"> </w:t>
+      </w:r>
+      <w:r>
+        <w:t xml:space="preserve">would have killed it, a Chinese</w:t>
+      </w:r>
+      <w:r>
+        <w:t xml:space="preserve"> </w:t>
+      </w:r>
+      <w:r>
+        <w:t xml:space="preserve">m-</w:t>
+      </w:r>
+      <w:r>
+        <w:t xml:space="preserve"> </w:t>
+      </w:r>
+      <w:r>
+        <w:t xml:space="preserve">for a foreign</w:t>
+      </w:r>
+      <w:r>
+        <w:t xml:space="preserve"> </w:t>
+      </w:r>
+      <w:r>
+        <w:t xml:space="preserve">b-</w:t>
+      </w:r>
+      <w:r>
+        <w:t xml:space="preserve">, was measured and dissolved rather than asserted away. What remains</w:t>
+      </w:r>
+      <w:r>
+        <w:t xml:space="preserve"> </w:t>
+      </w:r>
+      <w:r>
+        <w:t xml:space="preserve">unexplained is stated: the compound</w:t>
+      </w:r>
+      <w:r>
+        <w:t xml:space="preserve"> </w:t>
+      </w:r>
+      <w:r>
+        <w:rPr>
+          <w:iCs/>
+          <w:i/>
+        </w:rPr>
+        <w:t xml:space="preserve">bögü tın</w:t>
+      </w:r>
+      <w:r>
+        <w:t xml:space="preserve"> </w:t>
+      </w:r>
+      <w:r>
+        <w:t xml:space="preserve">is not itself attested, only its two halves;</w:t>
+      </w:r>
+      <w:r>
+        <w:t xml:space="preserve"> </w:t>
+      </w:r>
+      <w:r>
+        <w:t xml:space="preserve">the vowel of the second element is not recoverable, so</w:t>
+      </w:r>
+      <w:r>
+        <w:t xml:space="preserve"> </w:t>
+      </w:r>
+      <w:r>
+        <w:rPr>
+          <w:iCs/>
+          <w:i/>
+        </w:rPr>
+        <w:t xml:space="preserve">tün</w:t>
+      </w:r>
+      <w:r>
+        <w:t xml:space="preserve">,</w:t>
+      </w:r>
+      <w:r>
+        <w:t xml:space="preserve"> </w:t>
+      </w:r>
+      <w:r>
+        <w:rPr>
+          <w:iCs/>
+          <w:i/>
+        </w:rPr>
+        <w:t xml:space="preserve">tan</w:t>
+      </w:r>
+      <w:r>
+        <w:t xml:space="preserve"> </w:t>
+      </w:r>
+      <w:r>
+        <w:t xml:space="preserve">and</w:t>
+      </w:r>
+      <w:r>
+        <w:t xml:space="preserve"> </w:t>
+      </w:r>
+      <w:r>
+        <w:rPr>
+          <w:iCs/>
+          <w:i/>
+        </w:rPr>
+        <w:t xml:space="preserve">tun</w:t>
+      </w:r>
+      <w:r>
+        <w:t xml:space="preserve"> </w:t>
+      </w:r>
+      <w:r>
+        <w:t xml:space="preserve">are equally available and choosing</w:t>
+      </w:r>
+      <w:r>
+        <w:t xml:space="preserve"> </w:t>
+      </w:r>
+      <w:r>
+        <w:rPr>
+          <w:iCs/>
+          <w:i/>
+        </w:rPr>
+        <w:t xml:space="preserve">tın</w:t>
+      </w:r>
+      <w:r>
+        <w:t xml:space="preserve"> </w:t>
+      </w:r>
+      <w:r>
+        <w:t xml:space="preserve">is a semantic preference rather than a</w:t>
+      </w:r>
+      <w:r>
+        <w:t xml:space="preserve"> </w:t>
+      </w:r>
+      <w:r>
+        <w:t xml:space="preserve">phonological result; and the tone category of</w:t>
       </w:r>
       <w:r>
         <w:t xml:space="preserve"> </w:t>
@@ -10505,22 +11761,7 @@
         <w:t xml:space="preserve"> </w:t>
       </w:r>
       <w:r>
-        <w:t xml:space="preserve">tuənᶜ</w:t>
-      </w:r>
-      <w:r>
-        <w:t xml:space="preserve"> </w:t>
-      </w:r>
-      <w:r>
-        <w:t xml:space="preserve">is a dental onset with a written</w:t>
-      </w:r>
-      <w:r>
-        <w:t xml:space="preserve"> </w:t>
-      </w:r>
-      <w:r>
-        <w:t xml:space="preserve">-n</w:t>
-      </w:r>
-      <w:r>
-        <w:t xml:space="preserve">, and the two lexicons supply</w:t>
+        <w:t xml:space="preserve">is not used. We prefer</w:t>
       </w:r>
       <w:r>
         <w:t xml:space="preserve"> </w:t>
@@ -10536,113 +11777,104 @@
         <w:t xml:space="preserve"> </w:t>
       </w:r>
       <w:r>
-        <w:t xml:space="preserve">"spirit, breath" (Codex</w:t>
-      </w:r>
-      <w:r>
-        <w:t xml:space="preserve"> </w:t>
-      </w:r>
-      <w:r>
-        <w:rPr>
-          <w:iCs/>
-          <w:i/>
-        </w:rPr>
-        <w:t xml:space="preserve">Tin</w:t>
-      </w:r>
-      <w:r>
-        <w:t xml:space="preserve">,</w:t>
-      </w:r>
-      <w:r>
-        <w:t xml:space="preserve"> </w:t>
-      </w:r>
-      <w:r>
-        <w:rPr>
-          <w:iCs/>
-          <w:i/>
-        </w:rPr>
-        <w:t xml:space="preserve">anima</w:t>
-      </w:r>
-      <w:r>
-        <w:t xml:space="preserve">),</w:t>
-      </w:r>
-      <w:r>
-        <w:t xml:space="preserve"> </w:t>
-      </w:r>
-      <w:r>
-        <w:rPr>
-          <w:iCs/>
-          <w:i/>
-        </w:rPr>
-        <w:t xml:space="preserve">tün</w:t>
-      </w:r>
-      <w:r>
-        <w:t xml:space="preserve"> </w:t>
-      </w:r>
-      <w:r>
-        <w:t xml:space="preserve">"night" (Codex</w:t>
-      </w:r>
-      <w:r>
-        <w:t xml:space="preserve"> </w:t>
-      </w:r>
-      <w:r>
-        <w:rPr>
-          <w:iCs/>
-          <w:i/>
-        </w:rPr>
-        <w:t xml:space="preserve">Tun</w:t>
-      </w:r>
-      <w:r>
-        <w:t xml:space="preserve">,</w:t>
-      </w:r>
-      <w:r>
-        <w:t xml:space="preserve"> </w:t>
-      </w:r>
-      <w:r>
-        <w:rPr>
-          <w:iCs/>
-          <w:i/>
-        </w:rPr>
-        <w:t xml:space="preserve">nox</w:t>
-      </w:r>
-      <w:r>
-        <w:t xml:space="preserve">),</w:t>
-      </w:r>
-      <w:r>
-        <w:t xml:space="preserve"> </w:t>
-      </w:r>
-      <w:r>
-        <w:rPr>
-          <w:iCs/>
-          <w:i/>
-        </w:rPr>
-        <w:t xml:space="preserve">tan</w:t>
-      </w:r>
-      <w:r>
-        <w:t xml:space="preserve"> </w:t>
-      </w:r>
-      <w:r>
-        <w:t xml:space="preserve">"dawn" and</w:t>
-      </w:r>
-      <w:r>
-        <w:t xml:space="preserve"> </w:t>
-      </w:r>
-      <w:r>
-        <w:rPr>
-          <w:iCs/>
-          <w:i/>
-        </w:rPr>
-        <w:t xml:space="preserve">tun</w:t>
-      </w:r>
-      <w:r>
-        <w:t xml:space="preserve"> </w:t>
-      </w:r>
-      <w:r>
-        <w:t xml:space="preserve">"rest". Every one of them matches the frame with nothing</w:t>
-      </w:r>
-      <w:r>
-        <w:t xml:space="preserve"> </w:t>
-      </w:r>
-      <w:r>
-        <w:t xml:space="preserve">inserted and nothing discarded.</w:t>
+        <w:t xml:space="preserve">among the four because of what</w:t>
+      </w:r>
+      <w:r>
+        <w:t xml:space="preserve"> </w:t>
+      </w:r>
+      <w:r>
+        <w:rPr>
+          <w:iCs/>
+          <w:i/>
+        </w:rPr>
+        <w:t xml:space="preserve">bögü</w:t>
+      </w:r>
+      <w:r>
+        <w:t xml:space="preserve"> </w:t>
+      </w:r>
+      <w:r>
+        <w:t xml:space="preserve">is: Kāşgarî glosses it</w:t>
+      </w:r>
+      <w:r>
+        <w:t xml:space="preserve"> </w:t>
+      </w:r>
+      <w:r>
+        <w:rPr>
+          <w:iCs/>
+          <w:i/>
+        </w:rPr>
+        <w:t xml:space="preserve">bilgin, akıllı, hakim</w:t>
+      </w:r>
+      <w:r>
+        <w:t xml:space="preserve">. Clauson says the word "seems to connote both wisdom and mysterious</w:t>
+      </w:r>
+      <w:r>
+        <w:t xml:space="preserve"> </w:t>
+      </w:r>
+      <w:r>
+        <w:t xml:space="preserve">spiritual power", and it was borrowed early into Mongolian as</w:t>
+      </w:r>
+      <w:r>
+        <w:t xml:space="preserve"> </w:t>
+      </w:r>
+      <w:r>
+        <w:rPr>
+          <w:iCs/>
+          <w:i/>
+        </w:rPr>
+        <w:t xml:space="preserve">böge</w:t>
+      </w:r>
+      <w:r>
+        <w:t xml:space="preserve">, the ordinary word for</w:t>
+      </w:r>
+      <w:r>
+        <w:t xml:space="preserve"> </w:t>
+      </w:r>
+      <w:r>
+        <w:t xml:space="preserve">a shaman. It appears in regnal styles across the record:</w:t>
+      </w:r>
+      <w:r>
+        <w:t xml:space="preserve"> </w:t>
+      </w:r>
+      <w:r>
+        <w:rPr>
+          <w:iCs/>
+          <w:i/>
+        </w:rPr>
+        <w:t xml:space="preserve">Teŋri Bögü Teŋriken</w:t>
+      </w:r>
+      <w:r>
+        <w:t xml:space="preserve"> </w:t>
+      </w:r>
+      <w:r>
+        <w:t xml:space="preserve">in the Old</w:t>
+      </w:r>
+      <w:r>
+        <w:t xml:space="preserve"> </w:t>
+      </w:r>
+      <w:r>
+        <w:t xml:space="preserve">Turkic inscriptions, Bögü Qaghan of the Uyghurs (</w:t>
+      </w:r>
+      <w:r>
+        <w:t xml:space="preserve">牟羽</w:t>
+      </w:r>
+      <w:r>
+        <w:t xml:space="preserve"> </w:t>
+      </w:r>
+      <w:r>
+        <w:t xml:space="preserve">in the Chinese</w:t>
+      </w:r>
+      <w:r>
+        <w:t xml:space="preserve"> </w:t>
+      </w:r>
+      <w:r>
+        <w:t xml:space="preserve">sources), and Bögü-Çor of the Türks (</w:t>
+      </w:r>
+      <w:r>
+        <w:t xml:space="preserve">默啜</w:t>
+      </w:r>
+      <w:r>
+        <w:t xml:space="preserve">).</w:t>
       </w:r>
     </w:p>
     <w:p>
@@ -10650,200 +11882,23 @@
         <w:pStyle w:val="BodyText"/>
       </w:pPr>
       <w:r>
-        <w:t xml:space="preserve">So, we read</w:t>
-      </w:r>
-      <w:r>
-        <w:t xml:space="preserve"> </w:t>
-      </w:r>
-      <w:r>
-        <w:t xml:space="preserve">冒頓</w:t>
-      </w:r>
-      <w:r>
-        <w:t xml:space="preserve"> </w:t>
-      </w:r>
-      <w:r>
-        <w:t xml:space="preserve">as</w:t>
-      </w:r>
-      <w:r>
-        <w:t xml:space="preserve"> </w:t>
-      </w:r>
-      <w:r>
-        <w:rPr>
-          <w:iCs/>
-          <w:i/>
+        <w:t xml:space="preserve">The choice is not peculiar to this name. Across the record,</w:t>
+      </w:r>
+      <w:r>
+        <w:t xml:space="preserve"> </w:t>
+      </w:r>
+      <w:r>
+        <w:rPr>
           <w:bCs/>
           <w:b/>
         </w:rPr>
-        <w:t xml:space="preserve">Bögü Tın</w:t>
-      </w:r>
-      <w:r>
-        <w:t xml:space="preserve">, "sage spirit",</w:t>
-      </w:r>
-      <w:r>
-        <w:t xml:space="preserve"> </w:t>
-      </w:r>
-      <w:r>
-        <w:t xml:space="preserve">and prefer</w:t>
-      </w:r>
-      <w:r>
-        <w:t xml:space="preserve"> </w:t>
-      </w:r>
-      <w:r>
-        <w:rPr>
-          <w:iCs/>
-          <w:i/>
-        </w:rPr>
-        <w:t xml:space="preserve">tın</w:t>
-      </w:r>
-      <w:r>
-        <w:t xml:space="preserve"> </w:t>
-      </w:r>
-      <w:r>
-        <w:t xml:space="preserve">among the four because of what</w:t>
-      </w:r>
-      <w:r>
-        <w:t xml:space="preserve"> </w:t>
-      </w:r>
-      <w:r>
-        <w:rPr>
-          <w:iCs/>
-          <w:i/>
-        </w:rPr>
-        <w:t xml:space="preserve">bögü</w:t>
-      </w:r>
-      <w:r>
-        <w:t xml:space="preserve"> </w:t>
-      </w:r>
-      <w:r>
-        <w:t xml:space="preserve">is. Kāşgarî glosses it</w:t>
-      </w:r>
-      <w:r>
-        <w:t xml:space="preserve"> </w:t>
-      </w:r>
-      <w:r>
-        <w:rPr>
-          <w:iCs/>
-          <w:i/>
-        </w:rPr>
-        <w:t xml:space="preserve">bilgin, akıllı, hakim</w:t>
-      </w:r>
-      <w:r>
-        <w:t xml:space="preserve">. Clauson says the word "seems to connote both wisdom and mysterious</w:t>
-      </w:r>
-      <w:r>
-        <w:t xml:space="preserve"> </w:t>
-      </w:r>
-      <w:r>
-        <w:t xml:space="preserve">spiritual power", and it was borrowed early into Mongolian as</w:t>
-      </w:r>
-      <w:r>
-        <w:t xml:space="preserve"> </w:t>
-      </w:r>
-      <w:r>
-        <w:rPr>
-          <w:iCs/>
-          <w:i/>
-        </w:rPr>
-        <w:t xml:space="preserve">böge</w:t>
-      </w:r>
-      <w:r>
-        <w:t xml:space="preserve">, the ordinary word for</w:t>
-      </w:r>
-      <w:r>
-        <w:t xml:space="preserve"> </w:t>
-      </w:r>
-      <w:r>
-        <w:t xml:space="preserve">a shaman. It is used in regnal styles across the record:</w:t>
-      </w:r>
-      <w:r>
-        <w:t xml:space="preserve"> </w:t>
-      </w:r>
-      <w:r>
-        <w:rPr>
-          <w:iCs/>
-          <w:i/>
-        </w:rPr>
-        <w:t xml:space="preserve">Teŋri Bögü Teŋriken</w:t>
-      </w:r>
-      <w:r>
-        <w:t xml:space="preserve">, Bögü Qaghan</w:t>
-      </w:r>
-      <w:r>
-        <w:t xml:space="preserve"> </w:t>
-      </w:r>
-      <w:r>
-        <w:t xml:space="preserve">of the Uyghurs, Bögü-Çor of the Türks. A name pairing that word with the word for spirit is</w:t>
-      </w:r>
-      <w:r>
-        <w:t xml:space="preserve"> </w:t>
-      </w:r>
-      <w:r>
-        <w:t xml:space="preserve">coherent for the founder of a steppe confederation in a way that no dictionary lookup produced. This came out of the frame.</w:t>
-      </w:r>
-    </w:p>
-    <w:p>
-      <w:pPr>
-        <w:pStyle w:val="BodyText"/>
-      </w:pPr>
+        <w:t xml:space="preserve">46 of 107 characters</w:t>
+      </w:r>
       <w:r>
         <w:rPr>
           <w:bCs/>
           <w:b/>
         </w:rPr>
-        <w:t xml:space="preserve">Measured against the standard of §9.</w:t>
-      </w:r>
-      <w:r>
-        <w:t xml:space="preserve"> </w:t>
-      </w:r>
-      <w:r>
-        <w:t xml:space="preserve">The sense of both elements is attested</w:t>
-      </w:r>
-      <w:r>
-        <w:t xml:space="preserve"> </w:t>
-      </w:r>
-      <w:r>
-        <w:t xml:space="preserve">independently of any Chinese source. The morphology is the commonest Turkic name shape, two</w:t>
-      </w:r>
-      <w:r>
-        <w:t xml:space="preserve"> </w:t>
-      </w:r>
-      <w:r>
-        <w:t xml:space="preserve">nouns in apposition, as in Alp Arslan or Bögü-Çor itself. The objections were tested rather</w:t>
-      </w:r>
-      <w:r>
-        <w:t xml:space="preserve"> </w:t>
-      </w:r>
-      <w:r>
-        <w:t xml:space="preserve">than asserted, and the one that would have killed it, a Chinese</w:t>
-      </w:r>
-      <w:r>
-        <w:t xml:space="preserve"> </w:t>
-      </w:r>
-      <w:r>
-        <w:t xml:space="preserve">m-</w:t>
-      </w:r>
-      <w:r>
-        <w:t xml:space="preserve"> </w:t>
-      </w:r>
-      <w:r>
-        <w:t xml:space="preserve">for a foreign</w:t>
-      </w:r>
-      <w:r>
-        <w:t xml:space="preserve"> </w:t>
-      </w:r>
-      <w:r>
-        <w:t xml:space="preserve">b-</w:t>
-      </w:r>
-      <w:r>
-        <w:t xml:space="preserve">, was measured and</w:t>
-      </w:r>
-      <w:r>
-        <w:t xml:space="preserve"> </w:t>
-      </w:r>
-      <w:r>
-        <w:t xml:space="preserve">dissolved. And what remains unexplained is stated:</w:t>
-      </w:r>
-      <w:r>
         <w:t xml:space="preserve"> </w:t>
       </w:r>
       <w:r>
@@ -10851,7 +11906,7 @@
           <w:bCs/>
           <w:b/>
         </w:rPr>
-        <w:t xml:space="preserve">the compound</w:t>
+        <w:t xml:space="preserve">carry more than one Later Han reading, and in all 46 the value printed in Appendix A is the</w:t>
       </w:r>
       <w:r>
         <w:rPr>
@@ -10862,108 +11917,50 @@
       </w:r>
       <w:r>
         <w:rPr>
-          <w:iCs/>
-          <w:i/>
           <w:bCs/>
           <w:b/>
         </w:rPr>
-        <w:t xml:space="preserve">bögü tın</w:t>
-      </w:r>
-      <w:r>
-        <w:rPr>
-          <w:bCs/>
-          <w:b/>
-        </w:rPr>
-        <w:t xml:space="preserve"> </w:t>
-      </w:r>
-      <w:r>
-        <w:rPr>
-          <w:bCs/>
-          <w:b/>
-        </w:rPr>
-        <w:t xml:space="preserve">is not itself attested</w:t>
-      </w:r>
-      <w:r>
-        <w:t xml:space="preserve">, only its two halves; the vowel of the second</w:t>
-      </w:r>
-      <w:r>
-        <w:t xml:space="preserve"> </w:t>
-      </w:r>
-      <w:r>
-        <w:t xml:space="preserve">element is not recoverable, so</w:t>
-      </w:r>
-      <w:r>
-        <w:t xml:space="preserve"> </w:t>
-      </w:r>
-      <w:r>
-        <w:rPr>
-          <w:iCs/>
-          <w:i/>
-        </w:rPr>
-        <w:t xml:space="preserve">tün</w:t>
-      </w:r>
-      <w:r>
-        <w:t xml:space="preserve">,</w:t>
-      </w:r>
-      <w:r>
-        <w:t xml:space="preserve"> </w:t>
-      </w:r>
-      <w:r>
-        <w:rPr>
-          <w:iCs/>
-          <w:i/>
-        </w:rPr>
-        <w:t xml:space="preserve">tan</w:t>
-      </w:r>
-      <w:r>
-        <w:t xml:space="preserve"> </w:t>
-      </w:r>
-      <w:r>
-        <w:t xml:space="preserve">and</w:t>
-      </w:r>
-      <w:r>
-        <w:t xml:space="preserve"> </w:t>
-      </w:r>
-      <w:r>
-        <w:rPr>
-          <w:iCs/>
-          <w:i/>
-        </w:rPr>
-        <w:t xml:space="preserve">tun</w:t>
-      </w:r>
-      <w:r>
-        <w:t xml:space="preserve"> </w:t>
-      </w:r>
-      <w:r>
-        <w:t xml:space="preserve">are equally available</w:t>
-      </w:r>
-      <w:r>
-        <w:t xml:space="preserve"> </w:t>
-      </w:r>
-      <w:r>
-        <w:t xml:space="preserve">and choosing</w:t>
-      </w:r>
-      <w:r>
-        <w:t xml:space="preserve"> </w:t>
-      </w:r>
-      <w:r>
-        <w:rPr>
-          <w:iCs/>
-          <w:i/>
-        </w:rPr>
-        <w:t xml:space="preserve">tın</w:t>
-      </w:r>
-      <w:r>
-        <w:t xml:space="preserve"> </w:t>
-      </w:r>
-      <w:r>
-        <w:t xml:space="preserve">is a semantic preference rather than a phonological result; and the</w:t>
-      </w:r>
-      <w:r>
-        <w:t xml:space="preserve"> </w:t>
-      </w:r>
-      <w:r>
-        <w:t xml:space="preserve">tone category of</w:t>
+        <w:t xml:space="preserve">first row of the table</w:t>
+      </w:r>
+      <w:r>
+        <w:t xml:space="preserve"> </w:t>
+      </w:r>
+      <w:r>
+        <w:t xml:space="preserve">(§11).</w:t>
+      </w:r>
+      <w:r>
+        <w:t xml:space="preserve"> </w:t>
+      </w:r>
+      <w:r>
+        <w:t xml:space="preserve">冒頓</w:t>
+      </w:r>
+      <w:r>
+        <w:t xml:space="preserve"> </w:t>
+      </w:r>
+      <w:r>
+        <w:t xml:space="preserve">is the case where that</w:t>
+      </w:r>
+      <w:r>
+        <w:t xml:space="preserve"> </w:t>
+      </w:r>
+      <w:r>
+        <w:t xml:space="preserve">choice carries the most weight. The claim this section makes is therefore bounded:</w:t>
+      </w:r>
+      <w:r>
+        <w:t xml:space="preserve"> </w:t>
+      </w:r>
+      <w:r>
+        <w:rPr>
+          <w:iCs/>
+          <w:i/>
+        </w:rPr>
+        <w:t xml:space="preserve">Bögü Tın</w:t>
+      </w:r>
+      <w:r>
+        <w:t xml:space="preserve"> </w:t>
+      </w:r>
+      <w:r>
+        <w:t xml:space="preserve">survives every test we can apply on one of the two readings of</w:t>
       </w:r>
       <w:r>
         <w:t xml:space="preserve"> </w:t>
@@ -10972,142 +11969,19 @@
         <w:t xml:space="preserve">頓</w:t>
       </w:r>
       <w:r>
-        <w:t xml:space="preserve"> </w:t>
-      </w:r>
-      <w:r>
-        <w:t xml:space="preserve">is not used.</w:t>
-      </w:r>
-    </w:p>
-    <w:p>
-      <w:pPr>
-        <w:pStyle w:val="BodyText"/>
-      </w:pPr>
-      <w:r>
-        <w:t xml:space="preserve">In comparison,</w:t>
-      </w:r>
-      <w:r>
-        <w:t xml:space="preserve"> </w:t>
-      </w:r>
-      <w:r>
-        <w:rPr>
-          <w:iCs/>
-          <w:i/>
-        </w:rPr>
-        <w:t xml:space="preserve">Baγatur</w:t>
-      </w:r>
-      <w:r>
-        <w:t xml:space="preserve">, the field's reading for a century for</w:t>
-      </w:r>
-      <w:r>
-        <w:t xml:space="preserve"> </w:t>
-      </w:r>
-      <w:r>
-        <w:t xml:space="preserve">冒頓</w:t>
-      </w:r>
-      <w:r>
-        <w:t xml:space="preserve">, fails on the one point</w:t>
-      </w:r>
-      <w:r>
-        <w:t xml:space="preserve"> </w:t>
-      </w:r>
-      <w:r>
-        <w:t xml:space="preserve">that the corpus decides cleanly: it ends in</w:t>
-      </w:r>
-      <w:r>
-        <w:t xml:space="preserve"> </w:t>
-      </w:r>
-      <w:r>
-        <w:t xml:space="preserve">-r</w:t>
-      </w:r>
-      <w:r>
-        <w:t xml:space="preserve"> </w:t>
-      </w:r>
-      <w:r>
-        <w:t xml:space="preserve">against a written</w:t>
-      </w:r>
-      <w:r>
-        <w:t xml:space="preserve"> </w:t>
-      </w:r>
-      <w:r>
-        <w:t xml:space="preserve">-n</w:t>
-      </w:r>
-      <w:r>
-        <w:t xml:space="preserve">, a spelling that occurs once in 37 opportunities, where the scribe's</w:t>
-      </w:r>
-      <w:r>
-        <w:t xml:space="preserve"> </w:t>
-      </w:r>
-      <w:r>
-        <w:t xml:space="preserve">normal choices were an open character or a</w:t>
-      </w:r>
-      <w:r>
-        <w:t xml:space="preserve"> </w:t>
-      </w:r>
-      <w:r>
-        <w:t xml:space="preserve">-t</w:t>
-      </w:r>
-      <w:r>
-        <w:t xml:space="preserve">. Our reading asks for no</w:t>
-      </w:r>
-      <w:r>
-        <w:t xml:space="preserve"> </w:t>
-      </w:r>
-      <w:r>
-        <w:t xml:space="preserve">correspondence rarer than one in seven and asks nothing at all of the final consonant.</w:t>
-      </w:r>
-    </w:p>
-    <w:p>
-      <w:pPr>
-        <w:pStyle w:val="BodyText"/>
-      </w:pPr>
-      <w:r>
-        <w:t xml:space="preserve">With §9 this section is one of only two places in this paper where a Xiongnu name is</w:t>
-      </w:r>
-      <w:r>
-        <w:t xml:space="preserve"> </w:t>
-      </w:r>
-      <w:r>
-        <w:t xml:space="preserve">read positively, and the temptation to overstate such a reading is exactly the one §6.3</w:t>
-      </w:r>
-      <w:r>
-        <w:t xml:space="preserve"> </w:t>
-      </w:r>
-      <w:r>
-        <w:t xml:space="preserve">measures. So, the claim is bounded:</w:t>
-      </w:r>
-      <w:r>
-        <w:t xml:space="preserve"> </w:t>
-      </w:r>
-      <w:r>
-        <w:rPr>
-          <w:iCs/>
-          <w:i/>
-        </w:rPr>
-        <w:t xml:space="preserve">Bögü Tın</w:t>
-      </w:r>
-      <w:r>
-        <w:t xml:space="preserve"> </w:t>
-      </w:r>
-      <w:r>
-        <w:t xml:space="preserve">is a reading that survives every test we can</w:t>
-      </w:r>
-      <w:r>
-        <w:t xml:space="preserve"> </w:t>
-      </w:r>
-      <w:r>
-        <w:t xml:space="preserve">apply, on the tightest frame in the record, and it is offered against a standard etymology that</w:t>
-      </w:r>
-      <w:r>
-        <w:t xml:space="preserve"> </w:t>
-      </w:r>
-      <w:r>
-        <w:t xml:space="preserve">does not. Whether it is right is a question for Turcology, and the material for deciding it,</w:t>
-      </w:r>
-      <w:r>
-        <w:t xml:space="preserve"> </w:t>
-      </w:r>
-      <w:r>
-        <w:t xml:space="preserve">the counts, the corpora, and the scripts, is in the repository that we provided.</w:t>
+        <w:t xml:space="preserve">, the field's reading survives on the other, and the transcription</w:t>
+      </w:r>
+      <w:r>
+        <w:t xml:space="preserve"> </w:t>
+      </w:r>
+      <w:r>
+        <w:t xml:space="preserve">evidence does not choose between them. The material for choosing, the counts, the corpora, and</w:t>
+      </w:r>
+      <w:r>
+        <w:t xml:space="preserve"> </w:t>
+      </w:r>
+      <w:r>
+        <w:t xml:space="preserve">the scripts, is in the repository that we provided.</w:t>
       </w:r>
     </w:p>
     <w:bookmarkEnd w:id="43"/>
@@ -12079,19 +12953,103 @@
         <w:t xml:space="preserve"> </w:t>
       </w:r>
       <w:r>
-        <w:t xml:space="preserve">Schuessler, Pulleyblank and Níng are three</w:t>
-      </w:r>
-      <w:r>
-        <w:t xml:space="preserve"> </w:t>
-      </w:r>
-      <w:r>
-        <w:t xml:space="preserve">scholars with three notations. So some of the apparent disagreement between them is notational rather</w:t>
-      </w:r>
-      <w:r>
-        <w:t xml:space="preserve"> </w:t>
-      </w:r>
-      <w:r>
-        <w:t xml:space="preserve">than substantive.</w:t>
+        <w:t xml:space="preserve">Schuessler, Pulleyblank and Níng are three scholars with three notations, and Baxter and Sagart</w:t>
+      </w:r>
+      <w:r>
+        <w:t xml:space="preserve"> </w:t>
+      </w:r>
+      <w:r>
+        <w:t xml:space="preserve">a fourth.</w:t>
+      </w:r>
+      <w:hyperlink w:anchor="r2">
+        <w:r>
+          <w:rPr>
+            <w:rStyle w:val="Hyperlink"/>
+            <w:vertAlign w:val="superscript"/>
+          </w:rPr>
+          <w:t xml:space="preserve">2</w:t>
+        </w:r>
+      </w:hyperlink>
+      <w:r>
+        <w:rPr>
+          <w:vertAlign w:val="superscript"/>
+        </w:rPr>
+        <w:t xml:space="preserve">,</w:t>
+      </w:r>
+      <w:hyperlink w:anchor="r19">
+        <w:r>
+          <w:rPr>
+            <w:rStyle w:val="Hyperlink"/>
+            <w:vertAlign w:val="superscript"/>
+          </w:rPr>
+          <w:t xml:space="preserve">19</w:t>
+        </w:r>
+      </w:hyperlink>
+      <w:r>
+        <w:rPr>
+          <w:vertAlign w:val="superscript"/>
+        </w:rPr>
+        <w:t xml:space="preserve">,</w:t>
+      </w:r>
+      <w:hyperlink w:anchor="r20">
+        <w:r>
+          <w:rPr>
+            <w:rStyle w:val="Hyperlink"/>
+            <w:vertAlign w:val="superscript"/>
+          </w:rPr>
+          <w:t xml:space="preserve">20</w:t>
+        </w:r>
+      </w:hyperlink>
+      <w:r>
+        <w:t xml:space="preserve"> </w:t>
+      </w:r>
+      <w:r>
+        <w:t xml:space="preserve">So some of the apparent</w:t>
+      </w:r>
+      <w:r>
+        <w:t xml:space="preserve"> </w:t>
+      </w:r>
+      <w:r>
+        <w:t xml:space="preserve">disagreement between them is notational rather than substantive. A single table is also not</w:t>
+      </w:r>
+      <w:r>
+        <w:t xml:space="preserve"> </w:t>
+      </w:r>
+      <w:r>
+        <w:t xml:space="preserve">single-valued:</w:t>
+      </w:r>
+      <w:r>
+        <w:t xml:space="preserve"> </w:t>
+      </w:r>
+      <w:r>
+        <w:rPr>
+          <w:bCs/>
+          <w:b/>
+        </w:rPr>
+        <w:t xml:space="preserve">46 of the 107 characters in the record carry more than one Later Han</w:t>
+      </w:r>
+      <w:r>
+        <w:rPr>
+          <w:bCs/>
+          <w:b/>
+        </w:rPr>
+        <w:t xml:space="preserve"> </w:t>
+      </w:r>
+      <w:r>
+        <w:rPr>
+          <w:bCs/>
+          <w:b/>
+        </w:rPr>
+        <w:t xml:space="preserve">reading</w:t>
+      </w:r>
+      <w:r>
+        <w:t xml:space="preserve">, and Appendix A prints the first tabulated row in all 46. Where the alternative</w:t>
+      </w:r>
+      <w:r>
+        <w:t xml:space="preserve"> </w:t>
+      </w:r>
+      <w:r>
+        <w:t xml:space="preserve">would change a reading it is named in the entry, and §9.2 is the case where it changes most.</w:t>
       </w:r>
     </w:p>
     <w:p>
@@ -12115,6 +13073,30 @@
       <w:r>
         <w:t xml:space="preserve">Even a perfect reconstruction would not settle ethnicity.</w:t>
       </w:r>
+      <w:hyperlink w:anchor="r16">
+        <w:r>
+          <w:rPr>
+            <w:rStyle w:val="Hyperlink"/>
+            <w:vertAlign w:val="superscript"/>
+          </w:rPr>
+          <w:t xml:space="preserve">16</w:t>
+        </w:r>
+      </w:hyperlink>
+      <w:r>
+        <w:rPr>
+          <w:vertAlign w:val="superscript"/>
+        </w:rPr>
+        <w:t xml:space="preserve">,</w:t>
+      </w:r>
+      <w:hyperlink w:anchor="r21">
+        <w:r>
+          <w:rPr>
+            <w:rStyle w:val="Hyperlink"/>
+            <w:vertAlign w:val="superscript"/>
+          </w:rPr>
+          <w:t xml:space="preserve">21</w:t>
+        </w:r>
+      </w:hyperlink>
       <w:r>
         <w:t xml:space="preserve"> </w:t>
       </w:r>
@@ -12528,7 +13510,55 @@
         <w:t xml:space="preserve"> </w:t>
       </w:r>
       <w:r>
-        <w:t xml:space="preserve">character by character. Superscript letters mark Han tone categories.</w:t>
+        <w:t xml:space="preserve">character by character. Superscript letters mark Han tone categories. A dagger,</w:t>
+      </w:r>
+      <w:r>
+        <w:t xml:space="preserve"> </w:t>
+      </w:r>
+      <w:r>
+        <w:t xml:space="preserve">†</w:t>
+      </w:r>
+      <w:r>
+        <w:t xml:space="preserve">, marks a character for which Schuessler's table gives more than one</w:t>
+      </w:r>
+      <w:r>
+        <w:t xml:space="preserve"> </w:t>
+      </w:r>
+      <w:r>
+        <w:t xml:space="preserve">Later Han reading; the first tabulated row is the one printed.</w:t>
+      </w:r>
+      <w:r>
+        <w:t xml:space="preserve"> </w:t>
+      </w:r>
+      <w:r>
+        <w:rPr>
+          <w:bCs/>
+          <w:b/>
+        </w:rPr>
+        <w:t xml:space="preserve">46 of the 107 characters</w:t>
+      </w:r>
+      <w:r>
+        <w:rPr>
+          <w:bCs/>
+          <w:b/>
+        </w:rPr>
+        <w:t xml:space="preserve"> </w:t>
+      </w:r>
+      <w:r>
+        <w:rPr>
+          <w:bCs/>
+          <w:b/>
+        </w:rPr>
+        <w:t xml:space="preserve">in the record are so marked</w:t>
+      </w:r>
+      <w:r>
+        <w:t xml:space="preserve">, and where the alternative would change a proposed reading it</w:t>
+      </w:r>
+      <w:r>
+        <w:t xml:space="preserve"> </w:t>
+      </w:r>
+      <w:r>
+        <w:t xml:space="preserve">is named in the Supplementary Material rather than left to the dagger.</w:t>
       </w:r>
       <w:r>
         <w:t xml:space="preserve"> </w:t>
@@ -12674,6 +13704,9 @@
             <w:r>
               <w:t xml:space="preserve">do mɑnᶜ</w:t>
             </w:r>
+            <w:r>
+              <w:t xml:space="preserve">†</w:t>
+            </w:r>
           </w:p>
         </w:tc>
         <w:tc>
@@ -12725,7 +13758,19 @@
               <w:jc w:val="left"/>
             </w:pPr>
             <w:r>
-              <w:t xml:space="preserve">mək tuənᶜ</w:t>
+              <w:t xml:space="preserve">mək</w:t>
+            </w:r>
+            <w:r>
+              <w:t xml:space="preserve">†</w:t>
+            </w:r>
+            <w:r>
+              <w:t xml:space="preserve"> </w:t>
+            </w:r>
+            <w:r>
+              <w:t xml:space="preserve">tuənᶜ</w:t>
+            </w:r>
+            <w:r>
+              <w:t xml:space="preserve">†</w:t>
             </w:r>
           </w:p>
         </w:tc>
@@ -12778,7 +13823,16 @@
               <w:jc w:val="left"/>
             </w:pPr>
             <w:r>
-              <w:t xml:space="preserve">kʰeiᴮ tśuk</w:t>
+              <w:t xml:space="preserve">kʰeiᴮ</w:t>
+            </w:r>
+            <w:r>
+              <w:t xml:space="preserve">†</w:t>
+            </w:r>
+            <w:r>
+              <w:t xml:space="preserve"> </w:t>
+            </w:r>
+            <w:r>
+              <w:t xml:space="preserve">tśuk</w:t>
             </w:r>
           </w:p>
         </w:tc>
@@ -12833,6 +13887,9 @@
             <w:r>
               <w:t xml:space="preserve">kun dźin</w:t>
             </w:r>
+            <w:r>
+              <w:t xml:space="preserve">†</w:t>
+            </w:r>
           </w:p>
         </w:tc>
         <w:tc>
@@ -13043,7 +14100,25 @@
               <w:jc w:val="left"/>
             </w:pPr>
             <w:r>
-              <w:t xml:space="preserve">huo lei gɑ</w:t>
+              <w:t xml:space="preserve">huo</w:t>
+            </w:r>
+            <w:r>
+              <w:t xml:space="preserve">†</w:t>
+            </w:r>
+            <w:r>
+              <w:t xml:space="preserve"> </w:t>
+            </w:r>
+            <w:r>
+              <w:t xml:space="preserve">lei</w:t>
+            </w:r>
+            <w:r>
+              <w:t xml:space="preserve">†</w:t>
+            </w:r>
+            <w:r>
+              <w:t xml:space="preserve"> </w:t>
+            </w:r>
+            <w:r>
+              <w:t xml:space="preserve">gɑ</w:t>
             </w:r>
           </w:p>
         </w:tc>
@@ -13096,7 +14171,25 @@
               <w:jc w:val="left"/>
             </w:pPr>
             <w:r>
-              <w:t xml:space="preserve">tsɑᴮ te go</w:t>
+              <w:t xml:space="preserve">tsɑᴮ</w:t>
+            </w:r>
+            <w:r>
+              <w:t xml:space="preserve">†</w:t>
+            </w:r>
+            <w:r>
+              <w:t xml:space="preserve"> </w:t>
+            </w:r>
+            <w:r>
+              <w:t xml:space="preserve">te</w:t>
+            </w:r>
+            <w:r>
+              <w:t xml:space="preserve">†</w:t>
+            </w:r>
+            <w:r>
+              <w:t xml:space="preserve"> </w:t>
+            </w:r>
+            <w:r>
+              <w:t xml:space="preserve">go</w:t>
             </w:r>
           </w:p>
         </w:tc>
@@ -13202,7 +14295,19 @@
               <w:jc w:val="left"/>
             </w:pPr>
             <w:r>
-              <w:t xml:space="preserve">gɑ janᴮ te</w:t>
+              <w:t xml:space="preserve">gɑ janᴮ</w:t>
+            </w:r>
+            <w:r>
+              <w:t xml:space="preserve">†</w:t>
+            </w:r>
+            <w:r>
+              <w:t xml:space="preserve"> </w:t>
+            </w:r>
+            <w:r>
+              <w:t xml:space="preserve">te</w:t>
+            </w:r>
+            <w:r>
+              <w:t xml:space="preserve">†</w:t>
             </w:r>
           </w:p>
         </w:tc>
@@ -13308,7 +14413,19 @@
               <w:jc w:val="left"/>
             </w:pPr>
             <w:r>
-              <w:t xml:space="preserve">ʔɔk janᴮ guo te</w:t>
+              <w:t xml:space="preserve">ʔɔk janᴮ</w:t>
+            </w:r>
+            <w:r>
+              <w:t xml:space="preserve">†</w:t>
+            </w:r>
+            <w:r>
+              <w:t xml:space="preserve"> </w:t>
+            </w:r>
+            <w:r>
+              <w:t xml:space="preserve">guo te</w:t>
+            </w:r>
+            <w:r>
+              <w:t xml:space="preserve">†</w:t>
             </w:r>
           </w:p>
         </w:tc>
@@ -13361,7 +14478,19 @@
               <w:jc w:val="left"/>
             </w:pPr>
             <w:r>
-              <w:t xml:space="preserve">hɑ gɑn ja</w:t>
+              <w:t xml:space="preserve">hɑ</w:t>
+            </w:r>
+            <w:r>
+              <w:t xml:space="preserve">†</w:t>
+            </w:r>
+            <w:r>
+              <w:t xml:space="preserve"> </w:t>
+            </w:r>
+            <w:r>
+              <w:t xml:space="preserve">gɑn ja</w:t>
+            </w:r>
+            <w:r>
+              <w:t xml:space="preserve">†</w:t>
             </w:r>
           </w:p>
         </w:tc>
@@ -13416,6 +14545,9 @@
             <w:r>
               <w:t xml:space="preserve">tśit tśe</w:t>
             </w:r>
+            <w:r>
+              <w:t xml:space="preserve">†</w:t>
+            </w:r>
           </w:p>
         </w:tc>
         <w:tc>
@@ -13469,6 +14601,9 @@
             <w:r>
               <w:t xml:space="preserve">ńɑk te</w:t>
             </w:r>
+            <w:r>
+              <w:t xml:space="preserve">†</w:t>
+            </w:r>
           </w:p>
         </w:tc>
         <w:tc>
@@ -13520,7 +14655,28 @@
               <w:jc w:val="left"/>
             </w:pPr>
             <w:r>
-              <w:t xml:space="preserve">buk ṭio lui ńɑk te</w:t>
+              <w:t xml:space="preserve">buk</w:t>
+            </w:r>
+            <w:r>
+              <w:t xml:space="preserve">†</w:t>
+            </w:r>
+            <w:r>
+              <w:t xml:space="preserve"> </w:t>
+            </w:r>
+            <w:r>
+              <w:t xml:space="preserve">ṭio lui</w:t>
+            </w:r>
+            <w:r>
+              <w:t xml:space="preserve">†</w:t>
+            </w:r>
+            <w:r>
+              <w:t xml:space="preserve"> </w:t>
+            </w:r>
+            <w:r>
+              <w:t xml:space="preserve">ńɑk te</w:t>
+            </w:r>
+            <w:r>
+              <w:t xml:space="preserve">†</w:t>
             </w:r>
           </w:p>
         </w:tc>
@@ -13573,7 +14729,19 @@
               <w:jc w:val="left"/>
             </w:pPr>
             <w:r>
-              <w:t xml:space="preserve">so gɛi ńɑk te</w:t>
+              <w:t xml:space="preserve">so</w:t>
+            </w:r>
+            <w:r>
+              <w:t xml:space="preserve">†</w:t>
+            </w:r>
+            <w:r>
+              <w:t xml:space="preserve"> </w:t>
+            </w:r>
+            <w:r>
+              <w:t xml:space="preserve">gɛi ńɑk te</w:t>
+            </w:r>
+            <w:r>
+              <w:t xml:space="preserve">†</w:t>
             </w:r>
           </w:p>
         </w:tc>
@@ -13626,7 +14794,19 @@
               <w:jc w:val="left"/>
             </w:pPr>
             <w:r>
-              <w:t xml:space="preserve">tśʰa ŋa ńɑk te</w:t>
+              <w:t xml:space="preserve">tśʰa</w:t>
+            </w:r>
+            <w:r>
+              <w:t xml:space="preserve">†</w:t>
+            </w:r>
+            <w:r>
+              <w:t xml:space="preserve"> </w:t>
+            </w:r>
+            <w:r>
+              <w:t xml:space="preserve">ŋa ńɑk te</w:t>
+            </w:r>
+            <w:r>
+              <w:t xml:space="preserve">†</w:t>
             </w:r>
           </w:p>
         </w:tc>
@@ -13681,6 +14861,9 @@
             <w:r>
               <w:t xml:space="preserve">ʔɑ tśo liu ńɑk te</w:t>
             </w:r>
+            <w:r>
+              <w:t xml:space="preserve">†</w:t>
+            </w:r>
           </w:p>
         </w:tc>
         <w:tc>
@@ -13732,7 +14915,19 @@
               <w:jc w:val="left"/>
             </w:pPr>
             <w:r>
-              <w:t xml:space="preserve">ʔɑ lui ńɑk te</w:t>
+              <w:t xml:space="preserve">ʔɑ lui</w:t>
+            </w:r>
+            <w:r>
+              <w:t xml:space="preserve">†</w:t>
+            </w:r>
+            <w:r>
+              <w:t xml:space="preserve"> </w:t>
+            </w:r>
+            <w:r>
+              <w:t xml:space="preserve">ńɑk te</w:t>
+            </w:r>
+            <w:r>
+              <w:t xml:space="preserve">†</w:t>
             </w:r>
           </w:p>
         </w:tc>
@@ -13785,7 +14980,37 @@
               <w:jc w:val="left"/>
             </w:pPr>
             <w:r>
-              <w:t xml:space="preserve">hɑ tɑ ńə śi douᴮ kou ńɑk te</w:t>
+              <w:t xml:space="preserve">hɑ</w:t>
+            </w:r>
+            <w:r>
+              <w:t xml:space="preserve">†</w:t>
+            </w:r>
+            <w:r>
+              <w:t xml:space="preserve"> </w:t>
+            </w:r>
+            <w:r>
+              <w:t xml:space="preserve">tɑ ńə</w:t>
+            </w:r>
+            <w:r>
+              <w:t xml:space="preserve">†</w:t>
+            </w:r>
+            <w:r>
+              <w:t xml:space="preserve"> </w:t>
+            </w:r>
+            <w:r>
+              <w:t xml:space="preserve">śi douᴮ</w:t>
+            </w:r>
+            <w:r>
+              <w:t xml:space="preserve">†</w:t>
+            </w:r>
+            <w:r>
+              <w:t xml:space="preserve"> </w:t>
+            </w:r>
+            <w:r>
+              <w:t xml:space="preserve">kou ńɑk te</w:t>
+            </w:r>
+            <w:r>
+              <w:t xml:space="preserve">†</w:t>
             </w:r>
           </w:p>
         </w:tc>
@@ -13840,6 +15065,9 @@
             <w:r>
               <w:t xml:space="preserve">lyan te</w:t>
             </w:r>
+            <w:r>
+              <w:t xml:space="preserve">†</w:t>
+            </w:r>
           </w:p>
         </w:tc>
         <w:tc>
@@ -13891,7 +15119,19 @@
               <w:jc w:val="left"/>
             </w:pPr>
             <w:r>
-              <w:t xml:space="preserve">kʰɨɑ lianᴮ de</w:t>
+              <w:t xml:space="preserve">kʰɨɑ lianᴮ</w:t>
+            </w:r>
+            <w:r>
+              <w:t xml:space="preserve">†</w:t>
+            </w:r>
+            <w:r>
+              <w:t xml:space="preserve"> </w:t>
+            </w:r>
+            <w:r>
+              <w:t xml:space="preserve">de</w:t>
+            </w:r>
+            <w:r>
+              <w:t xml:space="preserve">†</w:t>
             </w:r>
           </w:p>
         </w:tc>
@@ -14135,7 +15375,16 @@
               <w:jc w:val="left"/>
             </w:pPr>
             <w:r>
-              <w:t xml:space="preserve">dźan wɑ</w:t>
+              <w:t xml:space="preserve">dźan</w:t>
+            </w:r>
+            <w:r>
+              <w:t xml:space="preserve">†</w:t>
+            </w:r>
+            <w:r>
+              <w:t xml:space="preserve"> </w:t>
+            </w:r>
+            <w:r>
+              <w:t xml:space="preserve">wɑ</w:t>
             </w:r>
           </w:p>
         </w:tc>
@@ -14188,7 +15437,25 @@
               <w:jc w:val="left"/>
             </w:pPr>
             <w:r>
-              <w:t xml:space="preserve">ḍaŋ lei kuɑ dɑ dźan wɑ</w:t>
+              <w:t xml:space="preserve">ḍaŋ lei</w:t>
+            </w:r>
+            <w:r>
+              <w:t xml:space="preserve">†</w:t>
+            </w:r>
+            <w:r>
+              <w:t xml:space="preserve"> </w:t>
+            </w:r>
+            <w:r>
+              <w:t xml:space="preserve">kuɑ dɑ dźan</w:t>
+            </w:r>
+            <w:r>
+              <w:t xml:space="preserve">†</w:t>
+            </w:r>
+            <w:r>
+              <w:t xml:space="preserve"> </w:t>
+            </w:r>
+            <w:r>
+              <w:t xml:space="preserve">wɑ</w:t>
             </w:r>
           </w:p>
         </w:tc>
@@ -14243,6 +15510,9 @@
             <w:r>
               <w:t xml:space="preserve">ḍaŋ lei</w:t>
             </w:r>
+            <w:r>
+              <w:t xml:space="preserve">†</w:t>
+            </w:r>
           </w:p>
         </w:tc>
         <w:tc>
@@ -14349,6 +15619,9 @@
             <w:r>
               <w:t xml:space="preserve">ʔɑt dźeᴮ</w:t>
             </w:r>
+            <w:r>
+              <w:t xml:space="preserve">†</w:t>
+            </w:r>
           </w:p>
         </w:tc>
         <w:tc>
@@ -14402,6 +15675,9 @@
             <w:r>
               <w:t xml:space="preserve">dɑ gɨ</w:t>
             </w:r>
+            <w:r>
+              <w:t xml:space="preserve">†</w:t>
+            </w:r>
           </w:p>
         </w:tc>
         <w:tc>
@@ -14453,7 +15729,19 @@
               <w:jc w:val="left"/>
             </w:pPr>
             <w:r>
-              <w:t xml:space="preserve">kok leᴮ</w:t>
+              <w:t xml:space="preserve">kok</w:t>
+            </w:r>
+            <w:r>
+              <w:t xml:space="preserve">†</w:t>
+            </w:r>
+            <w:r>
+              <w:t xml:space="preserve"> </w:t>
+            </w:r>
+            <w:r>
+              <w:t xml:space="preserve">leᴮ</w:t>
+            </w:r>
+            <w:r>
+              <w:t xml:space="preserve">†</w:t>
             </w:r>
           </w:p>
         </w:tc>
@@ -14506,7 +15794,16 @@
               <w:jc w:val="left"/>
             </w:pPr>
             <w:r>
-              <w:t xml:space="preserve">tɑŋ gɑᴮ</w:t>
+              <w:t xml:space="preserve">tɑŋ</w:t>
+            </w:r>
+            <w:r>
+              <w:t xml:space="preserve">†</w:t>
+            </w:r>
+            <w:r>
+              <w:t xml:space="preserve"> </w:t>
+            </w:r>
+            <w:r>
+              <w:t xml:space="preserve">gɑᴮ</w:t>
             </w:r>
           </w:p>
         </w:tc>
@@ -14612,7 +15909,16 @@
               <w:jc w:val="left"/>
             </w:pPr>
             <w:r>
-              <w:t xml:space="preserve">tsɑᴮ gɨɑ</w:t>
+              <w:t xml:space="preserve">tsɑᴮ</w:t>
+            </w:r>
+            <w:r>
+              <w:t xml:space="preserve">†</w:t>
+            </w:r>
+            <w:r>
+              <w:t xml:space="preserve"> </w:t>
+            </w:r>
+            <w:r>
+              <w:t xml:space="preserve">gɨɑ</w:t>
             </w:r>
           </w:p>
         </w:tc>
@@ -14718,7 +16024,16 @@
               <w:jc w:val="left"/>
             </w:pPr>
             <w:r>
-              <w:t xml:space="preserve">buk ṇɨk</w:t>
+              <w:t xml:space="preserve">buk</w:t>
+            </w:r>
+            <w:r>
+              <w:t xml:space="preserve">†</w:t>
+            </w:r>
+            <w:r>
+              <w:t xml:space="preserve"> </w:t>
+            </w:r>
+            <w:r>
+              <w:t xml:space="preserve">ṇɨk</w:t>
             </w:r>
           </w:p>
         </w:tc>
@@ -14824,7 +16139,16 @@
               <w:jc w:val="left"/>
             </w:pPr>
             <w:r>
-              <w:t xml:space="preserve">gɔ lok</w:t>
+              <w:t xml:space="preserve">gɔ</w:t>
+            </w:r>
+            <w:r>
+              <w:t xml:space="preserve">†</w:t>
+            </w:r>
+            <w:r>
+              <w:t xml:space="preserve"> </w:t>
+            </w:r>
+            <w:r>
+              <w:t xml:space="preserve">lok</w:t>
             </w:r>
           </w:p>
         </w:tc>
@@ -15001,7 +16325,7 @@
         <w:t xml:space="preserve"> </w:t>
       </w:r>
       <w:r>
-        <w:t xml:space="preserve">which is why that pair has carried so much of the argument. Note that the Yeniseian proposal for</w:t>
+        <w:t xml:space="preserve">which is why that pair has carried so much of the argument. The proposals for</w:t>
       </w:r>
       <w:r>
         <w:t xml:space="preserve"> </w:t>
@@ -15013,63 +16337,57 @@
         <w:t xml:space="preserve"> </w:t>
       </w:r>
       <w:r>
-        <w:t xml:space="preserve">is</w:t>
-      </w:r>
-      <w:r>
-        <w:t xml:space="preserve"> </w:t>
-      </w:r>
-      <w:r>
-        <w:rPr>
-          <w:iCs/>
-          <w:i/>
-        </w:rPr>
-        <w:t xml:space="preserve">(h)ala</w:t>
-      </w:r>
-      <w:r>
-        <w:t xml:space="preserve"> </w:t>
-      </w:r>
-      <w:r>
-        <w:t xml:space="preserve">"son" and the Turkic one</w:t>
-      </w:r>
-      <w:r>
-        <w:t xml:space="preserve"> </w:t>
-      </w:r>
-      <w:r>
-        <w:rPr>
-          <w:iCs/>
-          <w:i/>
-        </w:rPr>
-        <w:t xml:space="preserve">qut</w:t>
-      </w:r>
-      <w:r>
-        <w:t xml:space="preserve"> </w:t>
-      </w:r>
-      <w:r>
-        <w:t xml:space="preserve">"fortune";</w:t>
-      </w:r>
-      <w:r>
-        <w:t xml:space="preserve"> </w:t>
-      </w:r>
-      <w:r>
-        <w:t xml:space="preserve">the Chinese gloss</w:t>
-      </w:r>
-      <w:r>
-        <w:t xml:space="preserve"> </w:t>
-      </w:r>
-      <w:r>
-        <w:t xml:space="preserve">子</w:t>
-      </w:r>
-      <w:r>
-        <w:t xml:space="preserve"> </w:t>
-      </w:r>
-      <w:r>
-        <w:t xml:space="preserve">"son" fits the former and not the</w:t>
-      </w:r>
-      <w:r>
-        <w:t xml:space="preserve"> </w:t>
-      </w:r>
-      <w:r>
-        <w:t xml:space="preserve">latter.</w:t>
+        <w:t xml:space="preserve">do not settle it. Pulleyblank compared it with</w:t>
+      </w:r>
+      <w:r>
+        <w:t xml:space="preserve"> </w:t>
+      </w:r>
+      <w:r>
+        <w:t xml:space="preserve">Arin</w:t>
+      </w:r>
+      <w:r>
+        <w:t xml:space="preserve"> </w:t>
+      </w:r>
+      <w:r>
+        <w:rPr>
+          <w:iCs/>
+          <w:i/>
+        </w:rPr>
+        <w:t xml:space="preserve">bïkjàl</w:t>
+      </w:r>
+      <w:r>
+        <w:t xml:space="preserve"> </w:t>
+      </w:r>
+      <w:r>
+        <w:t xml:space="preserve">"son"; Vovin holds that form to be isolated within Yeniseian, the rest of the</w:t>
+      </w:r>
+      <w:r>
+        <w:t xml:space="preserve"> </w:t>
+      </w:r>
+      <w:r>
+        <w:t xml:space="preserve">family reflecting Proto-Yeniseian</w:t>
+      </w:r>
+      <w:r>
+        <w:t xml:space="preserve"> </w:t>
+      </w:r>
+      <w:r>
+        <w:rPr>
+          <w:iCs/>
+          <w:i/>
+        </w:rPr>
+        <w:t xml:space="preserve">*puʔ-b</w:t>
+      </w:r>
+      <w:r>
+        <w:t xml:space="preserve"> </w:t>
+      </w:r>
+      <w:r>
+        <w:t xml:space="preserve">"son", and finds no Altaic alternative</w:t>
+      </w:r>
+      <w:r>
+        <w:t xml:space="preserve"> </w:t>
+      </w:r>
+      <w:r>
+        <w:t xml:space="preserve">either.</w:t>
       </w:r>
       <w:hyperlink w:anchor="r27">
         <w:r>
@@ -15095,6 +16413,40 @@
           <w:t xml:space="preserve">28</w:t>
         </w:r>
       </w:hyperlink>
+      <w:r>
+        <w:t xml:space="preserve"> </w:t>
+      </w:r>
+      <w:r>
+        <w:t xml:space="preserve">The Turkic proposal,</w:t>
+      </w:r>
+      <w:r>
+        <w:t xml:space="preserve"> </w:t>
+      </w:r>
+      <w:r>
+        <w:rPr>
+          <w:iCs/>
+          <w:i/>
+        </w:rPr>
+        <w:t xml:space="preserve">qut</w:t>
+      </w:r>
+      <w:r>
+        <w:t xml:space="preserve"> </w:t>
+      </w:r>
+      <w:r>
+        <w:t xml:space="preserve">"fortune", fits the sound and not the gloss. So the one item where a Chinese gloss and</w:t>
+      </w:r>
+      <w:r>
+        <w:t xml:space="preserve"> </w:t>
+      </w:r>
+      <w:r>
+        <w:t xml:space="preserve">a Yeniseian etymology were thought to meet is contested by the leading advocate of that</w:t>
+      </w:r>
+      <w:r>
+        <w:t xml:space="preserve"> </w:t>
+      </w:r>
+      <w:r>
+        <w:t xml:space="preserve">hypothesis.</w:t>
+      </w:r>
     </w:p>
     <w:bookmarkEnd w:id="49"/>
     <w:bookmarkEnd w:id="50"/>
@@ -15190,7 +16542,7 @@
       </w:pPr>
       <w:bookmarkStart w:id="53" w:name="r3"/>
       <w:r>
-        <w:t xml:space="preserve">Bonmann, S. et al. (2025). Linguistic evidence suggests that Xiōngnú and Huns spoke the same Paleo-Siberian language.</w:t>
+        <w:t xml:space="preserve">Bonmann, S. &amp; Fries, S. (2026). Linguistic evidence suggests that Xiōngnú and Huns spoke the same Paleo-Siberian language.</w:t>
       </w:r>
       <w:r>
         <w:t xml:space="preserve"> </w:t>
@@ -15203,7 +16555,10 @@
         <w:t xml:space="preserve">Transactions of the Philological Society</w:t>
       </w:r>
       <w:r>
-        <w:t xml:space="preserve">. doi:10.1111/1467-968X.12321</w:t>
+        <w:t xml:space="preserve"> </w:t>
+      </w:r>
+      <w:r>
+        <w:t xml:space="preserve">124(1): 29–52. doi:10.1111/1467-968X.12321</w:t>
       </w:r>
       <w:bookmarkEnd w:id="53"/>
     </w:p>
@@ -15453,7 +16808,13 @@
         <w:t xml:space="preserve">kıŋrak</w:t>
       </w:r>
       <w:r>
-        <w:t xml:space="preserve">, pp. 65–70.)</w:t>
+        <w:t xml:space="preserve">, pp. 66–67, checked</w:t>
+      </w:r>
+      <w:r>
+        <w:t xml:space="preserve"> </w:t>
+      </w:r>
+      <w:r>
+        <w:t xml:space="preserve">against the text.)</w:t>
       </w:r>
       <w:bookmarkEnd w:id="61"/>
     </w:p>

</xml_diff>

<commit_message>
Co-Authored-By: Claude Opus 5 <noreply@anthropic.com>
</commit_message>
<xml_diff>
--- a/docs/edit/paper_EDIT.docx
+++ b/docs/edit/paper_EDIT.docx
@@ -30,7 +30,7 @@
         <w:t xml:space="preserve">Computational philology · corpora · negative results</w:t>
       </w:r>
     </w:p>
-    <w:bookmarkStart w:id="83" w:name="Xfbb52beb3e52dda5b4a5e3e1eff8f0a0edd8f59"/>
+    <w:bookmarkStart w:id="84" w:name="Xfbb52beb3e52dda5b4a5e3e1eff8f0a0edd8f59"/>
     <w:p>
       <w:pPr>
         <w:pStyle w:val="Heading1"/>
@@ -5337,7 +5337,7 @@
       </w:r>
     </w:p>
     <w:bookmarkEnd w:id="37"/>
-    <w:bookmarkStart w:id="43" w:name="five-measurements-of-scribal-practice"/>
+    <w:bookmarkStart w:id="44" w:name="five-measurements-of-scribal-practice"/>
     <w:p>
       <w:pPr>
         <w:pStyle w:val="Heading2"/>
@@ -8934,8 +8934,265 @@
       </w:r>
     </w:p>
     <w:bookmarkEnd w:id="42"/>
+    <w:bookmarkStart w:id="43" w:name="Xb626db11d1faa38f7835a2118b6e3cd898a0040"/>
+    <w:p>
+      <w:pPr>
+        <w:pStyle w:val="Heading3"/>
+      </w:pPr>
+      <w:r>
+        <w:t xml:space="preserve">8.6  A control on what a correct reading costs</w:t>
+      </w:r>
+    </w:p>
+    <w:p>
+      <w:pPr>
+        <w:pStyle w:val="FirstParagraph"/>
+      </w:pPr>
+      <w:r>
+        <w:t xml:space="preserve">The five measurements above are cell rates: how often one source sound was written one way. A</w:t>
+      </w:r>
+      <w:r>
+        <w:t xml:space="preserve"> </w:t>
+      </w:r>
+      <w:r>
+        <w:t xml:space="preserve">reading of a whole name is the product of six or nine such cells, so it falls with every extra</w:t>
+      </w:r>
+      <w:r>
+        <w:t xml:space="preserve"> </w:t>
+      </w:r>
+      <w:r>
+        <w:t xml:space="preserve">character and is a different quantity from any of them. The two must not be compared, and a</w:t>
+      </w:r>
+      <w:r>
+        <w:t xml:space="preserve"> </w:t>
+      </w:r>
+      <w:r>
+        <w:t xml:space="preserve">reader needs a scale for the second kind of figure.</w:t>
+      </w:r>
+    </w:p>
+    <w:p>
+      <w:pPr>
+        <w:pStyle w:val="BodyText"/>
+      </w:pPr>
+      <w:r>
+        <w:t xml:space="preserve">One item in the record supplies it.</w:t>
+      </w:r>
+      <w:r>
+        <w:t xml:space="preserve"> </w:t>
+      </w:r>
+      <w:r>
+        <w:t xml:space="preserve">撑犁</w:t>
+      </w:r>
+      <w:r>
+        <w:t xml:space="preserve"> </w:t>
+      </w:r>
+      <w:r>
+        <w:t xml:space="preserve">is the only two-character item</w:t>
+      </w:r>
+      <w:r>
+        <w:t xml:space="preserve"> </w:t>
+      </w:r>
+      <w:r>
+        <w:t xml:space="preserve">whose meaning the Chinese sources state outright, 匈奴謂天為撐犁, "the Xiongnu call heaven</w:t>
+      </w:r>
+      <w:r>
+        <w:t xml:space="preserve"> </w:t>
+      </w:r>
+      <w:r>
+        <w:rPr>
+          <w:iCs/>
+          <w:i/>
+        </w:rPr>
+        <w:t xml:space="preserve">chengli</w:t>
+      </w:r>
+      <w:r>
+        <w:t xml:space="preserve">", and its identification with the Turkic word for heaven is not in dispute. Its</w:t>
+      </w:r>
+      <w:r>
+        <w:t xml:space="preserve"> </w:t>
+      </w:r>
+      <w:r>
+        <w:t xml:space="preserve">correct reading therefore measures the machinery rather than the reading. Priced on the rates in</w:t>
+      </w:r>
+      <w:r>
+        <w:t xml:space="preserve"> </w:t>
+      </w:r>
+      <w:r>
+        <w:t xml:space="preserve">this section it costs</w:t>
+      </w:r>
+      <w:r>
+        <w:t xml:space="preserve"> </w:t>
+      </w:r>
+      <w:r>
+        <w:rPr>
+          <w:bCs/>
+          <w:b/>
+        </w:rPr>
+        <w:t xml:space="preserve">1 in 152</w:t>
+      </w:r>
+      <w:r>
+        <w:t xml:space="preserve">, about 8% per character. That is the scale: a</w:t>
+      </w:r>
+      <w:r>
+        <w:t xml:space="preserve"> </w:t>
+      </w:r>
+      <w:r>
+        <w:t xml:space="preserve">proposal costing 1 in 24 or 1 in 44 is not thereby expensive, and one costing 1 in 200,000 is.</w:t>
+      </w:r>
+    </w:p>
+    <w:p>
+      <w:pPr>
+        <w:pStyle w:val="BodyText"/>
+      </w:pPr>
+      <w:r>
+        <w:rPr>
+          <w:bCs/>
+          <w:b/>
+        </w:rPr>
+        <w:t xml:space="preserve">The same control carries a second result, on the vowel.</w:t>
+      </w:r>
+      <w:r>
+        <w:t xml:space="preserve"> </w:t>
+      </w:r>
+      <w:r>
+        <w:t xml:space="preserve">撑</w:t>
+      </w:r>
+      <w:r>
+        <w:t xml:space="preserve"> </w:t>
+      </w:r>
+      <w:r>
+        <w:t xml:space="preserve">is an open-vowel character, and an open vowel writes a source</w:t>
+      </w:r>
+      <w:r>
+        <w:t xml:space="preserve"> </w:t>
+      </w:r>
+      <w:r>
+        <w:rPr>
+          <w:iCs/>
+          <w:i/>
+        </w:rPr>
+        <w:t xml:space="preserve">a</w:t>
+      </w:r>
+      <w:r>
+        <w:t xml:space="preserve"> </w:t>
+      </w:r>
+      <w:r>
+        <w:t xml:space="preserve">1,127 times in 1,634 and a source</w:t>
+      </w:r>
+      <w:r>
+        <w:t xml:space="preserve"> </w:t>
+      </w:r>
+      <w:r>
+        <w:rPr>
+          <w:iCs/>
+          <w:i/>
+        </w:rPr>
+        <w:t xml:space="preserve">i</w:t>
+      </w:r>
+      <w:r>
+        <w:t xml:space="preserve"> </w:t>
+      </w:r>
+      <w:r>
+        <w:t xml:space="preserve">or</w:t>
+      </w:r>
+      <w:r>
+        <w:t xml:space="preserve"> </w:t>
+      </w:r>
+      <w:r>
+        <w:rPr>
+          <w:iCs/>
+          <w:i/>
+        </w:rPr>
+        <w:t xml:space="preserve">e</w:t>
+      </w:r>
+      <w:r>
+        <w:t xml:space="preserve"> </w:t>
+      </w:r>
+      <w:r>
+        <w:t xml:space="preserve">27 times in 406. On this</w:t>
+      </w:r>
+      <w:r>
+        <w:t xml:space="preserve"> </w:t>
+      </w:r>
+      <w:r>
+        <w:t xml:space="preserve">spelling the Xiongnu-period form was</w:t>
+      </w:r>
+      <w:r>
+        <w:t xml:space="preserve"> </w:t>
+      </w:r>
+      <w:r>
+        <w:rPr>
+          <w:iCs/>
+          <w:i/>
+        </w:rPr>
+        <w:t xml:space="preserve">taŋrı</w:t>
+      </w:r>
+      <w:r>
+        <w:t xml:space="preserve">, at 1 in 152, rather than Kāşgarî's</w:t>
+      </w:r>
+      <w:r>
+        <w:t xml:space="preserve"> </w:t>
+      </w:r>
+      <w:r>
+        <w:rPr>
+          <w:iCs/>
+          <w:i/>
+        </w:rPr>
+        <w:t xml:space="preserve">teŋri</w:t>
+      </w:r>
+      <w:r>
+        <w:t xml:space="preserve">, at 1 in 1,579, and the whole factor of ten between them is that one cell. Modern</w:t>
+      </w:r>
+      <w:r>
+        <w:t xml:space="preserve"> </w:t>
+      </w:r>
+      <w:r>
+        <w:t xml:space="preserve">Turkish</w:t>
+      </w:r>
+      <w:r>
+        <w:t xml:space="preserve"> </w:t>
+      </w:r>
+      <w:r>
+        <w:rPr>
+          <w:iCs/>
+          <w:i/>
+        </w:rPr>
+        <w:t xml:space="preserve">Tanrı</w:t>
+      </w:r>
+      <w:r>
+        <w:t xml:space="preserve"> </w:t>
+      </w:r>
+      <w:r>
+        <w:t xml:space="preserve">keeps the</w:t>
+      </w:r>
+      <w:r>
+        <w:t xml:space="preserve"> </w:t>
+      </w:r>
+      <w:r>
+        <w:rPr>
+          <w:iCs/>
+          <w:i/>
+        </w:rPr>
+        <w:t xml:space="preserve">a</w:t>
+      </w:r>
+      <w:r>
+        <w:t xml:space="preserve">. We record this as what the transcription measures and</w:t>
+      </w:r>
+      <w:r>
+        <w:t xml:space="preserve"> </w:t>
+      </w:r>
+      <w:r>
+        <w:t xml:space="preserve">not as a new claim about the word: the vocalism of this item has its own literature, and Georg</w:t>
+      </w:r>
+      <w:r>
+        <w:t xml:space="preserve"> </w:t>
+      </w:r>
+      <w:r>
+        <w:t xml:space="preserve">2001, which argues the word is a Yeniseian borrowing, is among the works we have not obtained.</w:t>
+      </w:r>
+    </w:p>
     <w:bookmarkEnd w:id="43"/>
-    <w:bookmarkStart w:id="46" w:name="X18e877f3e1c3d2dd8c6c1f8b8056a29434f58aa"/>
+    <w:bookmarkEnd w:id="44"/>
+    <w:bookmarkStart w:id="47" w:name="X18e877f3e1c3d2dd8c6c1f8b8056a29434f58aa"/>
     <w:p>
       <w:pPr>
         <w:pStyle w:val="Heading2"/>
@@ -10484,7 +10741,7 @@
         <w:t xml:space="preserve">quoted in support of an individual reading, the concrete form of the warning in §6.2.</w:t>
       </w:r>
     </w:p>
-    <w:bookmarkStart w:id="44" w:name="two-cases-which-are-not-ours-to-propose"/>
+    <w:bookmarkStart w:id="45" w:name="two-cases-which-are-not-ours-to-propose"/>
     <w:p>
       <w:pPr>
         <w:pStyle w:val="Heading3"/>
@@ -11044,6 +11301,16 @@
         <w:pStyle w:val="BodyText"/>
       </w:pPr>
       <w:r>
+        <w:rPr>
+          <w:bCs/>
+          <w:b/>
+        </w:rPr>
+        <w:t xml:space="preserve">The manuscript carries both orders of the word.</w:t>
+      </w:r>
+      <w:r>
+        <w:t xml:space="preserve"> </w:t>
+      </w:r>
+      <w:r>
         <w:t xml:space="preserve">Kāşgarî's text at volume III, page 382 of the</w:t>
       </w:r>
       <w:r>
@@ -11070,7 +11337,7 @@
           <w:iCs/>
           <w:i/>
         </w:rPr>
-        <w:t xml:space="preserve">kırpa:k</w:t>
+        <w:t xml:space="preserve">kırŋa:k</w:t>
       </w:r>
       <w:r>
         <w:t xml:space="preserve"> </w:t>
@@ -11089,44 +11356,547 @@
         <w:t xml:space="preserve">kıŋra:k</w:t>
       </w:r>
       <w:r>
-        <w:t xml:space="preserve">. So this form rests on a marginal emendation rather than the text as</w:t>
-      </w:r>
-      <w:r>
-        <w:t xml:space="preserve"> </w:t>
-      </w:r>
-      <w:r>
-        <w:t xml:space="preserve">written. The emendation is not the only support for it: Hirth took the word from living Turki</w:t>
-      </w:r>
-      <w:r>
-        <w:t xml:space="preserve"> </w:t>
-      </w:r>
-      <w:r>
-        <w:t xml:space="preserve">dialects in 1908, and the Teleut and Kirghiz survivals cited above are independent of the</w:t>
-      </w:r>
-      <w:r>
-        <w:t xml:space="preserve"> </w:t>
-      </w:r>
-      <w:r>
-        <w:t xml:space="preserve">Dīwān's manuscript altogether.</w:t>
-      </w:r>
-      <w:r>
-        <w:t xml:space="preserve"> </w:t>
-      </w:r>
-      <w:r>
-        <w:rPr>
-          <w:iCs/>
-          <w:i/>
-        </w:rPr>
-        <w:t xml:space="preserve">kıñır</w:t>
-      </w:r>
-      <w:r>
-        <w:t xml:space="preserve">, on the other hand, fits the transcription exactly, at three</w:t>
-      </w:r>
-      <w:r>
-        <w:t xml:space="preserve"> </w:t>
-      </w:r>
-      <w:r>
-        <w:t xml:space="preserve">consonants with nothing supplied;</w:t>
+        <w:t xml:space="preserve">, so the form used here rests on a marginal emendation rather than on the text as</w:t>
+      </w:r>
+      <w:r>
+        <w:t xml:space="preserve"> </w:t>
+      </w:r>
+      <w:r>
+        <w:t xml:space="preserve">written. Dankoff and Kelly print the text form and gloss it "a broad knife (</w:t>
+      </w:r>
+      <w:r>
+        <w:rPr>
+          <w:iCs/>
+          <w:i/>
+        </w:rPr>
+        <w:t xml:space="preserve">ṣafra</w:t>
+      </w:r>
+      <w:r>
+        <w:t xml:space="preserve">) like a</w:t>
+      </w:r>
+      <w:r>
+        <w:t xml:space="preserve"> </w:t>
+      </w:r>
+      <w:r>
+        <w:t xml:space="preserve">cleaver (</w:t>
+      </w:r>
+      <w:r>
+        <w:rPr>
+          <w:iCs/>
+          <w:i/>
+        </w:rPr>
+        <w:t xml:space="preserve">sāṭūr</w:t>
+      </w:r>
+      <w:r>
+        <w:t xml:space="preserve">) used to cut meat or dough", which is the same object Clauson describes.</w:t>
+      </w:r>
+      <w:r>
+        <w:t xml:space="preserve"> </w:t>
+      </w:r>
+      <w:r>
+        <w:rPr>
+          <w:bCs/>
+          <w:b/>
+        </w:rPr>
+        <w:t xml:space="preserve">The two editions therefore agree on what the word means and differ only on the order of the</w:t>
+      </w:r>
+      <w:r>
+        <w:rPr>
+          <w:bCs/>
+          <w:b/>
+        </w:rPr>
+        <w:t xml:space="preserve"> </w:t>
+      </w:r>
+      <w:r>
+        <w:rPr>
+          <w:bCs/>
+          <w:b/>
+        </w:rPr>
+        <w:t xml:space="preserve">r</w:t>
+      </w:r>
+      <w:r>
+        <w:rPr>
+          <w:bCs/>
+          <w:b/>
+        </w:rPr>
+        <w:t xml:space="preserve"> </w:t>
+      </w:r>
+      <w:r>
+        <w:rPr>
+          <w:bCs/>
+          <w:b/>
+        </w:rPr>
+        <w:t xml:space="preserve">and the</w:t>
+      </w:r>
+      <w:r>
+        <w:rPr>
+          <w:bCs/>
+          <w:b/>
+        </w:rPr>
+        <w:t xml:space="preserve"> </w:t>
+      </w:r>
+      <w:r>
+        <w:rPr>
+          <w:bCs/>
+          <w:b/>
+        </w:rPr>
+        <w:t xml:space="preserve">ŋ</w:t>
+      </w:r>
+      <w:r>
+        <w:rPr>
+          <w:bCs/>
+          <w:b/>
+        </w:rPr>
+        <w:t xml:space="preserve">.</w:t>
+      </w:r>
+      <w:r>
+        <w:t xml:space="preserve"> </w:t>
+      </w:r>
+      <w:r>
+        <w:t xml:space="preserve">That is not a disagreement</w:t>
+      </w:r>
+      <w:r>
+        <w:t xml:space="preserve"> </w:t>
+      </w:r>
+      <w:r>
+        <w:t xml:space="preserve">about which word is on the page. It is the ordinary Turkic transposition of a liquid across a</w:t>
+      </w:r>
+      <w:r>
+        <w:t xml:space="preserve"> </w:t>
+      </w:r>
+      <w:r>
+        <w:t xml:space="preserve">following consonant, the alternation that gives standard</w:t>
+      </w:r>
+      <w:r>
+        <w:t xml:space="preserve"> </w:t>
+      </w:r>
+      <w:r>
+        <w:rPr>
+          <w:iCs/>
+          <w:i/>
+        </w:rPr>
+        <w:t xml:space="preserve">toprak</w:t>
+      </w:r>
+      <w:r>
+        <w:t xml:space="preserve"> </w:t>
+      </w:r>
+      <w:r>
+        <w:t xml:space="preserve">beside dialect</w:t>
+      </w:r>
+      <w:r>
+        <w:t xml:space="preserve"> </w:t>
+      </w:r>
+      <w:r>
+        <w:rPr>
+          <w:iCs/>
+          <w:i/>
+        </w:rPr>
+        <w:t xml:space="preserve">torpak</w:t>
+      </w:r>
+      <w:r>
+        <w:t xml:space="preserve">,</w:t>
+      </w:r>
+      <w:r>
+        <w:t xml:space="preserve"> </w:t>
+      </w:r>
+      <w:r>
+        <w:rPr>
+          <w:iCs/>
+          <w:i/>
+        </w:rPr>
+        <w:t xml:space="preserve">yaprak</w:t>
+      </w:r>
+      <w:r>
+        <w:t xml:space="preserve"> </w:t>
+      </w:r>
+      <w:r>
+        <w:t xml:space="preserve">beside</w:t>
+      </w:r>
+      <w:r>
+        <w:t xml:space="preserve"> </w:t>
+      </w:r>
+      <w:r>
+        <w:rPr>
+          <w:iCs/>
+          <w:i/>
+        </w:rPr>
+        <w:t xml:space="preserve">yarpak</w:t>
+      </w:r>
+      <w:r>
+        <w:t xml:space="preserve">,</w:t>
+      </w:r>
+      <w:r>
+        <w:t xml:space="preserve"> </w:t>
+      </w:r>
+      <w:r>
+        <w:rPr>
+          <w:iCs/>
+          <w:i/>
+        </w:rPr>
+        <w:t xml:space="preserve">kirpik</w:t>
+      </w:r>
+      <w:r>
+        <w:t xml:space="preserve"> </w:t>
+      </w:r>
+      <w:r>
+        <w:t xml:space="preserve">beside</w:t>
+      </w:r>
+      <w:r>
+        <w:t xml:space="preserve"> </w:t>
+      </w:r>
+      <w:r>
+        <w:rPr>
+          <w:iCs/>
+          <w:i/>
+        </w:rPr>
+        <w:t xml:space="preserve">kiprik</w:t>
+      </w:r>
+      <w:r>
+        <w:t xml:space="preserve"> </w:t>
+      </w:r>
+      <w:r>
+        <w:t xml:space="preserve">and</w:t>
+      </w:r>
+      <w:r>
+        <w:t xml:space="preserve"> </w:t>
+      </w:r>
+      <w:r>
+        <w:rPr>
+          <w:iCs/>
+          <w:i/>
+        </w:rPr>
+        <w:t xml:space="preserve">köprü</w:t>
+      </w:r>
+      <w:r>
+        <w:t xml:space="preserve"> </w:t>
+      </w:r>
+      <w:r>
+        <w:t xml:space="preserve">beside</w:t>
+      </w:r>
+      <w:r>
+        <w:t xml:space="preserve"> </w:t>
+      </w:r>
+      <w:r>
+        <w:rPr>
+          <w:iCs/>
+          <w:i/>
+        </w:rPr>
+        <w:t xml:space="preserve">körpü</w:t>
+      </w:r>
+      <w:r>
+        <w:t xml:space="preserve">, and that carried Old Turkic</w:t>
+      </w:r>
+      <w:r>
+        <w:t xml:space="preserve"> </w:t>
+      </w:r>
+      <w:r>
+        <w:rPr>
+          <w:iCs/>
+          <w:i/>
+        </w:rPr>
+        <w:t xml:space="preserve">kaşru</w:t>
+      </w:r>
+      <w:r>
+        <w:t xml:space="preserve"> </w:t>
+      </w:r>
+      <w:r>
+        <w:t xml:space="preserve">into modern</w:t>
+      </w:r>
+      <w:r>
+        <w:t xml:space="preserve"> </w:t>
+      </w:r>
+      <w:r>
+        <w:rPr>
+          <w:iCs/>
+          <w:i/>
+        </w:rPr>
+        <w:t xml:space="preserve">karşı</w:t>
+      </w:r>
+      <w:r>
+        <w:t xml:space="preserve">.</w:t>
+      </w:r>
+      <w:r>
+        <w:t xml:space="preserve"> </w:t>
+      </w:r>
+      <w:r>
+        <w:rPr>
+          <w:iCs/>
+          <w:i/>
+        </w:rPr>
+        <w:t xml:space="preserve">Kırŋak</w:t>
+      </w:r>
+      <w:r>
+        <w:t xml:space="preserve"> </w:t>
+      </w:r>
+      <w:r>
+        <w:t xml:space="preserve">and</w:t>
+      </w:r>
+      <w:r>
+        <w:t xml:space="preserve"> </w:t>
+      </w:r>
+      <w:r>
+        <w:rPr>
+          <w:iCs/>
+          <w:i/>
+        </w:rPr>
+        <w:t xml:space="preserve">kıŋrak</w:t>
+      </w:r>
+      <w:r>
+        <w:t xml:space="preserve"> </w:t>
+      </w:r>
+      <w:r>
+        <w:t xml:space="preserve">are two orders of one word.</w:t>
+      </w:r>
+    </w:p>
+    <w:p>
+      <w:pPr>
+        <w:pStyle w:val="BodyText"/>
+      </w:pPr>
+      <w:r>
+        <w:rPr>
+          <w:bCs/>
+          <w:b/>
+        </w:rPr>
+        <w:t xml:space="preserve">What that costs and what it does not.</w:t>
+      </w:r>
+      <w:r>
+        <w:t xml:space="preserve"> </w:t>
+      </w:r>
+      <w:r>
+        <w:t xml:space="preserve">It costs the transcription its vote. Of the</w:t>
+      </w:r>
+      <w:r>
+        <w:t xml:space="preserve"> </w:t>
+      </w:r>
+      <w:r>
+        <w:t xml:space="preserve">two orders only</w:t>
+      </w:r>
+      <w:r>
+        <w:t xml:space="preserve"> </w:t>
+      </w:r>
+      <w:r>
+        <w:rPr>
+          <w:iCs/>
+          <w:i/>
+        </w:rPr>
+        <w:t xml:space="preserve">kıŋrak</w:t>
+      </w:r>
+      <w:r>
+        <w:t xml:space="preserve"> </w:t>
+      </w:r>
+      <w:r>
+        <w:t xml:space="preserve">can be written with these characters: 徑 carries a velar onset and a</w:t>
+      </w:r>
+      <w:r>
+        <w:t xml:space="preserve"> </w:t>
+      </w:r>
+      <w:r>
+        <w:t xml:space="preserve">written</w:t>
+      </w:r>
+      <w:r>
+        <w:t xml:space="preserve"> </w:t>
+      </w:r>
+      <w:r>
+        <w:t xml:space="preserve">-ŋ</w:t>
+      </w:r>
+      <w:r>
+        <w:t xml:space="preserve"> </w:t>
+      </w:r>
+      <w:r>
+        <w:t xml:space="preserve">coda and 路 a Chinese</w:t>
+      </w:r>
+      <w:r>
+        <w:t xml:space="preserve"> </w:t>
+      </w:r>
+      <w:r>
+        <w:t xml:space="preserve">l-</w:t>
+      </w:r>
+      <w:r>
+        <w:t xml:space="preserve">, so the</w:t>
+      </w:r>
+      <w:r>
+        <w:t xml:space="preserve"> </w:t>
+      </w:r>
+      <w:r>
+        <w:t xml:space="preserve">spelling prices</w:t>
+      </w:r>
+      <w:r>
+        <w:t xml:space="preserve"> </w:t>
+      </w:r>
+      <w:r>
+        <w:rPr>
+          <w:iCs/>
+          <w:i/>
+        </w:rPr>
+        <w:t xml:space="preserve">kıŋrak</w:t>
+      </w:r>
+      <w:r>
+        <w:t xml:space="preserve"> </w:t>
+      </w:r>
+      <w:r>
+        <w:t xml:space="preserve">at 1 in 7, two characters for two syllables in order, and</w:t>
+      </w:r>
+      <w:r>
+        <w:t xml:space="preserve"> </w:t>
+      </w:r>
+      <w:r>
+        <w:rPr>
+          <w:iCs/>
+          <w:i/>
+        </w:rPr>
+        <w:t xml:space="preserve">kırŋak</w:t>
+      </w:r>
+      <w:r>
+        <w:t xml:space="preserve"> </w:t>
+      </w:r>
+      <w:r>
+        <w:t xml:space="preserve">at 1 in 123, the latter only by compressing two syllables onto 徑 and leaving 路</w:t>
+      </w:r>
+      <w:r>
+        <w:t xml:space="preserve"> </w:t>
+      </w:r>
+      <w:r>
+        <w:t xml:space="preserve">idle, since no Chinese</w:t>
+      </w:r>
+      <w:r>
+        <w:t xml:space="preserve"> </w:t>
+      </w:r>
+      <w:r>
+        <w:t xml:space="preserve">l-</w:t>
+      </w:r>
+      <w:r>
+        <w:t xml:space="preserve"> </w:t>
+      </w:r>
+      <w:r>
+        <w:t xml:space="preserve">character in the corpus writes a source velar</w:t>
+      </w:r>
+      <w:r>
+        <w:t xml:space="preserve"> </w:t>
+      </w:r>
+      <w:r>
+        <w:t xml:space="preserve">nasal. We record that</w:t>
+      </w:r>
+      <w:r>
+        <w:t xml:space="preserve"> </w:t>
+      </w:r>
+      <w:r>
+        <w:t xml:space="preserve">and do not lean on it: the reading is what is under test here, so the Chinese side cannot also be</w:t>
+      </w:r>
+      <w:r>
+        <w:t xml:space="preserve"> </w:t>
+      </w:r>
+      <w:r>
+        <w:t xml:space="preserve">the evidence that picks the Turkic form. What it does not cost is the identification, because the</w:t>
+      </w:r>
+      <w:r>
+        <w:t xml:space="preserve"> </w:t>
+      </w:r>
+      <w:r>
+        <w:t xml:space="preserve">order is settled inside Turkic without reference to Chinese. The margin corrects toward</w:t>
+      </w:r>
+      <w:r>
+        <w:t xml:space="preserve"> </w:t>
+      </w:r>
+      <w:r>
+        <w:rPr>
+          <w:iCs/>
+          <w:i/>
+        </w:rPr>
+        <w:t xml:space="preserve">kıŋrak</w:t>
+      </w:r>
+      <w:r>
+        <w:t xml:space="preserve">; Clauson derives that order from</w:t>
+      </w:r>
+      <w:r>
+        <w:t xml:space="preserve"> </w:t>
+      </w:r>
+      <w:r>
+        <w:rPr>
+          <w:iCs/>
+          <w:i/>
+        </w:rPr>
+        <w:t xml:space="preserve">kıŋır</w:t>
+      </w:r>
+      <w:r>
+        <w:t xml:space="preserve"> </w:t>
+      </w:r>
+      <w:r>
+        <w:t xml:space="preserve">"crooked", where the text order has</w:t>
+      </w:r>
+      <w:r>
+        <w:t xml:space="preserve"> </w:t>
+      </w:r>
+      <w:r>
+        <w:t xml:space="preserve">no etymology at all; and every modern survival keeps it, Teleut</w:t>
+      </w:r>
+      <w:r>
+        <w:t xml:space="preserve"> </w:t>
+      </w:r>
+      <w:r>
+        <w:rPr>
+          <w:iCs/>
+          <w:i/>
+        </w:rPr>
+        <w:t xml:space="preserve">kıŋırak</w:t>
+      </w:r>
+      <w:r>
+        <w:t xml:space="preserve"> </w:t>
+      </w:r>
+      <w:r>
+        <w:t xml:space="preserve">and Kirghiz</w:t>
+      </w:r>
+      <w:r>
+        <w:t xml:space="preserve"> </w:t>
+      </w:r>
+      <w:r>
+        <w:rPr>
+          <w:iCs/>
+          <w:i/>
+        </w:rPr>
+        <w:t xml:space="preserve">kıŋarak / kıŋırak</w:t>
+      </w:r>
+      <w:r>
+        <w:t xml:space="preserve">. Hirth, who made the comparison in 1908, took the word from living</w:t>
+      </w:r>
+      <w:r>
+        <w:t xml:space="preserve"> </w:t>
+      </w:r>
+      <w:r>
+        <w:t xml:space="preserve">Turki dialects and not from this manuscript.</w:t>
+      </w:r>
+    </w:p>
+    <w:p>
+      <w:pPr>
+        <w:pStyle w:val="BodyText"/>
+      </w:pPr>
+      <w:r>
+        <w:rPr>
+          <w:bCs/>
+          <w:b/>
+        </w:rPr>
+        <w:t xml:space="preserve">What remains against the reading.</w:t>
+      </w:r>
+      <w:r>
+        <w:t xml:space="preserve"> </w:t>
+      </w:r>
+      <w:r>
+        <w:rPr>
+          <w:iCs/>
+          <w:i/>
+        </w:rPr>
+        <w:t xml:space="preserve">Kıñır</w:t>
+      </w:r>
+      <w:r>
+        <w:t xml:space="preserve"> </w:t>
+      </w:r>
+      <w:r>
+        <w:t xml:space="preserve">fits the transcription with</w:t>
+      </w:r>
+      <w:r>
+        <w:t xml:space="preserve"> </w:t>
+      </w:r>
+      <w:r>
+        <w:t xml:space="preserve">nothing supplied, at three consonants, and it means "crooked" rather than "blade";</w:t>
       </w:r>
       <w:r>
         <w:t xml:space="preserve"> </w:t>
@@ -11139,13 +11909,13 @@
         <w:t xml:space="preserve">kıñrak</w:t>
       </w:r>
       <w:r>
-        <w:t xml:space="preserve">, which means a knife, needs the</w:t>
-      </w:r>
-      <w:r>
-        <w:t xml:space="preserve"> </w:t>
-      </w:r>
-      <w:r>
-        <w:t xml:space="preserve">unwritten final</w:t>
+        <w:t xml:space="preserve">,</w:t>
+      </w:r>
+      <w:r>
+        <w:t xml:space="preserve"> </w:t>
+      </w:r>
+      <w:r>
+        <w:t xml:space="preserve">which means a knife, needs the unwritten final</w:t>
       </w:r>
       <w:r>
         <w:t xml:space="preserve"> </w:t>
@@ -11157,13 +11927,19 @@
         <w:t xml:space="preserve"> </w:t>
       </w:r>
       <w:r>
-        <w:t xml:space="preserve">that Table 7 licenses at 30%. The form that fits best</w:t>
-      </w:r>
-      <w:r>
-        <w:t xml:space="preserve"> </w:t>
-      </w:r>
-      <w:r>
-        <w:t xml:space="preserve">does not mean "blade", and the form that means "blade" does not fit best.</w:t>
+        <w:t xml:space="preserve">that Table 7 licenses at</w:t>
+      </w:r>
+      <w:r>
+        <w:t xml:space="preserve"> </w:t>
+      </w:r>
+      <w:r>
+        <w:t xml:space="preserve">9 of 23, 39%. The form that fits best does not mean "blade", and the form that means "blade" does</w:t>
+      </w:r>
+      <w:r>
+        <w:t xml:space="preserve"> </w:t>
+      </w:r>
+      <w:r>
+        <w:t xml:space="preserve">not fit best.</w:t>
       </w:r>
     </w:p>
     <w:p>
@@ -12248,8 +13024,8 @@
         <w:t xml:space="preserve">a use of it that the accuracy figures actually license.</w:t>
       </w:r>
     </w:p>
-    <w:bookmarkEnd w:id="44"/>
-    <w:bookmarkStart w:id="45" w:name="X0c4ba52fd95c78c09fdcd9031fd6d8d2ec1da17"/>
+    <w:bookmarkEnd w:id="45"/>
+    <w:bookmarkStart w:id="46" w:name="X0c4ba52fd95c78c09fdcd9031fd6d8d2ec1da17"/>
     <w:p>
       <w:pPr>
         <w:pStyle w:val="Heading3"/>
@@ -14530,9 +15306,9 @@
         <w:t xml:space="preserve">provided.</w:t>
       </w:r>
     </w:p>
-    <w:bookmarkEnd w:id="45"/>
     <w:bookmarkEnd w:id="46"/>
-    <w:bookmarkStart w:id="47" w:name="where-the-method-does-work"/>
+    <w:bookmarkEnd w:id="47"/>
+    <w:bookmarkStart w:id="48" w:name="where-the-method-does-work"/>
     <w:p>
       <w:pPr>
         <w:pStyle w:val="Heading2"/>
@@ -15347,8 +16123,8 @@
         <w:t xml:space="preserve">against.</w:t>
       </w:r>
     </w:p>
-    <w:bookmarkEnd w:id="47"/>
-    <w:bookmarkStart w:id="48" w:name="limitations-of-this-work"/>
+    <w:bookmarkEnd w:id="48"/>
+    <w:bookmarkStart w:id="49" w:name="limitations-of-this-work"/>
     <w:p>
       <w:pPr>
         <w:pStyle w:val="Heading2"/>
@@ -15849,8 +16625,8 @@
         <w:t xml:space="preserve">conclusion.</w:t>
       </w:r>
     </w:p>
-    <w:bookmarkEnd w:id="48"/>
-    <w:bookmarkStart w:id="49" w:name="data-and-code-availability"/>
+    <w:bookmarkEnd w:id="49"/>
+    <w:bookmarkStart w:id="50" w:name="data-and-code-availability"/>
     <w:p>
       <w:pPr>
         <w:pStyle w:val="Heading2"/>
@@ -16149,8 +16925,8 @@
         </w:pict>
       </w:r>
     </w:p>
-    <w:bookmarkEnd w:id="49"/>
-    <w:bookmarkStart w:id="52" w:name="a-appendix-the-xiongnu-record"/>
+    <w:bookmarkEnd w:id="50"/>
+    <w:bookmarkStart w:id="53" w:name="a-appendix-the-xiongnu-record"/>
     <w:p>
       <w:pPr>
         <w:pStyle w:val="Heading2"/>
@@ -16244,7 +17020,7 @@
         <w:t xml:space="preserve">carry it.</w:t>
       </w:r>
     </w:p>
-    <w:bookmarkStart w:id="50" w:name="a.1-rulers-and-the-ruling-clan"/>
+    <w:bookmarkStart w:id="51" w:name="a.1-rulers-and-the-ruling-clan"/>
     <w:p>
       <w:pPr>
         <w:pStyle w:val="Heading3"/>
@@ -17916,8 +18692,8 @@
         <w:t xml:space="preserve">.</w:t>
       </w:r>
     </w:p>
-    <w:bookmarkEnd w:id="50"/>
-    <w:bookmarkStart w:id="51" w:name="a.2-titles-and-lexical-items"/>
+    <w:bookmarkEnd w:id="51"/>
+    <w:bookmarkStart w:id="52" w:name="a.2-titles-and-lexical-items"/>
     <w:p>
       <w:pPr>
         <w:pStyle w:val="Heading3"/>
@@ -19113,9 +19889,9 @@
         <w:t xml:space="preserve">hypothesis.</w:t>
       </w:r>
     </w:p>
-    <w:bookmarkEnd w:id="51"/>
     <w:bookmarkEnd w:id="52"/>
-    <w:bookmarkStart w:id="82" w:name="b-references"/>
+    <w:bookmarkEnd w:id="53"/>
+    <w:bookmarkStart w:id="83" w:name="b-references"/>
     <w:p>
       <w:pPr>
         <w:pStyle w:val="Heading2"/>
@@ -19138,7 +19914,7 @@
         </w:numPr>
         <w:pStyle w:val="Compact"/>
       </w:pPr>
-      <w:bookmarkStart w:id="53" w:name="r1"/>
+      <w:bookmarkStart w:id="54" w:name="r1"/>
       <w:r>
         <w:t xml:space="preserve">Baley, D. (2025).</w:t>
       </w:r>
@@ -19167,33 +19943,6 @@
       </w:r>
       <w:r>
         <w:t xml:space="preserve">, doi:10.5334/johd.110</w:t>
-      </w:r>
-      <w:bookmarkEnd w:id="53"/>
-    </w:p>
-    <w:p>
-      <w:pPr>
-        <w:numPr>
-          <w:ilvl w:val="0"/>
-          <w:numId w:val="1003"/>
-        </w:numPr>
-        <w:pStyle w:val="Compact"/>
-      </w:pPr>
-      <w:bookmarkStart w:id="54" w:name="r2"/>
-      <w:r>
-        <w:t xml:space="preserve">Baxter, W. H. &amp; Sagart, L. (2014).</w:t>
-      </w:r>
-      <w:r>
-        <w:t xml:space="preserve"> </w:t>
-      </w:r>
-      <w:r>
-        <w:rPr>
-          <w:iCs/>
-          <w:i/>
-        </w:rPr>
-        <w:t xml:space="preserve">Old Chinese: A New Reconstruction</w:t>
-      </w:r>
-      <w:r>
-        <w:t xml:space="preserve">. Oxford University Press.</w:t>
       </w:r>
       <w:bookmarkEnd w:id="54"/>
     </w:p>
@@ -19205,25 +19954,22 @@
         </w:numPr>
         <w:pStyle w:val="Compact"/>
       </w:pPr>
-      <w:bookmarkStart w:id="55" w:name="r3"/>
-      <w:r>
-        <w:t xml:space="preserve">Bonmann, S. &amp; Fries, S. (2026). Linguistic evidence suggests that Xiōngnú and Huns spoke the same Paleo-Siberian language.</w:t>
-      </w:r>
-      <w:r>
-        <w:t xml:space="preserve"> </w:t>
-      </w:r>
-      <w:r>
-        <w:rPr>
-          <w:iCs/>
-          <w:i/>
-        </w:rPr>
-        <w:t xml:space="preserve">Transactions of the Philological Society</w:t>
-      </w:r>
-      <w:r>
-        <w:t xml:space="preserve"> </w:t>
-      </w:r>
-      <w:r>
-        <w:t xml:space="preserve">124(1): 29–52. doi:10.1111/1467-968X.12321</w:t>
+      <w:bookmarkStart w:id="55" w:name="r2"/>
+      <w:r>
+        <w:t xml:space="preserve">Baxter, W. H. &amp; Sagart, L. (2014).</w:t>
+      </w:r>
+      <w:r>
+        <w:t xml:space="preserve"> </w:t>
+      </w:r>
+      <w:r>
+        <w:rPr>
+          <w:iCs/>
+          <w:i/>
+        </w:rPr>
+        <w:t xml:space="preserve">Old Chinese: A New Reconstruction</w:t>
+      </w:r>
+      <w:r>
+        <w:t xml:space="preserve">. Oxford University Press.</w:t>
       </w:r>
       <w:bookmarkEnd w:id="55"/>
     </w:p>
@@ -19235,22 +19981,25 @@
         </w:numPr>
         <w:pStyle w:val="Compact"/>
       </w:pPr>
-      <w:bookmarkStart w:id="56" w:name="r4"/>
-      <w:r>
-        <w:t xml:space="preserve">Clauson, G. (1972).</w:t>
-      </w:r>
-      <w:r>
-        <w:t xml:space="preserve"> </w:t>
-      </w:r>
-      <w:r>
-        <w:rPr>
-          <w:iCs/>
-          <w:i/>
-        </w:rPr>
-        <w:t xml:space="preserve">An Etymological Dictionary of Pre-Thirteenth-Century Turkish</w:t>
-      </w:r>
-      <w:r>
-        <w:t xml:space="preserve">. Oxford: Clarendon Press.</w:t>
+      <w:bookmarkStart w:id="56" w:name="r3"/>
+      <w:r>
+        <w:t xml:space="preserve">Bonmann, S. &amp; Fries, S. (2026). Linguistic evidence suggests that Xiōngnú and Huns spoke the same Paleo-Siberian language.</w:t>
+      </w:r>
+      <w:r>
+        <w:t xml:space="preserve"> </w:t>
+      </w:r>
+      <w:r>
+        <w:rPr>
+          <w:iCs/>
+          <w:i/>
+        </w:rPr>
+        <w:t xml:space="preserve">Transactions of the Philological Society</w:t>
+      </w:r>
+      <w:r>
+        <w:t xml:space="preserve"> </w:t>
+      </w:r>
+      <w:r>
+        <w:t xml:space="preserve">124(1): 29–52. doi:10.1111/1467-968X.12321</w:t>
       </w:r>
       <w:bookmarkEnd w:id="56"/>
     </w:p>
@@ -19262,22 +20011,22 @@
         </w:numPr>
         <w:pStyle w:val="Compact"/>
       </w:pPr>
-      <w:bookmarkStart w:id="57" w:name="r5"/>
-      <w:r>
-        <w:t xml:space="preserve">Doerfer, G. (1973).</w:t>
-      </w:r>
-      <w:r>
-        <w:t xml:space="preserve"> </w:t>
-      </w:r>
-      <w:r>
-        <w:rPr>
-          <w:iCs/>
-          <w:i/>
-        </w:rPr>
-        <w:t xml:space="preserve">Lautgesetz und Zufall: Betrachtungen zum Omnicomparatismus</w:t>
-      </w:r>
-      <w:r>
-        <w:t xml:space="preserve">. Innsbrucker Beiträge zur Sprachwissenschaft 10. Innsbruck.</w:t>
+      <w:bookmarkStart w:id="57" w:name="r4"/>
+      <w:r>
+        <w:t xml:space="preserve">Clauson, G. (1972).</w:t>
+      </w:r>
+      <w:r>
+        <w:t xml:space="preserve"> </w:t>
+      </w:r>
+      <w:r>
+        <w:rPr>
+          <w:iCs/>
+          <w:i/>
+        </w:rPr>
+        <w:t xml:space="preserve">An Etymological Dictionary of Pre-Thirteenth-Century Turkish</w:t>
+      </w:r>
+      <w:r>
+        <w:t xml:space="preserve">. Oxford: Clarendon Press.</w:t>
       </w:r>
       <w:bookmarkEnd w:id="57"/>
     </w:p>
@@ -19289,25 +20038,22 @@
         </w:numPr>
         <w:pStyle w:val="Compact"/>
       </w:pPr>
-      <w:bookmarkStart w:id="58" w:name="r6"/>
-      <w:r>
-        <w:t xml:space="preserve">Doerfer, G. (1973). Zur Sprache der Hunnen.</w:t>
-      </w:r>
-      <w:r>
-        <w:t xml:space="preserve"> </w:t>
-      </w:r>
-      <w:r>
-        <w:rPr>
-          <w:iCs/>
-          <w:i/>
-        </w:rPr>
-        <w:t xml:space="preserve">Central Asiatic Journal</w:t>
-      </w:r>
-      <w:r>
-        <w:t xml:space="preserve"> </w:t>
-      </w:r>
-      <w:r>
-        <w:t xml:space="preserve">17: 1–50.</w:t>
+      <w:bookmarkStart w:id="58" w:name="r5"/>
+      <w:r>
+        <w:t xml:space="preserve">Doerfer, G. (1973).</w:t>
+      </w:r>
+      <w:r>
+        <w:t xml:space="preserve"> </w:t>
+      </w:r>
+      <w:r>
+        <w:rPr>
+          <w:iCs/>
+          <w:i/>
+        </w:rPr>
+        <w:t xml:space="preserve">Lautgesetz und Zufall: Betrachtungen zum Omnicomparatismus</w:t>
+      </w:r>
+      <w:r>
+        <w:t xml:space="preserve">. Innsbrucker Beiträge zur Sprachwissenschaft 10. Innsbruck.</w:t>
       </w:r>
       <w:bookmarkEnd w:id="58"/>
     </w:p>
@@ -19319,22 +20065,25 @@
         </w:numPr>
         <w:pStyle w:val="Compact"/>
       </w:pPr>
-      <w:bookmarkStart w:id="59" w:name="r7"/>
-      <w:r>
-        <w:t xml:space="preserve">Erdal, M. (2004).</w:t>
-      </w:r>
-      <w:r>
-        <w:t xml:space="preserve"> </w:t>
-      </w:r>
-      <w:r>
-        <w:rPr>
-          <w:iCs/>
-          <w:i/>
-        </w:rPr>
-        <w:t xml:space="preserve">A Grammar of Old Turkic</w:t>
-      </w:r>
-      <w:r>
-        <w:t xml:space="preserve">. Leiden: Brill.</w:t>
+      <w:bookmarkStart w:id="59" w:name="r6"/>
+      <w:r>
+        <w:t xml:space="preserve">Doerfer, G. (1973). Zur Sprache der Hunnen.</w:t>
+      </w:r>
+      <w:r>
+        <w:t xml:space="preserve"> </w:t>
+      </w:r>
+      <w:r>
+        <w:rPr>
+          <w:iCs/>
+          <w:i/>
+        </w:rPr>
+        <w:t xml:space="preserve">Central Asiatic Journal</w:t>
+      </w:r>
+      <w:r>
+        <w:t xml:space="preserve"> </w:t>
+      </w:r>
+      <w:r>
+        <w:t xml:space="preserve">17: 1–50.</w:t>
       </w:r>
       <w:bookmarkEnd w:id="59"/>
     </w:p>
@@ -19346,41 +20095,22 @@
         </w:numPr>
         <w:pStyle w:val="Compact"/>
       </w:pPr>
-      <w:bookmarkStart w:id="60" w:name="r8"/>
-      <w:r>
-        <w:t xml:space="preserve">Georg, S. (2001). Türkisch/Mongolisch</w:t>
-      </w:r>
-      <w:r>
-        <w:t xml:space="preserve"> </w:t>
-      </w:r>
-      <w:r>
-        <w:rPr>
-          <w:iCs/>
-          <w:i/>
-        </w:rPr>
-        <w:t xml:space="preserve">tengri</w:t>
-      </w:r>
-      <w:r>
-        <w:t xml:space="preserve"> </w:t>
-      </w:r>
-      <w:r>
-        <w:t xml:space="preserve">'Himmel, Gott' und seine Herkunft.</w:t>
-      </w:r>
-      <w:r>
-        <w:t xml:space="preserve"> </w:t>
-      </w:r>
-      <w:r>
-        <w:rPr>
-          <w:iCs/>
-          <w:i/>
-        </w:rPr>
-        <w:t xml:space="preserve">Studia Etymologica Cracoviensia</w:t>
-      </w:r>
-      <w:r>
-        <w:t xml:space="preserve"> </w:t>
-      </w:r>
-      <w:r>
-        <w:t xml:space="preserve">6: 83–100.</w:t>
+      <w:bookmarkStart w:id="60" w:name="r7"/>
+      <w:r>
+        <w:t xml:space="preserve">Erdal, M. (2004).</w:t>
+      </w:r>
+      <w:r>
+        <w:t xml:space="preserve"> </w:t>
+      </w:r>
+      <w:r>
+        <w:rPr>
+          <w:iCs/>
+          <w:i/>
+        </w:rPr>
+        <w:t xml:space="preserve">A Grammar of Old Turkic</w:t>
+      </w:r>
+      <w:r>
+        <w:t xml:space="preserve">. Leiden: Brill.</w:t>
       </w:r>
       <w:bookmarkEnd w:id="60"/>
     </w:p>
@@ -19392,22 +20122,41 @@
         </w:numPr>
         <w:pStyle w:val="Compact"/>
       </w:pPr>
-      <w:bookmarkStart w:id="61" w:name="r9"/>
-      <w:r>
-        <w:t xml:space="preserve">Golden, P. B. (1992).</w:t>
-      </w:r>
-      <w:r>
-        <w:t xml:space="preserve"> </w:t>
-      </w:r>
-      <w:r>
-        <w:rPr>
-          <w:iCs/>
-          <w:i/>
-        </w:rPr>
-        <w:t xml:space="preserve">An Introduction to the History of the Turkic Peoples</w:t>
-      </w:r>
-      <w:r>
-        <w:t xml:space="preserve">. Wiesbaden: Harrassowitz. Page references are to the 2011 printing.</w:t>
+      <w:bookmarkStart w:id="61" w:name="r8"/>
+      <w:r>
+        <w:t xml:space="preserve">Georg, S. (2001). Türkisch/Mongolisch</w:t>
+      </w:r>
+      <w:r>
+        <w:t xml:space="preserve"> </w:t>
+      </w:r>
+      <w:r>
+        <w:rPr>
+          <w:iCs/>
+          <w:i/>
+        </w:rPr>
+        <w:t xml:space="preserve">tengri</w:t>
+      </w:r>
+      <w:r>
+        <w:t xml:space="preserve"> </w:t>
+      </w:r>
+      <w:r>
+        <w:t xml:space="preserve">'Himmel, Gott' und seine Herkunft.</w:t>
+      </w:r>
+      <w:r>
+        <w:t xml:space="preserve"> </w:t>
+      </w:r>
+      <w:r>
+        <w:rPr>
+          <w:iCs/>
+          <w:i/>
+        </w:rPr>
+        <w:t xml:space="preserve">Studia Etymologica Cracoviensia</w:t>
+      </w:r>
+      <w:r>
+        <w:t xml:space="preserve"> </w:t>
+      </w:r>
+      <w:r>
+        <w:t xml:space="preserve">6: 83–100.</w:t>
       </w:r>
       <w:bookmarkEnd w:id="61"/>
     </w:p>
@@ -19419,9 +20168,22 @@
         </w:numPr>
         <w:pStyle w:val="Compact"/>
       </w:pPr>
-      <w:bookmarkStart w:id="62" w:name="r10"/>
-      <w:r>
-        <w:t xml:space="preserve">Hú Zhènhuá &amp; Huáng Rùnhuá (1984). 《高昌舘杂字：明代汉文回鹘文分类词汇》. Běijīng: Mínzú chūbǎnshè.</w:t>
+      <w:bookmarkStart w:id="62" w:name="r9"/>
+      <w:r>
+        <w:t xml:space="preserve">Golden, P. B. (1992).</w:t>
+      </w:r>
+      <w:r>
+        <w:t xml:space="preserve"> </w:t>
+      </w:r>
+      <w:r>
+        <w:rPr>
+          <w:iCs/>
+          <w:i/>
+        </w:rPr>
+        <w:t xml:space="preserve">An Introduction to the History of the Turkic Peoples</w:t>
+      </w:r>
+      <w:r>
+        <w:t xml:space="preserve">. Wiesbaden: Harrassowitz. Page references are to the 2011 printing.</w:t>
       </w:r>
       <w:bookmarkEnd w:id="62"/>
     </w:p>
@@ -19433,53 +20195,9 @@
         </w:numPr>
         <w:pStyle w:val="Compact"/>
       </w:pPr>
-      <w:bookmarkStart w:id="63" w:name="r11"/>
-      <w:r>
-        <w:t xml:space="preserve">Hirth, F. (1908).</w:t>
-      </w:r>
-      <w:r>
-        <w:t xml:space="preserve"> </w:t>
-      </w:r>
-      <w:r>
-        <w:rPr>
-          <w:iCs/>
-          <w:i/>
-        </w:rPr>
-        <w:t xml:space="preserve">The Ancient History of China to the End of the Chóu Dynasty</w:t>
-      </w:r>
-      <w:r>
-        <w:t xml:space="preserve">. New York: Columbia University Press. (Comparison of</w:t>
-      </w:r>
-      <w:r>
-        <w:t xml:space="preserve"> </w:t>
-      </w:r>
-      <w:r>
-        <w:t xml:space="preserve">徑路</w:t>
-      </w:r>
-      <w:r>
-        <w:t xml:space="preserve"> </w:t>
-      </w:r>
-      <w:r>
-        <w:t xml:space="preserve">with Turkic</w:t>
-      </w:r>
-      <w:r>
-        <w:t xml:space="preserve"> </w:t>
-      </w:r>
-      <w:r>
-        <w:rPr>
-          <w:iCs/>
-          <w:i/>
-        </w:rPr>
-        <w:t xml:space="preserve">kıŋrak</w:t>
-      </w:r>
-      <w:r>
-        <w:t xml:space="preserve">, pp. 66–67, checked</w:t>
-      </w:r>
-      <w:r>
-        <w:t xml:space="preserve"> </w:t>
-      </w:r>
-      <w:r>
-        <w:t xml:space="preserve">against the text.)</w:t>
+      <w:bookmarkStart w:id="63" w:name="r10"/>
+      <w:r>
+        <w:t xml:space="preserve">Hú Zhènhuá &amp; Huáng Rùnhuá (1984). 《高昌舘杂字：明代汉文回鹘文分类词汇》. Běijīng: Mínzú chūbǎnshè.</w:t>
       </w:r>
       <w:bookmarkEnd w:id="63"/>
     </w:p>
@@ -19491,32 +20209,53 @@
         </w:numPr>
         <w:pStyle w:val="Compact"/>
       </w:pPr>
-      <w:bookmarkStart w:id="64" w:name="r12"/>
-      <w:r>
-        <w:t xml:space="preserve">Kāşgarlı Mahmud (1072–77).</w:t>
-      </w:r>
-      <w:r>
-        <w:t xml:space="preserve"> </w:t>
-      </w:r>
-      <w:r>
-        <w:rPr>
-          <w:iCs/>
-          <w:i/>
-        </w:rPr>
-        <w:t xml:space="preserve">Dīwān Lughāt al-Turk</w:t>
-      </w:r>
-      <w:r>
-        <w:t xml:space="preserve">. Index volume (</w:t>
-      </w:r>
-      <w:r>
-        <w:rPr>
-          <w:iCs/>
-          <w:i/>
-        </w:rPr>
-        <w:t xml:space="preserve">Dizin</w:t>
-      </w:r>
-      <w:r>
-        <w:t xml:space="preserve">), Türk Dil Kurumu Yayınları.</w:t>
+      <w:bookmarkStart w:id="64" w:name="r11"/>
+      <w:r>
+        <w:t xml:space="preserve">Hirth, F. (1908).</w:t>
+      </w:r>
+      <w:r>
+        <w:t xml:space="preserve"> </w:t>
+      </w:r>
+      <w:r>
+        <w:rPr>
+          <w:iCs/>
+          <w:i/>
+        </w:rPr>
+        <w:t xml:space="preserve">The Ancient History of China to the End of the Chóu Dynasty</w:t>
+      </w:r>
+      <w:r>
+        <w:t xml:space="preserve">. New York: Columbia University Press. (Comparison of</w:t>
+      </w:r>
+      <w:r>
+        <w:t xml:space="preserve"> </w:t>
+      </w:r>
+      <w:r>
+        <w:t xml:space="preserve">徑路</w:t>
+      </w:r>
+      <w:r>
+        <w:t xml:space="preserve"> </w:t>
+      </w:r>
+      <w:r>
+        <w:t xml:space="preserve">with Turkic</w:t>
+      </w:r>
+      <w:r>
+        <w:t xml:space="preserve"> </w:t>
+      </w:r>
+      <w:r>
+        <w:rPr>
+          <w:iCs/>
+          <w:i/>
+        </w:rPr>
+        <w:t xml:space="preserve">kıŋrak</w:t>
+      </w:r>
+      <w:r>
+        <w:t xml:space="preserve">, pp. 66–67, checked</w:t>
+      </w:r>
+      <w:r>
+        <w:t xml:space="preserve"> </w:t>
+      </w:r>
+      <w:r>
+        <w:t xml:space="preserve">against the text.)</w:t>
       </w:r>
       <w:bookmarkEnd w:id="64"/>
     </w:p>
@@ -19528,22 +20267,45 @@
         </w:numPr>
         <w:pStyle w:val="Compact"/>
       </w:pPr>
-      <w:bookmarkStart w:id="65" w:name="r13"/>
-      <w:r>
-        <w:t xml:space="preserve">Kergalym (2021).</w:t>
-      </w:r>
-      <w:r>
-        <w:t xml:space="preserve"> </w:t>
-      </w:r>
-      <w:r>
-        <w:rPr>
-          <w:iCs/>
-          <w:i/>
-        </w:rPr>
-        <w:t xml:space="preserve">myspell-kk</w:t>
-      </w:r>
-      <w:r>
-        <w:t xml:space="preserve">: a Myspell/Hunspell spelling dictionary for Kazakh [dataset]. github.com/kergalym/myspell-kk. 53,182 headwords; romanised on load.</w:t>
+      <w:bookmarkStart w:id="65" w:name="r12"/>
+      <w:r>
+        <w:t xml:space="preserve">Kāşgarlı Mahmud (1072–77).</w:t>
+      </w:r>
+      <w:r>
+        <w:t xml:space="preserve"> </w:t>
+      </w:r>
+      <w:r>
+        <w:rPr>
+          <w:iCs/>
+          <w:i/>
+        </w:rPr>
+        <w:t xml:space="preserve">Dīwān Lughāt al-Turk</w:t>
+      </w:r>
+      <w:r>
+        <w:t xml:space="preserve">. Index volume (</w:t>
+      </w:r>
+      <w:r>
+        <w:rPr>
+          <w:iCs/>
+          <w:i/>
+        </w:rPr>
+        <w:t xml:space="preserve">Dizin</w:t>
+      </w:r>
+      <w:r>
+        <w:t xml:space="preserve">), Türk Dil Kurumu Yayınları. English translation used here: Dankoff, R. &amp; Kelly, J., ed. and tr. (1982–85),</w:t>
+      </w:r>
+      <w:r>
+        <w:t xml:space="preserve"> </w:t>
+      </w:r>
+      <w:r>
+        <w:rPr>
+          <w:iCs/>
+          <w:i/>
+        </w:rPr>
+        <w:t xml:space="preserve">Maḥmūd al-Kāšγarī: Compendium of the Turkic Dialects (Dīwān Luγāt at-Turk)</w:t>
+      </w:r>
+      <w:r>
+        <w:t xml:space="preserve">, 3 vols., Sources of Oriental Languages and Literatures 7, Harvard University Printing Office.</w:t>
       </w:r>
       <w:bookmarkEnd w:id="65"/>
     </w:p>
@@ -19555,22 +20317,22 @@
         </w:numPr>
         <w:pStyle w:val="Compact"/>
       </w:pPr>
-      <w:bookmarkStart w:id="66" w:name="r14"/>
-      <w:r>
-        <w:t xml:space="preserve">Kuun, G., ed. (1880).</w:t>
-      </w:r>
-      <w:r>
-        <w:t xml:space="preserve"> </w:t>
-      </w:r>
-      <w:r>
-        <w:rPr>
-          <w:iCs/>
-          <w:i/>
-        </w:rPr>
-        <w:t xml:space="preserve">Codex Cumanicus Bibliothecæ ad Templum Divi Marci Venetiarum</w:t>
-      </w:r>
-      <w:r>
-        <w:t xml:space="preserve">. Budapest: Editio Scient. Academiæ Hung. Public domain.</w:t>
+      <w:bookmarkStart w:id="66" w:name="r13"/>
+      <w:r>
+        <w:t xml:space="preserve">Kergalym (2021).</w:t>
+      </w:r>
+      <w:r>
+        <w:t xml:space="preserve"> </w:t>
+      </w:r>
+      <w:r>
+        <w:rPr>
+          <w:iCs/>
+          <w:i/>
+        </w:rPr>
+        <w:t xml:space="preserve">myspell-kk</w:t>
+      </w:r>
+      <w:r>
+        <w:t xml:space="preserve">: a Myspell/Hunspell spelling dictionary for Kazakh [dataset]. github.com/kergalym/myspell-kk. 53,182 headwords; romanised on load.</w:t>
       </w:r>
       <w:bookmarkEnd w:id="66"/>
     </w:p>
@@ -19582,25 +20344,22 @@
         </w:numPr>
         <w:pStyle w:val="Compact"/>
       </w:pPr>
-      <w:bookmarkStart w:id="67" w:name="r15"/>
-      <w:r>
-        <w:t xml:space="preserve">Altmann, G. (1974). Lautgesetz und Zufall [review of Doerfer 1973].</w:t>
-      </w:r>
-      <w:r>
-        <w:t xml:space="preserve"> </w:t>
-      </w:r>
-      <w:r>
-        <w:rPr>
-          <w:iCs/>
-          <w:i/>
-        </w:rPr>
-        <w:t xml:space="preserve">Anthropos</w:t>
-      </w:r>
-      <w:r>
-        <w:t xml:space="preserve"> </w:t>
-      </w:r>
-      <w:r>
-        <w:t xml:space="preserve">69: 263–271. JSTOR 40458521.</w:t>
+      <w:bookmarkStart w:id="67" w:name="r14"/>
+      <w:r>
+        <w:t xml:space="preserve">Kuun, G., ed. (1880).</w:t>
+      </w:r>
+      <w:r>
+        <w:t xml:space="preserve"> </w:t>
+      </w:r>
+      <w:r>
+        <w:rPr>
+          <w:iCs/>
+          <w:i/>
+        </w:rPr>
+        <w:t xml:space="preserve">Codex Cumanicus Bibliothecæ ad Templum Divi Marci Venetiarum</w:t>
+      </w:r>
+      <w:r>
+        <w:t xml:space="preserve">. Budapest: Editio Scient. Academiæ Hung. Public domain.</w:t>
       </w:r>
       <w:bookmarkEnd w:id="67"/>
     </w:p>
@@ -19612,25 +20371,25 @@
         </w:numPr>
         <w:pStyle w:val="Compact"/>
       </w:pPr>
-      <w:bookmarkStart w:id="68" w:name="r16"/>
-      <w:r>
-        <w:t xml:space="preserve">Lee, J. et al. (2023). Genetic population structure of the Xiongnu Empire at imperial and local scales.</w:t>
-      </w:r>
-      <w:r>
-        <w:t xml:space="preserve"> </w:t>
-      </w:r>
-      <w:r>
-        <w:rPr>
-          <w:iCs/>
-          <w:i/>
-        </w:rPr>
-        <w:t xml:space="preserve">Science Advances</w:t>
-      </w:r>
-      <w:r>
-        <w:t xml:space="preserve"> </w:t>
-      </w:r>
-      <w:r>
-        <w:t xml:space="preserve">9(15). doi:10.1126/sciadv.adf3904</w:t>
+      <w:bookmarkStart w:id="68" w:name="r15"/>
+      <w:r>
+        <w:t xml:space="preserve">Altmann, G. (1974). Lautgesetz und Zufall [review of Doerfer 1973].</w:t>
+      </w:r>
+      <w:r>
+        <w:t xml:space="preserve"> </w:t>
+      </w:r>
+      <w:r>
+        <w:rPr>
+          <w:iCs/>
+          <w:i/>
+        </w:rPr>
+        <w:t xml:space="preserve">Anthropos</w:t>
+      </w:r>
+      <w:r>
+        <w:t xml:space="preserve"> </w:t>
+      </w:r>
+      <w:r>
+        <w:t xml:space="preserve">69: 263–271. JSTOR 40458521.</w:t>
       </w:r>
       <w:bookmarkEnd w:id="68"/>
     </w:p>
@@ -19642,25 +20401,25 @@
         </w:numPr>
         <w:pStyle w:val="Compact"/>
       </w:pPr>
-      <w:bookmarkStart w:id="69" w:name="r17"/>
-      <w:r>
-        <w:t xml:space="preserve">Ligeti, L. (1966). Un vocabulaire sino-ouigour des Ming.</w:t>
-      </w:r>
-      <w:r>
-        <w:t xml:space="preserve"> </w:t>
-      </w:r>
-      <w:r>
-        <w:rPr>
-          <w:iCs/>
-          <w:i/>
-        </w:rPr>
-        <w:t xml:space="preserve">Acta Orientalia Academiae Scientiarum Hungaricae</w:t>
-      </w:r>
-      <w:r>
-        <w:t xml:space="preserve"> </w:t>
-      </w:r>
-      <w:r>
-        <w:t xml:space="preserve">19: 117–199, 257–316.</w:t>
+      <w:bookmarkStart w:id="69" w:name="r16"/>
+      <w:r>
+        <w:t xml:space="preserve">Lee, J. et al. (2023). Genetic population structure of the Xiongnu Empire at imperial and local scales.</w:t>
+      </w:r>
+      <w:r>
+        <w:t xml:space="preserve"> </w:t>
+      </w:r>
+      <w:r>
+        <w:rPr>
+          <w:iCs/>
+          <w:i/>
+        </w:rPr>
+        <w:t xml:space="preserve">Science Advances</w:t>
+      </w:r>
+      <w:r>
+        <w:t xml:space="preserve"> </w:t>
+      </w:r>
+      <w:r>
+        <w:t xml:space="preserve">9(15). doi:10.1126/sciadv.adf3904</w:t>
       </w:r>
       <w:bookmarkEnd w:id="69"/>
     </w:p>
@@ -19672,25 +20431,25 @@
         </w:numPr>
         <w:pStyle w:val="Compact"/>
       </w:pPr>
-      <w:bookmarkStart w:id="70" w:name="r18"/>
-      <w:r>
-        <w:t xml:space="preserve">Ligeti, L. (1969). Glossaire supplémentaire au vocabulaire sino-ouigour du Bureau des Traducteurs.</w:t>
-      </w:r>
-      <w:r>
-        <w:t xml:space="preserve"> </w:t>
-      </w:r>
-      <w:r>
-        <w:rPr>
-          <w:iCs/>
-          <w:i/>
-        </w:rPr>
-        <w:t xml:space="preserve">Acta Orientalia ASH</w:t>
-      </w:r>
-      <w:r>
-        <w:t xml:space="preserve"> </w:t>
-      </w:r>
-      <w:r>
-        <w:t xml:space="preserve">22: 1–49, 191–243.</w:t>
+      <w:bookmarkStart w:id="70" w:name="r17"/>
+      <w:r>
+        <w:t xml:space="preserve">Ligeti, L. (1966). Un vocabulaire sino-ouigour des Ming.</w:t>
+      </w:r>
+      <w:r>
+        <w:t xml:space="preserve"> </w:t>
+      </w:r>
+      <w:r>
+        <w:rPr>
+          <w:iCs/>
+          <w:i/>
+        </w:rPr>
+        <w:t xml:space="preserve">Acta Orientalia Academiae Scientiarum Hungaricae</w:t>
+      </w:r>
+      <w:r>
+        <w:t xml:space="preserve"> </w:t>
+      </w:r>
+      <w:r>
+        <w:t xml:space="preserve">19: 117–199, 257–316.</w:t>
       </w:r>
       <w:bookmarkEnd w:id="70"/>
     </w:p>
@@ -19702,25 +20461,25 @@
         </w:numPr>
         <w:pStyle w:val="Compact"/>
       </w:pPr>
-      <w:bookmarkStart w:id="71" w:name="r19"/>
-      <w:r>
-        <w:t xml:space="preserve">Pulleyblank, E. G. (1962). The consonantal system of Old Chinese.</w:t>
-      </w:r>
-      <w:r>
-        <w:t xml:space="preserve"> </w:t>
-      </w:r>
-      <w:r>
-        <w:rPr>
-          <w:iCs/>
-          <w:i/>
-        </w:rPr>
-        <w:t xml:space="preserve">Asia Major</w:t>
-      </w:r>
-      <w:r>
-        <w:t xml:space="preserve"> </w:t>
-      </w:r>
-      <w:r>
-        <w:t xml:space="preserve">9: 58–144, 206–265.</w:t>
+      <w:bookmarkStart w:id="71" w:name="r18"/>
+      <w:r>
+        <w:t xml:space="preserve">Ligeti, L. (1969). Glossaire supplémentaire au vocabulaire sino-ouigour du Bureau des Traducteurs.</w:t>
+      </w:r>
+      <w:r>
+        <w:t xml:space="preserve"> </w:t>
+      </w:r>
+      <w:r>
+        <w:rPr>
+          <w:iCs/>
+          <w:i/>
+        </w:rPr>
+        <w:t xml:space="preserve">Acta Orientalia ASH</w:t>
+      </w:r>
+      <w:r>
+        <w:t xml:space="preserve"> </w:t>
+      </w:r>
+      <w:r>
+        <w:t xml:space="preserve">22: 1–49, 191–243.</w:t>
       </w:r>
       <w:bookmarkEnd w:id="71"/>
     </w:p>
@@ -19732,22 +20491,25 @@
         </w:numPr>
         <w:pStyle w:val="Compact"/>
       </w:pPr>
-      <w:bookmarkStart w:id="72" w:name="r20"/>
-      <w:r>
-        <w:t xml:space="preserve">Pulleyblank, E. G. (1991).</w:t>
-      </w:r>
-      <w:r>
-        <w:t xml:space="preserve"> </w:t>
-      </w:r>
-      <w:r>
-        <w:rPr>
-          <w:iCs/>
-          <w:i/>
-        </w:rPr>
-        <w:t xml:space="preserve">Lexicon of Reconstructed Pronunciation in Early Middle Chinese, Late Middle Chinese, and Early Mandarin</w:t>
-      </w:r>
-      <w:r>
-        <w:t xml:space="preserve">. Vancouver: UBC Press.</w:t>
+      <w:bookmarkStart w:id="72" w:name="r19"/>
+      <w:r>
+        <w:t xml:space="preserve">Pulleyblank, E. G. (1962). The consonantal system of Old Chinese.</w:t>
+      </w:r>
+      <w:r>
+        <w:t xml:space="preserve"> </w:t>
+      </w:r>
+      <w:r>
+        <w:rPr>
+          <w:iCs/>
+          <w:i/>
+        </w:rPr>
+        <w:t xml:space="preserve">Asia Major</w:t>
+      </w:r>
+      <w:r>
+        <w:t xml:space="preserve"> </w:t>
+      </w:r>
+      <w:r>
+        <w:t xml:space="preserve">9: 58–144, 206–265.</w:t>
       </w:r>
       <w:bookmarkEnd w:id="72"/>
     </w:p>
@@ -19759,25 +20521,22 @@
         </w:numPr>
         <w:pStyle w:val="Compact"/>
       </w:pPr>
-      <w:bookmarkStart w:id="73" w:name="r21"/>
-      <w:r>
-        <w:t xml:space="preserve">Savelyev, A. &amp; Jeong, C. (2020). Early nomads of the Eastern Steppe and their tentative connections in the West.</w:t>
-      </w:r>
-      <w:r>
-        <w:t xml:space="preserve"> </w:t>
-      </w:r>
-      <w:r>
-        <w:rPr>
-          <w:iCs/>
-          <w:i/>
-        </w:rPr>
-        <w:t xml:space="preserve">Evolutionary Human Sciences</w:t>
-      </w:r>
-      <w:r>
-        <w:t xml:space="preserve"> </w:t>
-      </w:r>
-      <w:r>
-        <w:t xml:space="preserve">2, e20.</w:t>
+      <w:bookmarkStart w:id="73" w:name="r20"/>
+      <w:r>
+        <w:t xml:space="preserve">Pulleyblank, E. G. (1991).</w:t>
+      </w:r>
+      <w:r>
+        <w:t xml:space="preserve"> </w:t>
+      </w:r>
+      <w:r>
+        <w:rPr>
+          <w:iCs/>
+          <w:i/>
+        </w:rPr>
+        <w:t xml:space="preserve">Lexicon of Reconstructed Pronunciation in Early Middle Chinese, Late Middle Chinese, and Early Mandarin</w:t>
+      </w:r>
+      <w:r>
+        <w:t xml:space="preserve">. Vancouver: UBC Press.</w:t>
       </w:r>
       <w:bookmarkEnd w:id="73"/>
     </w:p>
@@ -19789,22 +20548,25 @@
         </w:numPr>
         <w:pStyle w:val="Compact"/>
       </w:pPr>
-      <w:bookmarkStart w:id="74" w:name="r22"/>
-      <w:r>
-        <w:t xml:space="preserve">Schuessler, A. (2009).</w:t>
-      </w:r>
-      <w:r>
-        <w:t xml:space="preserve"> </w:t>
-      </w:r>
-      <w:r>
-        <w:rPr>
-          <w:iCs/>
-          <w:i/>
-        </w:rPr>
-        <w:t xml:space="preserve">Minimal Old Chinese and Later Han Chinese</w:t>
-      </w:r>
-      <w:r>
-        <w:t xml:space="preserve">. Honolulu: University of Hawai'i Press. Data release: Zenodo, doi:10.5281/zenodo.14567004</w:t>
+      <w:bookmarkStart w:id="74" w:name="r21"/>
+      <w:r>
+        <w:t xml:space="preserve">Savelyev, A. &amp; Jeong, C. (2020). Early nomads of the Eastern Steppe and their tentative connections in the West.</w:t>
+      </w:r>
+      <w:r>
+        <w:t xml:space="preserve"> </w:t>
+      </w:r>
+      <w:r>
+        <w:rPr>
+          <w:iCs/>
+          <w:i/>
+        </w:rPr>
+        <w:t xml:space="preserve">Evolutionary Human Sciences</w:t>
+      </w:r>
+      <w:r>
+        <w:t xml:space="preserve"> </w:t>
+      </w:r>
+      <w:r>
+        <w:t xml:space="preserve">2, e20.</w:t>
       </w:r>
       <w:bookmarkEnd w:id="74"/>
     </w:p>
@@ -19816,22 +20578,22 @@
         </w:numPr>
         <w:pStyle w:val="Compact"/>
       </w:pPr>
-      <w:bookmarkStart w:id="75" w:name="r23"/>
-      <w:r>
-        <w:t xml:space="preserve">Speer, R. (2022).</w:t>
-      </w:r>
-      <w:r>
-        <w:t xml:space="preserve"> </w:t>
-      </w:r>
-      <w:r>
-        <w:rPr>
-          <w:iCs/>
-          <w:i/>
-        </w:rPr>
-        <w:t xml:space="preserve">wordfreq</w:t>
-      </w:r>
-      <w:r>
-        <w:t xml:space="preserve">: word frequency data for 40+ languages, v3 [software]. Zenodo, doi:10.5281/zenodo.7199437</w:t>
+      <w:bookmarkStart w:id="75" w:name="r22"/>
+      <w:r>
+        <w:t xml:space="preserve">Schuessler, A. (2009).</w:t>
+      </w:r>
+      <w:r>
+        <w:t xml:space="preserve"> </w:t>
+      </w:r>
+      <w:r>
+        <w:rPr>
+          <w:iCs/>
+          <w:i/>
+        </w:rPr>
+        <w:t xml:space="preserve">Minimal Old Chinese and Later Han Chinese</w:t>
+      </w:r>
+      <w:r>
+        <w:t xml:space="preserve">. Honolulu: University of Hawai'i Press. Data release: Zenodo, doi:10.5281/zenodo.14567004</w:t>
       </w:r>
       <w:bookmarkEnd w:id="75"/>
     </w:p>
@@ -19843,22 +20605,22 @@
         </w:numPr>
         <w:pStyle w:val="Compact"/>
       </w:pPr>
-      <w:bookmarkStart w:id="76" w:name="r24"/>
-      <w:r>
-        <w:t xml:space="preserve">Tan, Y. Y. (2019).</w:t>
-      </w:r>
-      <w:r>
-        <w:t xml:space="preserve"> </w:t>
-      </w:r>
-      <w:r>
-        <w:rPr>
-          <w:iCs/>
-          <w:i/>
-        </w:rPr>
-        <w:t xml:space="preserve">Consonant Endings of Míng Dynasty Mandarin as Reflected in the Chinese Transcriptions of Uyghur Vocabulary</w:t>
-      </w:r>
-      <w:r>
-        <w:t xml:space="preserve">. MA thesis, University of Washington.</w:t>
+      <w:bookmarkStart w:id="76" w:name="r23"/>
+      <w:r>
+        <w:t xml:space="preserve">Speer, R. (2022).</w:t>
+      </w:r>
+      <w:r>
+        <w:t xml:space="preserve"> </w:t>
+      </w:r>
+      <w:r>
+        <w:rPr>
+          <w:iCs/>
+          <w:i/>
+        </w:rPr>
+        <w:t xml:space="preserve">wordfreq</w:t>
+      </w:r>
+      <w:r>
+        <w:t xml:space="preserve">: word frequency data for 40+ languages, v3 [software]. Zenodo, doi:10.5281/zenodo.7199437</w:t>
       </w:r>
       <w:bookmarkEnd w:id="76"/>
     </w:p>
@@ -19870,22 +20632,22 @@
         </w:numPr>
         <w:pStyle w:val="Compact"/>
       </w:pPr>
-      <w:bookmarkStart w:id="77" w:name="r25"/>
-      <w:r>
-        <w:t xml:space="preserve">tdd-ai (2020).</w:t>
-      </w:r>
-      <w:r>
-        <w:t xml:space="preserve"> </w:t>
-      </w:r>
-      <w:r>
-        <w:rPr>
-          <w:iCs/>
-          <w:i/>
-        </w:rPr>
-        <w:t xml:space="preserve">hunspell-tr</w:t>
-      </w:r>
-      <w:r>
-        <w:t xml:space="preserve">: a Hunspell spelling dictionary for Turkish [dataset]. github.com/tdd-ai/hunspell-tr. 292,000 forms, reduced to 21,721 by the frequency filter.</w:t>
+      <w:bookmarkStart w:id="77" w:name="r24"/>
+      <w:r>
+        <w:t xml:space="preserve">Tan, Y. Y. (2019).</w:t>
+      </w:r>
+      <w:r>
+        <w:t xml:space="preserve"> </w:t>
+      </w:r>
+      <w:r>
+        <w:rPr>
+          <w:iCs/>
+          <w:i/>
+        </w:rPr>
+        <w:t xml:space="preserve">Consonant Endings of Míng Dynasty Mandarin as Reflected in the Chinese Transcriptions of Uyghur Vocabulary</w:t>
+      </w:r>
+      <w:r>
+        <w:t xml:space="preserve">. MA thesis, University of Washington.</w:t>
       </w:r>
       <w:bookmarkEnd w:id="77"/>
     </w:p>
@@ -19897,22 +20659,22 @@
         </w:numPr>
         <w:pStyle w:val="Compact"/>
       </w:pPr>
-      <w:bookmarkStart w:id="78" w:name="r26"/>
-      <w:r>
-        <w:t xml:space="preserve">Uluğ, A. M. (2026).</w:t>
-      </w:r>
-      <w:r>
-        <w:t xml:space="preserve"> </w:t>
-      </w:r>
-      <w:r>
-        <w:rPr>
-          <w:iCs/>
-          <w:i/>
-        </w:rPr>
-        <w:t xml:space="preserve">chinese-transcription-channel</w:t>
-      </w:r>
-      <w:r>
-        <w:t xml:space="preserve">: corpora, lexicons, channel models, and evaluation code [software and data]. GitHub: github.com/ulug2004/chinese-transcription-channel</w:t>
+      <w:bookmarkStart w:id="78" w:name="r25"/>
+      <w:r>
+        <w:t xml:space="preserve">tdd-ai (2020).</w:t>
+      </w:r>
+      <w:r>
+        <w:t xml:space="preserve"> </w:t>
+      </w:r>
+      <w:r>
+        <w:rPr>
+          <w:iCs/>
+          <w:i/>
+        </w:rPr>
+        <w:t xml:space="preserve">hunspell-tr</w:t>
+      </w:r>
+      <w:r>
+        <w:t xml:space="preserve">: a Hunspell spelling dictionary for Turkish [dataset]. github.com/tdd-ai/hunspell-tr. 292,000 forms, reduced to 21,721 by the frequency filter.</w:t>
       </w:r>
       <w:bookmarkEnd w:id="78"/>
     </w:p>
@@ -19924,25 +20686,22 @@
         </w:numPr>
         <w:pStyle w:val="Compact"/>
       </w:pPr>
-      <w:bookmarkStart w:id="79" w:name="r27"/>
-      <w:r>
-        <w:t xml:space="preserve">Vovin, A. (2000). Did the Xiong-nu speak a Yeniseian language?</w:t>
-      </w:r>
-      <w:r>
-        <w:t xml:space="preserve"> </w:t>
-      </w:r>
-      <w:r>
-        <w:rPr>
-          <w:iCs/>
-          <w:i/>
-        </w:rPr>
-        <w:t xml:space="preserve">Central Asiatic Journal</w:t>
-      </w:r>
-      <w:r>
-        <w:t xml:space="preserve"> </w:t>
-      </w:r>
-      <w:r>
-        <w:t xml:space="preserve">44(1): 87–104.</w:t>
+      <w:bookmarkStart w:id="79" w:name="r26"/>
+      <w:r>
+        <w:t xml:space="preserve">Uluğ, A. M. (2026).</w:t>
+      </w:r>
+      <w:r>
+        <w:t xml:space="preserve"> </w:t>
+      </w:r>
+      <w:r>
+        <w:rPr>
+          <w:iCs/>
+          <w:i/>
+        </w:rPr>
+        <w:t xml:space="preserve">chinese-transcription-channel</w:t>
+      </w:r>
+      <w:r>
+        <w:t xml:space="preserve">: corpora, lexicons, channel models, and evaluation code [software and data]. GitHub: github.com/ulug2004/chinese-transcription-channel</w:t>
       </w:r>
       <w:bookmarkEnd w:id="79"/>
     </w:p>
@@ -19954,22 +20713,25 @@
         </w:numPr>
         <w:pStyle w:val="Compact"/>
       </w:pPr>
-      <w:bookmarkStart w:id="80" w:name="r28"/>
-      <w:r>
-        <w:t xml:space="preserve">Vovin, A. (2003). Did the Xiongnu speak a Yeniseian language? Part 2: Vocabulary. In</w:t>
-      </w:r>
-      <w:r>
-        <w:t xml:space="preserve"> </w:t>
-      </w:r>
-      <w:r>
-        <w:rPr>
-          <w:iCs/>
-          <w:i/>
-        </w:rPr>
-        <w:t xml:space="preserve">Altaica Budapestinensia MMII</w:t>
-      </w:r>
-      <w:r>
-        <w:t xml:space="preserve">, Proceedings of the 45th PIAC, Budapest, 389–394.</w:t>
+      <w:bookmarkStart w:id="80" w:name="r27"/>
+      <w:r>
+        <w:t xml:space="preserve">Vovin, A. (2000). Did the Xiong-nu speak a Yeniseian language?</w:t>
+      </w:r>
+      <w:r>
+        <w:t xml:space="preserve"> </w:t>
+      </w:r>
+      <w:r>
+        <w:rPr>
+          <w:iCs/>
+          <w:i/>
+        </w:rPr>
+        <w:t xml:space="preserve">Central Asiatic Journal</w:t>
+      </w:r>
+      <w:r>
+        <w:t xml:space="preserve"> </w:t>
+      </w:r>
+      <w:r>
+        <w:t xml:space="preserve">44(1): 87–104.</w:t>
       </w:r>
       <w:bookmarkEnd w:id="80"/>
     </w:p>
@@ -19981,14 +20743,41 @@
         </w:numPr>
         <w:pStyle w:val="Compact"/>
       </w:pPr>
-      <w:bookmarkStart w:id="81" w:name="r29"/>
-      <w:r>
-        <w:t xml:space="preserve">Wittek, A. et al. (2020). ASJP Database v19. Zenodo, doi:10.5281/zenodo.3843469</w:t>
+      <w:bookmarkStart w:id="81" w:name="r28"/>
+      <w:r>
+        <w:t xml:space="preserve">Vovin, A. (2003). Did the Xiongnu speak a Yeniseian language? Part 2: Vocabulary. In</w:t>
+      </w:r>
+      <w:r>
+        <w:t xml:space="preserve"> </w:t>
+      </w:r>
+      <w:r>
+        <w:rPr>
+          <w:iCs/>
+          <w:i/>
+        </w:rPr>
+        <w:t xml:space="preserve">Altaica Budapestinensia MMII</w:t>
+      </w:r>
+      <w:r>
+        <w:t xml:space="preserve">, Proceedings of the 45th PIAC, Budapest, 389–394.</w:t>
       </w:r>
       <w:bookmarkEnd w:id="81"/>
     </w:p>
-    <w:bookmarkEnd w:id="82"/>
+    <w:p>
+      <w:pPr>
+        <w:numPr>
+          <w:ilvl w:val="0"/>
+          <w:numId w:val="1003"/>
+        </w:numPr>
+        <w:pStyle w:val="Compact"/>
+      </w:pPr>
+      <w:bookmarkStart w:id="82" w:name="r29"/>
+      <w:r>
+        <w:t xml:space="preserve">Wittek, A. et al. (2020). ASJP Database v19. Zenodo, doi:10.5281/zenodo.3843469</w:t>
+      </w:r>
+      <w:bookmarkEnd w:id="82"/>
+    </w:p>
     <w:bookmarkEnd w:id="83"/>
+    <w:bookmarkEnd w:id="84"/>
     <w:sectPr/>
   </w:body>
 </w:document>

</xml_diff>